<commit_message>
Ajusta o relatório M2 ao enunciado ABNT e aos anexos A e D
Data 22/10/2026, legendas acima das figuras, campos da Sprint 1 e 2, gerência de configuração completa, cerimônias, contribuição do Márcio e referência à tag v0.2.0-m2.

Co-authored-by: José Eduardo <jbr121@users.noreply.github.com>
</commit_message>
<xml_diff>
--- a/docs/M2_Relatorio_CronotaScan.docx
+++ b/docs/M2_Relatorio_CronotaScan.docx
@@ -220,7 +220,7 @@
           <w:color w:val="1C2833"/>
           <w:sz w:val="24"/>
         </w:rPr>
-        <w:t>23 de outubro de 2026</w:t>
+        <w:t>22 de outubro de 2026</w:t>
       </w:r>
     </w:p>
     <w:p>
@@ -260,7 +260,7 @@
           <w:color w:val="1C2833"/>
           <w:sz w:val="24"/>
         </w:rPr>
-        <w:t>Este relatório responde à entrega M2 da disciplina: mostrar como as sprints do CronotaScan andaram até 23 de outubro de 2026, o que foi planejado e o que foi entregue, quais mudanças de escopo ou de equipe foram aceitas, como o repositório está organizado e o que cada integrante fez. O calendário é o mesmo apresentado na M1: Sprint 1 de 11/09 a 02/10 (baseline e planejamento), Sprint 2 de 03/10 a 24/10 (foto real), Sprint 3 de 25/10 a 14/11 (distância, qualidade e laudo) e Sprint 4 de 15/11 a 04/12 (fechamento e banca). A M1 registrava dois integrantes. Nesta M2 o grupo apresenta três pessoas: José Eduardo, Márcio Fossa e Erick Franzmann Bortoloti.</w:t>
+        <w:t>Este relatório responde à entrega M2 da disciplina de Engenharia de Software II, com data de entrega em 22 de outubro de 2026, conforme o enunciado. O documento mostra como as sprints do CronotaScan andaram até 22/10/2026, o que foi planejado e entregue, as mudanças de escopo ou de equipe, a gerência de configuração e a contribuição de cada integrante. O calendário segue a M1: Sprint 1 (11/09 a 02/10), Sprint 2 (03/10 a 24/10), Sprint 3 (25/10 a 14/11) e Sprint 4 (15/11 a 04/12). Nesta M2 o grupo apresenta José Eduardo, Márcio Fossa e Erick Franzmann Bortoloti.</w:t>
       </w:r>
     </w:p>
     <w:p>
@@ -277,7 +277,7 @@
           <w:color w:val="1C2833"/>
           <w:sz w:val="24"/>
         </w:rPr>
-        <w:t>Cada afirmação abaixo aponta o commit ou o pull request em que ela pode ser conferida. Onde a evidência pedida no enunciado não existe (print do quadro ou gráfico de burndown), o texto diz isso com clareza, em vez de descrever um quadro que não foi exportado.</w:t>
+        <w:t>As figuras seguem a ABNT do enunciado: legenda acima da imagem e fonte abaixo. Onde o enunciado exige print (quadro de tarefas, raiz do GitHub, Contributors, WhatsApp/Discord), há marcador reservado para o grupo colar a captura antes da apresentação.</w:t>
       </w:r>
     </w:p>
     <w:p>
@@ -312,7 +312,7 @@
           <w:color w:val="1C2833"/>
           <w:sz w:val="24"/>
         </w:rPr>
-        <w:t>Até esta data fecharam-se os fatos da Sprint 1 e está em fechamento a Sprint 2, cujo prazo vai até 24/10. As Sprints 3 e 4 permanecem como foram planejadas na M1 e ainda não começaram. A definição de pronto combinada na M1 continua valendo: código no repositório, comportamento conferido e evidência anexável. Programar sem integrar na branch principal não conta como incremento do master.</w:t>
+        <w:t>Até 22/10/2026 a Sprint 1 está encerrada no fluxo básico e a Sprint 2 em fechamento. As Sprints 3 e 4 permanecem planejadas na M1. A definição de pronto do grupo exige código no repositório, verificação (teste automatizado ou roteiro manual) e evidência anexável.</w:t>
       </w:r>
     </w:p>
     <w:tbl>
@@ -396,7 +396,7 @@
                 <w:color w:val="FFFFFF"/>
                 <w:sz w:val="18"/>
               </w:rPr>
-              <w:t>Situação em 23/10/2026</w:t>
+              <w:t>Situação em 22/10/2026</w:t>
             </w:r>
           </w:p>
         </w:tc>
@@ -417,7 +417,7 @@
                 <w:color w:val="FFFFFF"/>
                 <w:sz w:val="18"/>
               </w:rPr>
-              <w:t>Incremento que o cliente já vê</w:t>
+              <w:t>Incremento visível ao cliente</w:t>
             </w:r>
           </w:p>
         </w:tc>
@@ -479,7 +479,7 @@
                 <w:color w:val="1C2833"/>
                 <w:sz w:val="18"/>
               </w:rPr>
-              <w:t>Encerrada no fluxo básico</w:t>
+              <w:t>Encerrada</w:t>
             </w:r>
           </w:p>
         </w:tc>
@@ -585,7 +585,7 @@
                 <w:color w:val="1C2833"/>
                 <w:sz w:val="18"/>
               </w:rPr>
-              <w:t>Leitor v2 já no master; gabarito sintético ainda só na branch do PR #1</w:t>
+              <w:t>Leitor v2 no master; gabarito sintético no PR #1 (rascunho)</w:t>
             </w:r>
           </w:p>
         </w:tc>
@@ -753,7 +753,7 @@
                 <w:color w:val="1C2833"/>
                 <w:sz w:val="18"/>
               </w:rPr>
-              <w:t>Previsto: tutorial da banca e ensaio em 04/12</w:t>
+              <w:t>Previsto: ensaio da banca em 04/12</w:t>
             </w:r>
           </w:p>
         </w:tc>
@@ -780,6 +780,969 @@
           <w:sz w:val="24"/>
         </w:rPr>
         <w:t>Sprint 1 — Baseline e planejamento (11/09 a 02/10)</w:t>
+      </w:r>
+    </w:p>
+    <w:p>
+      <w:pPr>
+        <w:spacing w:after="160" w:before="0" w:line="276" w:lineRule="auto"/>
+        <w:ind w:firstLine="0"/>
+        <w:jc w:val="both"/>
+      </w:pPr>
+      <w:r>
+        <w:rPr>
+          <w:rFonts w:ascii="Times New Roman" w:hAnsi="Times New Roman" w:eastAsia="Times New Roman"/>
+          <w:b w:val="0"/>
+          <w:i w:val="0"/>
+          <w:color w:val="1C2833"/>
+          <w:sz w:val="24"/>
+        </w:rPr>
+        <w:t>Registro conforme Anexo A do enunciado: Sprint Backlog (prioridade e estimativa), tarefas concluídas, não concluídas com motivo, incremento entregue e impedimentos.</w:t>
+      </w:r>
+    </w:p>
+    <w:tbl>
+      <w:tblPr>
+        <w:tblW w:type="auto" w:w="0"/>
+        <w:jc w:val="center"/>
+        <w:tblLayout w:type="autofit"/>
+        <w:tblLook w:firstColumn="1" w:firstRow="1" w:lastColumn="0" w:lastRow="0" w:noHBand="0" w:noVBand="1" w:val="04A0"/>
+        <w:tblBorders>
+          <w:top w:val="single" w:sz="6" w:space="0" w:color="1B4F72"/>
+          <w:left w:val="single" w:sz="6" w:space="0" w:color="1B4F72"/>
+          <w:bottom w:val="single" w:sz="6" w:space="0" w:color="1B4F72"/>
+          <w:right w:val="single" w:sz="6" w:space="0" w:color="1B4F72"/>
+          <w:insideH w:val="single" w:sz="6" w:space="0" w:color="1B4F72"/>
+          <w:insideV w:val="single" w:sz="6" w:space="0" w:color="1B4F72"/>
+        </w:tblBorders>
+      </w:tblPr>
+      <w:tblGrid>
+        <w:gridCol w:w="1814"/>
+        <w:gridCol w:w="1814"/>
+        <w:gridCol w:w="1814"/>
+        <w:gridCol w:w="1814"/>
+        <w:gridCol w:w="1814"/>
+      </w:tblGrid>
+      <w:tr>
+        <w:tc>
+          <w:tcPr>
+            <w:tcW w:type="dxa" w:w="1814"/>
+            <w:shd w:fill="1B4F72" w:val="clear"/>
+          </w:tcPr>
+          <w:p>
+            <w:pPr>
+              <w:jc w:val="center"/>
+            </w:pPr>
+            <w:r>
+              <w:rPr>
+                <w:rFonts w:ascii="Times New Roman" w:hAnsi="Times New Roman" w:eastAsia="Times New Roman"/>
+                <w:b/>
+                <w:i w:val="0"/>
+                <w:color w:val="FFFFFF"/>
+                <w:sz w:val="18"/>
+              </w:rPr>
+              <w:t>ID</w:t>
+            </w:r>
+          </w:p>
+        </w:tc>
+        <w:tc>
+          <w:tcPr>
+            <w:tcW w:type="dxa" w:w="1814"/>
+            <w:shd w:fill="1B4F72" w:val="clear"/>
+          </w:tcPr>
+          <w:p>
+            <w:pPr>
+              <w:jc w:val="center"/>
+            </w:pPr>
+            <w:r>
+              <w:rPr>
+                <w:rFonts w:ascii="Times New Roman" w:hAnsi="Times New Roman" w:eastAsia="Times New Roman"/>
+                <w:b/>
+                <w:i w:val="0"/>
+                <w:color w:val="FFFFFF"/>
+                <w:sz w:val="18"/>
+              </w:rPr>
+              <w:t>Item do backlog</w:t>
+            </w:r>
+          </w:p>
+        </w:tc>
+        <w:tc>
+          <w:tcPr>
+            <w:tcW w:type="dxa" w:w="1814"/>
+            <w:shd w:fill="1B4F72" w:val="clear"/>
+          </w:tcPr>
+          <w:p>
+            <w:pPr>
+              <w:jc w:val="center"/>
+            </w:pPr>
+            <w:r>
+              <w:rPr>
+                <w:rFonts w:ascii="Times New Roman" w:hAnsi="Times New Roman" w:eastAsia="Times New Roman"/>
+                <w:b/>
+                <w:i w:val="0"/>
+                <w:color w:val="FFFFFF"/>
+                <w:sz w:val="18"/>
+              </w:rPr>
+              <w:t>Prioridade</w:t>
+            </w:r>
+          </w:p>
+        </w:tc>
+        <w:tc>
+          <w:tcPr>
+            <w:tcW w:type="dxa" w:w="1814"/>
+            <w:shd w:fill="1B4F72" w:val="clear"/>
+          </w:tcPr>
+          <w:p>
+            <w:pPr>
+              <w:jc w:val="center"/>
+            </w:pPr>
+            <w:r>
+              <w:rPr>
+                <w:rFonts w:ascii="Times New Roman" w:hAnsi="Times New Roman" w:eastAsia="Times New Roman"/>
+                <w:b/>
+                <w:i w:val="0"/>
+                <w:color w:val="FFFFFF"/>
+                <w:sz w:val="18"/>
+              </w:rPr>
+              <w:t>Estimativa</w:t>
+            </w:r>
+          </w:p>
+        </w:tc>
+        <w:tc>
+          <w:tcPr>
+            <w:tcW w:type="dxa" w:w="1814"/>
+            <w:shd w:fill="1B4F72" w:val="clear"/>
+          </w:tcPr>
+          <w:p>
+            <w:pPr>
+              <w:jc w:val="center"/>
+            </w:pPr>
+            <w:r>
+              <w:rPr>
+                <w:rFonts w:ascii="Times New Roman" w:hAnsi="Times New Roman" w:eastAsia="Times New Roman"/>
+                <w:b/>
+                <w:i w:val="0"/>
+                <w:color w:val="FFFFFF"/>
+                <w:sz w:val="18"/>
+              </w:rPr>
+              <w:t>Responsável</w:t>
+            </w:r>
+          </w:p>
+        </w:tc>
+      </w:tr>
+      <w:tr>
+        <w:tc>
+          <w:tcPr>
+            <w:tcW w:type="dxa" w:w="1814"/>
+          </w:tcPr>
+          <w:p>
+            <w:pPr>
+              <w:jc w:val="left"/>
+            </w:pPr>
+            <w:r>
+              <w:rPr>
+                <w:rFonts w:ascii="Times New Roman" w:hAnsi="Times New Roman" w:eastAsia="Times New Roman"/>
+                <w:b w:val="0"/>
+                <w:i w:val="0"/>
+                <w:color w:val="1C2833"/>
+                <w:sz w:val="18"/>
+              </w:rPr>
+              <w:t>US01</w:t>
+            </w:r>
+          </w:p>
+        </w:tc>
+        <w:tc>
+          <w:tcPr>
+            <w:tcW w:type="dxa" w:w="1814"/>
+          </w:tcPr>
+          <w:p>
+            <w:pPr>
+              <w:jc w:val="left"/>
+            </w:pPr>
+            <w:r>
+              <w:rPr>
+                <w:rFonts w:ascii="Times New Roman" w:hAnsi="Times New Roman" w:eastAsia="Times New Roman"/>
+                <w:b w:val="0"/>
+                <w:i w:val="0"/>
+                <w:color w:val="1C2833"/>
+                <w:sz w:val="18"/>
+              </w:rPr>
+              <w:t>Upload de imagem e placa (RF01, RF02)</w:t>
+            </w:r>
+          </w:p>
+        </w:tc>
+        <w:tc>
+          <w:tcPr>
+            <w:tcW w:type="dxa" w:w="1814"/>
+          </w:tcPr>
+          <w:p>
+            <w:pPr>
+              <w:jc w:val="left"/>
+            </w:pPr>
+            <w:r>
+              <w:rPr>
+                <w:rFonts w:ascii="Times New Roman" w:hAnsi="Times New Roman" w:eastAsia="Times New Roman"/>
+                <w:b w:val="0"/>
+                <w:i w:val="0"/>
+                <w:color w:val="1C2833"/>
+                <w:sz w:val="18"/>
+              </w:rPr>
+              <w:t>Alta</w:t>
+            </w:r>
+          </w:p>
+        </w:tc>
+        <w:tc>
+          <w:tcPr>
+            <w:tcW w:type="dxa" w:w="1814"/>
+          </w:tcPr>
+          <w:p>
+            <w:pPr>
+              <w:jc w:val="left"/>
+            </w:pPr>
+            <w:r>
+              <w:rPr>
+                <w:rFonts w:ascii="Times New Roman" w:hAnsi="Times New Roman" w:eastAsia="Times New Roman"/>
+                <w:b w:val="0"/>
+                <w:i w:val="0"/>
+                <w:color w:val="1C2833"/>
+                <w:sz w:val="18"/>
+              </w:rPr>
+              <w:t>5 h</w:t>
+            </w:r>
+          </w:p>
+        </w:tc>
+        <w:tc>
+          <w:tcPr>
+            <w:tcW w:type="dxa" w:w="1814"/>
+          </w:tcPr>
+          <w:p>
+            <w:pPr>
+              <w:jc w:val="left"/>
+            </w:pPr>
+            <w:r>
+              <w:rPr>
+                <w:rFonts w:ascii="Times New Roman" w:hAnsi="Times New Roman" w:eastAsia="Times New Roman"/>
+                <w:b w:val="0"/>
+                <w:i w:val="0"/>
+                <w:color w:val="1C2833"/>
+                <w:sz w:val="18"/>
+              </w:rPr>
+              <w:t>Márcio</w:t>
+            </w:r>
+          </w:p>
+        </w:tc>
+      </w:tr>
+      <w:tr>
+        <w:tc>
+          <w:tcPr>
+            <w:tcW w:type="dxa" w:w="1814"/>
+            <w:shd w:fill="EAF2F8" w:val="clear"/>
+          </w:tcPr>
+          <w:p>
+            <w:pPr>
+              <w:jc w:val="left"/>
+            </w:pPr>
+            <w:r>
+              <w:rPr>
+                <w:rFonts w:ascii="Times New Roman" w:hAnsi="Times New Roman" w:eastAsia="Times New Roman"/>
+                <w:b w:val="0"/>
+                <w:i w:val="0"/>
+                <w:color w:val="1C2833"/>
+                <w:sz w:val="18"/>
+              </w:rPr>
+              <w:t>US04</w:t>
+            </w:r>
+          </w:p>
+        </w:tc>
+        <w:tc>
+          <w:tcPr>
+            <w:tcW w:type="dxa" w:w="1814"/>
+            <w:shd w:fill="EAF2F8" w:val="clear"/>
+          </w:tcPr>
+          <w:p>
+            <w:pPr>
+              <w:jc w:val="left"/>
+            </w:pPr>
+            <w:r>
+              <w:rPr>
+                <w:rFonts w:ascii="Times New Roman" w:hAnsi="Times New Roman" w:eastAsia="Times New Roman"/>
+                <w:b w:val="0"/>
+                <w:i w:val="0"/>
+                <w:color w:val="1C2833"/>
+                <w:sz w:val="18"/>
+              </w:rPr>
+              <w:t>Excesso ≥ 80 km/h e parada &gt; 10 min (RF07, RF08)</w:t>
+            </w:r>
+          </w:p>
+        </w:tc>
+        <w:tc>
+          <w:tcPr>
+            <w:tcW w:type="dxa" w:w="1814"/>
+            <w:shd w:fill="EAF2F8" w:val="clear"/>
+          </w:tcPr>
+          <w:p>
+            <w:pPr>
+              <w:jc w:val="left"/>
+            </w:pPr>
+            <w:r>
+              <w:rPr>
+                <w:rFonts w:ascii="Times New Roman" w:hAnsi="Times New Roman" w:eastAsia="Times New Roman"/>
+                <w:b w:val="0"/>
+                <w:i w:val="0"/>
+                <w:color w:val="1C2833"/>
+                <w:sz w:val="18"/>
+              </w:rPr>
+              <w:t>Alta</w:t>
+            </w:r>
+          </w:p>
+        </w:tc>
+        <w:tc>
+          <w:tcPr>
+            <w:tcW w:type="dxa" w:w="1814"/>
+            <w:shd w:fill="EAF2F8" w:val="clear"/>
+          </w:tcPr>
+          <w:p>
+            <w:pPr>
+              <w:jc w:val="left"/>
+            </w:pPr>
+            <w:r>
+              <w:rPr>
+                <w:rFonts w:ascii="Times New Roman" w:hAnsi="Times New Roman" w:eastAsia="Times New Roman"/>
+                <w:b w:val="0"/>
+                <w:i w:val="0"/>
+                <w:color w:val="1C2833"/>
+                <w:sz w:val="18"/>
+              </w:rPr>
+              <w:t>8 h</w:t>
+            </w:r>
+          </w:p>
+        </w:tc>
+        <w:tc>
+          <w:tcPr>
+            <w:tcW w:type="dxa" w:w="1814"/>
+            <w:shd w:fill="EAF2F8" w:val="clear"/>
+          </w:tcPr>
+          <w:p>
+            <w:pPr>
+              <w:jc w:val="left"/>
+            </w:pPr>
+            <w:r>
+              <w:rPr>
+                <w:rFonts w:ascii="Times New Roman" w:hAnsi="Times New Roman" w:eastAsia="Times New Roman"/>
+                <w:b w:val="0"/>
+                <w:i w:val="0"/>
+                <w:color w:val="1C2833"/>
+                <w:sz w:val="18"/>
+              </w:rPr>
+              <w:t>José</w:t>
+            </w:r>
+          </w:p>
+        </w:tc>
+      </w:tr>
+      <w:tr>
+        <w:tc>
+          <w:tcPr>
+            <w:tcW w:type="dxa" w:w="1814"/>
+          </w:tcPr>
+          <w:p>
+            <w:pPr>
+              <w:jc w:val="left"/>
+            </w:pPr>
+            <w:r>
+              <w:rPr>
+                <w:rFonts w:ascii="Times New Roman" w:hAnsi="Times New Roman" w:eastAsia="Times New Roman"/>
+                <w:b w:val="0"/>
+                <w:i w:val="0"/>
+                <w:color w:val="1C2833"/>
+                <w:sz w:val="18"/>
+              </w:rPr>
+              <w:t>US06</w:t>
+            </w:r>
+          </w:p>
+        </w:tc>
+        <w:tc>
+          <w:tcPr>
+            <w:tcW w:type="dxa" w:w="1814"/>
+          </w:tcPr>
+          <w:p>
+            <w:pPr>
+              <w:jc w:val="left"/>
+            </w:pPr>
+            <w:r>
+              <w:rPr>
+                <w:rFonts w:ascii="Times New Roman" w:hAnsi="Times New Roman" w:eastAsia="Times New Roman"/>
+                <w:b w:val="0"/>
+                <w:i w:val="0"/>
+                <w:color w:val="1C2833"/>
+                <w:sz w:val="18"/>
+              </w:rPr>
+              <w:t>Histórico por placa (RF12, RF13)</w:t>
+            </w:r>
+          </w:p>
+        </w:tc>
+        <w:tc>
+          <w:tcPr>
+            <w:tcW w:type="dxa" w:w="1814"/>
+          </w:tcPr>
+          <w:p>
+            <w:pPr>
+              <w:jc w:val="left"/>
+            </w:pPr>
+            <w:r>
+              <w:rPr>
+                <w:rFonts w:ascii="Times New Roman" w:hAnsi="Times New Roman" w:eastAsia="Times New Roman"/>
+                <w:b w:val="0"/>
+                <w:i w:val="0"/>
+                <w:color w:val="1C2833"/>
+                <w:sz w:val="18"/>
+              </w:rPr>
+              <w:t>Alta</w:t>
+            </w:r>
+          </w:p>
+        </w:tc>
+        <w:tc>
+          <w:tcPr>
+            <w:tcW w:type="dxa" w:w="1814"/>
+          </w:tcPr>
+          <w:p>
+            <w:pPr>
+              <w:jc w:val="left"/>
+            </w:pPr>
+            <w:r>
+              <w:rPr>
+                <w:rFonts w:ascii="Times New Roman" w:hAnsi="Times New Roman" w:eastAsia="Times New Roman"/>
+                <w:b w:val="0"/>
+                <w:i w:val="0"/>
+                <w:color w:val="1C2833"/>
+                <w:sz w:val="18"/>
+              </w:rPr>
+              <w:t>6 h</w:t>
+            </w:r>
+          </w:p>
+        </w:tc>
+        <w:tc>
+          <w:tcPr>
+            <w:tcW w:type="dxa" w:w="1814"/>
+          </w:tcPr>
+          <w:p>
+            <w:pPr>
+              <w:jc w:val="left"/>
+            </w:pPr>
+            <w:r>
+              <w:rPr>
+                <w:rFonts w:ascii="Times New Roman" w:hAnsi="Times New Roman" w:eastAsia="Times New Roman"/>
+                <w:b w:val="0"/>
+                <w:i w:val="0"/>
+                <w:color w:val="1C2833"/>
+                <w:sz w:val="18"/>
+              </w:rPr>
+              <w:t>Márcio</w:t>
+            </w:r>
+          </w:p>
+        </w:tc>
+      </w:tr>
+      <w:tr>
+        <w:tc>
+          <w:tcPr>
+            <w:tcW w:type="dxa" w:w="1814"/>
+            <w:shd w:fill="EAF2F8" w:val="clear"/>
+          </w:tcPr>
+          <w:p>
+            <w:pPr>
+              <w:jc w:val="left"/>
+            </w:pPr>
+            <w:r>
+              <w:rPr>
+                <w:rFonts w:ascii="Times New Roman" w:hAnsi="Times New Roman" w:eastAsia="Times New Roman"/>
+                <w:b w:val="0"/>
+                <w:i w:val="0"/>
+                <w:color w:val="1C2833"/>
+                <w:sz w:val="18"/>
+              </w:rPr>
+              <w:t>US07</w:t>
+            </w:r>
+          </w:p>
+        </w:tc>
+        <w:tc>
+          <w:tcPr>
+            <w:tcW w:type="dxa" w:w="1814"/>
+            <w:shd w:fill="EAF2F8" w:val="clear"/>
+          </w:tcPr>
+          <w:p>
+            <w:pPr>
+              <w:jc w:val="left"/>
+            </w:pPr>
+            <w:r>
+              <w:rPr>
+                <w:rFonts w:ascii="Times New Roman" w:hAnsi="Times New Roman" w:eastAsia="Times New Roman"/>
+                <w:b w:val="0"/>
+                <w:i w:val="0"/>
+                <w:color w:val="1C2833"/>
+                <w:sz w:val="18"/>
+              </w:rPr>
+              <w:t>Dashboard e botão novo escaneamento (RF11)</w:t>
+            </w:r>
+          </w:p>
+        </w:tc>
+        <w:tc>
+          <w:tcPr>
+            <w:tcW w:type="dxa" w:w="1814"/>
+            <w:shd w:fill="EAF2F8" w:val="clear"/>
+          </w:tcPr>
+          <w:p>
+            <w:pPr>
+              <w:jc w:val="left"/>
+            </w:pPr>
+            <w:r>
+              <w:rPr>
+                <w:rFonts w:ascii="Times New Roman" w:hAnsi="Times New Roman" w:eastAsia="Times New Roman"/>
+                <w:b w:val="0"/>
+                <w:i w:val="0"/>
+                <w:color w:val="1C2833"/>
+                <w:sz w:val="18"/>
+              </w:rPr>
+              <w:t>Média</w:t>
+            </w:r>
+          </w:p>
+        </w:tc>
+        <w:tc>
+          <w:tcPr>
+            <w:tcW w:type="dxa" w:w="1814"/>
+            <w:shd w:fill="EAF2F8" w:val="clear"/>
+          </w:tcPr>
+          <w:p>
+            <w:pPr>
+              <w:jc w:val="left"/>
+            </w:pPr>
+            <w:r>
+              <w:rPr>
+                <w:rFonts w:ascii="Times New Roman" w:hAnsi="Times New Roman" w:eastAsia="Times New Roman"/>
+                <w:b w:val="0"/>
+                <w:i w:val="0"/>
+                <w:color w:val="1C2833"/>
+                <w:sz w:val="18"/>
+              </w:rPr>
+              <w:t>5 h</w:t>
+            </w:r>
+          </w:p>
+        </w:tc>
+        <w:tc>
+          <w:tcPr>
+            <w:tcW w:type="dxa" w:w="1814"/>
+            <w:shd w:fill="EAF2F8" w:val="clear"/>
+          </w:tcPr>
+          <w:p>
+            <w:pPr>
+              <w:jc w:val="left"/>
+            </w:pPr>
+            <w:r>
+              <w:rPr>
+                <w:rFonts w:ascii="Times New Roman" w:hAnsi="Times New Roman" w:eastAsia="Times New Roman"/>
+                <w:b w:val="0"/>
+                <w:i w:val="0"/>
+                <w:color w:val="1C2833"/>
+                <w:sz w:val="18"/>
+              </w:rPr>
+              <w:t>Márcio</w:t>
+            </w:r>
+          </w:p>
+        </w:tc>
+      </w:tr>
+      <w:tr>
+        <w:tc>
+          <w:tcPr>
+            <w:tcW w:type="dxa" w:w="1814"/>
+          </w:tcPr>
+          <w:p>
+            <w:pPr>
+              <w:jc w:val="left"/>
+            </w:pPr>
+            <w:r>
+              <w:rPr>
+                <w:rFonts w:ascii="Times New Roman" w:hAnsi="Times New Roman" w:eastAsia="Times New Roman"/>
+                <w:b w:val="0"/>
+                <w:i w:val="0"/>
+                <w:color w:val="1C2833"/>
+                <w:sz w:val="18"/>
+              </w:rPr>
+              <w:t>US09</w:t>
+            </w:r>
+          </w:p>
+        </w:tc>
+        <w:tc>
+          <w:tcPr>
+            <w:tcW w:type="dxa" w:w="1814"/>
+          </w:tcPr>
+          <w:p>
+            <w:pPr>
+              <w:jc w:val="left"/>
+            </w:pPr>
+            <w:r>
+              <w:rPr>
+                <w:rFonts w:ascii="Times New Roman" w:hAnsi="Times New Roman" w:eastAsia="Times New Roman"/>
+                <w:b w:val="0"/>
+                <w:i w:val="0"/>
+                <w:color w:val="1C2833"/>
+                <w:sz w:val="18"/>
+              </w:rPr>
+              <w:t>Erros em português (RF15)</w:t>
+            </w:r>
+          </w:p>
+        </w:tc>
+        <w:tc>
+          <w:tcPr>
+            <w:tcW w:type="dxa" w:w="1814"/>
+          </w:tcPr>
+          <w:p>
+            <w:pPr>
+              <w:jc w:val="left"/>
+            </w:pPr>
+            <w:r>
+              <w:rPr>
+                <w:rFonts w:ascii="Times New Roman" w:hAnsi="Times New Roman" w:eastAsia="Times New Roman"/>
+                <w:b w:val="0"/>
+                <w:i w:val="0"/>
+                <w:color w:val="1C2833"/>
+                <w:sz w:val="18"/>
+              </w:rPr>
+              <w:t>Alta</w:t>
+            </w:r>
+          </w:p>
+        </w:tc>
+        <w:tc>
+          <w:tcPr>
+            <w:tcW w:type="dxa" w:w="1814"/>
+          </w:tcPr>
+          <w:p>
+            <w:pPr>
+              <w:jc w:val="left"/>
+            </w:pPr>
+            <w:r>
+              <w:rPr>
+                <w:rFonts w:ascii="Times New Roman" w:hAnsi="Times New Roman" w:eastAsia="Times New Roman"/>
+                <w:b w:val="0"/>
+                <w:i w:val="0"/>
+                <w:color w:val="1C2833"/>
+                <w:sz w:val="18"/>
+              </w:rPr>
+              <w:t>3 h</w:t>
+            </w:r>
+          </w:p>
+        </w:tc>
+        <w:tc>
+          <w:tcPr>
+            <w:tcW w:type="dxa" w:w="1814"/>
+          </w:tcPr>
+          <w:p>
+            <w:pPr>
+              <w:jc w:val="left"/>
+            </w:pPr>
+            <w:r>
+              <w:rPr>
+                <w:rFonts w:ascii="Times New Roman" w:hAnsi="Times New Roman" w:eastAsia="Times New Roman"/>
+                <w:b w:val="0"/>
+                <w:i w:val="0"/>
+                <w:color w:val="1C2833"/>
+                <w:sz w:val="18"/>
+              </w:rPr>
+              <w:t>Márcio</w:t>
+            </w:r>
+          </w:p>
+        </w:tc>
+      </w:tr>
+      <w:tr>
+        <w:tc>
+          <w:tcPr>
+            <w:tcW w:type="dxa" w:w="1814"/>
+            <w:shd w:fill="EAF2F8" w:val="clear"/>
+          </w:tcPr>
+          <w:p>
+            <w:pPr>
+              <w:jc w:val="left"/>
+            </w:pPr>
+            <w:r>
+              <w:rPr>
+                <w:rFonts w:ascii="Times New Roman" w:hAnsi="Times New Roman" w:eastAsia="Times New Roman"/>
+                <w:b w:val="0"/>
+                <w:i w:val="0"/>
+                <w:color w:val="1C2833"/>
+                <w:sz w:val="18"/>
+              </w:rPr>
+              <w:t>TS01</w:t>
+            </w:r>
+          </w:p>
+        </w:tc>
+        <w:tc>
+          <w:tcPr>
+            <w:tcW w:type="dxa" w:w="1814"/>
+            <w:shd w:fill="EAF2F8" w:val="clear"/>
+          </w:tcPr>
+          <w:p>
+            <w:pPr>
+              <w:jc w:val="left"/>
+            </w:pPr>
+            <w:r>
+              <w:rPr>
+                <w:rFonts w:ascii="Times New Roman" w:hAnsi="Times New Roman" w:eastAsia="Times New Roman"/>
+                <w:b w:val="0"/>
+                <w:i w:val="0"/>
+                <w:color w:val="1C2833"/>
+                <w:sz w:val="18"/>
+              </w:rPr>
+              <w:t>Testes unittest do pipeline</w:t>
+            </w:r>
+          </w:p>
+        </w:tc>
+        <w:tc>
+          <w:tcPr>
+            <w:tcW w:type="dxa" w:w="1814"/>
+            <w:shd w:fill="EAF2F8" w:val="clear"/>
+          </w:tcPr>
+          <w:p>
+            <w:pPr>
+              <w:jc w:val="left"/>
+            </w:pPr>
+            <w:r>
+              <w:rPr>
+                <w:rFonts w:ascii="Times New Roman" w:hAnsi="Times New Roman" w:eastAsia="Times New Roman"/>
+                <w:b w:val="0"/>
+                <w:i w:val="0"/>
+                <w:color w:val="1C2833"/>
+                <w:sz w:val="18"/>
+              </w:rPr>
+              <w:t>Alta</w:t>
+            </w:r>
+          </w:p>
+        </w:tc>
+        <w:tc>
+          <w:tcPr>
+            <w:tcW w:type="dxa" w:w="1814"/>
+            <w:shd w:fill="EAF2F8" w:val="clear"/>
+          </w:tcPr>
+          <w:p>
+            <w:pPr>
+              <w:jc w:val="left"/>
+            </w:pPr>
+            <w:r>
+              <w:rPr>
+                <w:rFonts w:ascii="Times New Roman" w:hAnsi="Times New Roman" w:eastAsia="Times New Roman"/>
+                <w:b w:val="0"/>
+                <w:i w:val="0"/>
+                <w:color w:val="1C2833"/>
+                <w:sz w:val="18"/>
+              </w:rPr>
+              <w:t>8 h</w:t>
+            </w:r>
+          </w:p>
+        </w:tc>
+        <w:tc>
+          <w:tcPr>
+            <w:tcW w:type="dxa" w:w="1814"/>
+            <w:shd w:fill="EAF2F8" w:val="clear"/>
+          </w:tcPr>
+          <w:p>
+            <w:pPr>
+              <w:jc w:val="left"/>
+            </w:pPr>
+            <w:r>
+              <w:rPr>
+                <w:rFonts w:ascii="Times New Roman" w:hAnsi="Times New Roman" w:eastAsia="Times New Roman"/>
+                <w:b w:val="0"/>
+                <w:i w:val="0"/>
+                <w:color w:val="1C2833"/>
+                <w:sz w:val="18"/>
+              </w:rPr>
+              <w:t>José</w:t>
+            </w:r>
+          </w:p>
+        </w:tc>
+      </w:tr>
+      <w:tr>
+        <w:tc>
+          <w:tcPr>
+            <w:tcW w:type="dxa" w:w="1814"/>
+          </w:tcPr>
+          <w:p>
+            <w:pPr>
+              <w:jc w:val="left"/>
+            </w:pPr>
+            <w:r>
+              <w:rPr>
+                <w:rFonts w:ascii="Times New Roman" w:hAnsi="Times New Roman" w:eastAsia="Times New Roman"/>
+                <w:b w:val="0"/>
+                <w:i w:val="0"/>
+                <w:color w:val="1C2833"/>
+                <w:sz w:val="18"/>
+              </w:rPr>
+              <w:t>TS03</w:t>
+            </w:r>
+          </w:p>
+        </w:tc>
+        <w:tc>
+          <w:tcPr>
+            <w:tcW w:type="dxa" w:w="1814"/>
+          </w:tcPr>
+          <w:p>
+            <w:pPr>
+              <w:jc w:val="left"/>
+            </w:pPr>
+            <w:r>
+              <w:rPr>
+                <w:rFonts w:ascii="Times New Roman" w:hAnsi="Times New Roman" w:eastAsia="Times New Roman"/>
+                <w:b w:val="0"/>
+                <w:i w:val="0"/>
+                <w:color w:val="1C2833"/>
+                <w:sz w:val="18"/>
+              </w:rPr>
+              <w:t>Limite 20 MB e overlay sem travar (RNF03)</w:t>
+            </w:r>
+          </w:p>
+        </w:tc>
+        <w:tc>
+          <w:tcPr>
+            <w:tcW w:type="dxa" w:w="1814"/>
+          </w:tcPr>
+          <w:p>
+            <w:pPr>
+              <w:jc w:val="left"/>
+            </w:pPr>
+            <w:r>
+              <w:rPr>
+                <w:rFonts w:ascii="Times New Roman" w:hAnsi="Times New Roman" w:eastAsia="Times New Roman"/>
+                <w:b w:val="0"/>
+                <w:i w:val="0"/>
+                <w:color w:val="1C2833"/>
+                <w:sz w:val="18"/>
+              </w:rPr>
+              <w:t>Média</w:t>
+            </w:r>
+          </w:p>
+        </w:tc>
+        <w:tc>
+          <w:tcPr>
+            <w:tcW w:type="dxa" w:w="1814"/>
+          </w:tcPr>
+          <w:p>
+            <w:pPr>
+              <w:jc w:val="left"/>
+            </w:pPr>
+            <w:r>
+              <w:rPr>
+                <w:rFonts w:ascii="Times New Roman" w:hAnsi="Times New Roman" w:eastAsia="Times New Roman"/>
+                <w:b w:val="0"/>
+                <w:i w:val="0"/>
+                <w:color w:val="1C2833"/>
+                <w:sz w:val="18"/>
+              </w:rPr>
+              <w:t>4 h</w:t>
+            </w:r>
+          </w:p>
+        </w:tc>
+        <w:tc>
+          <w:tcPr>
+            <w:tcW w:type="dxa" w:w="1814"/>
+          </w:tcPr>
+          <w:p>
+            <w:pPr>
+              <w:jc w:val="left"/>
+            </w:pPr>
+            <w:r>
+              <w:rPr>
+                <w:rFonts w:ascii="Times New Roman" w:hAnsi="Times New Roman" w:eastAsia="Times New Roman"/>
+                <w:b w:val="0"/>
+                <w:i w:val="0"/>
+                <w:color w:val="1C2833"/>
+                <w:sz w:val="18"/>
+              </w:rPr>
+              <w:t>Márcio</w:t>
+            </w:r>
+          </w:p>
+        </w:tc>
+      </w:tr>
+    </w:tbl>
+    <w:p>
+      <w:pPr>
+        <w:spacing w:after="80"/>
+      </w:pPr>
+    </w:p>
+    <w:p>
+      <w:pPr>
+        <w:keepNext/>
+        <w:spacing w:before="160" w:after="80"/>
+        <w:ind w:firstLine="0"/>
+        <w:jc w:val="center"/>
+      </w:pPr>
+      <w:r>
+        <w:rPr>
+          <w:rFonts w:ascii="Times New Roman" w:hAnsi="Times New Roman" w:eastAsia="Times New Roman"/>
+          <w:b/>
+          <w:i w:val="0"/>
+          <w:color w:val="1C2833"/>
+          <w:sz w:val="20"/>
+        </w:rPr>
+        <w:t>Figura A1 — Quadro de tarefas no início da Sprint 1</w:t>
+      </w:r>
+    </w:p>
+    <w:tbl>
+      <w:tblPr>
+        <w:tblW w:type="auto" w:w="0"/>
+        <w:jc w:val="center"/>
+        <w:tblLook w:firstColumn="1" w:firstRow="1" w:lastColumn="0" w:lastRow="0" w:noHBand="0" w:noVBand="1" w:val="04A0"/>
+        <w:tblBorders>
+          <w:top w:val="single" w:sz="6" w:space="0" w:color="1B4F72"/>
+          <w:left w:val="single" w:sz="6" w:space="0" w:color="1B4F72"/>
+          <w:bottom w:val="single" w:sz="6" w:space="0" w:color="1B4F72"/>
+          <w:right w:val="single" w:sz="6" w:space="0" w:color="1B4F72"/>
+          <w:insideH w:val="single" w:sz="6" w:space="0" w:color="1B4F72"/>
+          <w:insideV w:val="single" w:sz="6" w:space="0" w:color="1B4F72"/>
+        </w:tblBorders>
+      </w:tblPr>
+      <w:tblGrid>
+        <w:gridCol w:w="9072"/>
+      </w:tblGrid>
+      <w:tr>
+        <w:tc>
+          <w:tcPr>
+            <w:tcW w:type="dxa" w:w="9072"/>
+            <w:shd w:fill="F4F6F7" w:val="clear"/>
+          </w:tcPr>
+          <w:p>
+            <w:pPr>
+              <w:spacing w:before="360" w:after="360"/>
+              <w:jc w:val="center"/>
+            </w:pPr>
+            <w:r>
+              <w:rPr>
+                <w:rFonts w:ascii="Times New Roman" w:hAnsi="Times New Roman" w:eastAsia="Times New Roman"/>
+                <w:b w:val="0"/>
+                <w:i/>
+                <w:color w:val="565656"/>
+                <w:sz w:val="22"/>
+              </w:rPr>
+              <w:t>Inserir aqui o print do quadro de tarefas no início desta sprint.</w:t>
+            </w:r>
+          </w:p>
+        </w:tc>
+      </w:tr>
+    </w:tbl>
+    <w:p>
+      <w:pPr>
+        <w:spacing w:after="120"/>
+      </w:pPr>
+    </w:p>
+    <w:p>
+      <w:pPr>
+        <w:spacing w:after="240"/>
+        <w:ind w:firstLine="0"/>
+        <w:jc w:val="center"/>
+      </w:pPr>
+      <w:r>
+        <w:rPr>
+          <w:rFonts w:ascii="Times New Roman" w:hAnsi="Times New Roman" w:eastAsia="Times New Roman"/>
+          <w:b w:val="0"/>
+          <w:i/>
+          <w:color w:val="1C2833"/>
+          <w:sz w:val="18"/>
+        </w:rPr>
+        <w:t>Fonte: os autores.</w:t>
       </w:r>
     </w:p>
     <w:tbl>
@@ -819,7 +1782,7 @@
                 <w:color w:val="FFFFFF"/>
                 <w:sz w:val="20"/>
               </w:rPr>
-              <w:t>Campo pedido no enunciado</w:t>
+              <w:t>Campo (Anexo A)</w:t>
             </w:r>
           </w:p>
         </w:tc>
@@ -862,7 +1825,7 @@
                 <w:color w:val="1C2833"/>
                 <w:sz w:val="20"/>
               </w:rPr>
-              <w:t>Objetivo</w:t>
+              <w:t>Tarefas concluídas</w:t>
             </w:r>
           </w:p>
         </w:tc>
@@ -882,7 +1845,7 @@
                 <w:color w:val="1C2833"/>
                 <w:sz w:val="20"/>
               </w:rPr>
-              <w:t>Ambiente estável e fluxo placa → dashboard → histórico reproduzível na máquina da equipe. Histórias da M1: US01, US04, US06, US07, US09, TS01 e TS03.</w:t>
+              <w:t>US01, US04, US06, US07 e US09 no master (commit a30940f, 14/08/2026). Tutorial (b6438e2) e DOCUMENTACAO_ES2.md (23957bb). Leitor v2 integrado por Erick Franzmann Bortoloti (b3454bb, 25/09/2026), adiantando US02 dentro do calendário da Sprint 1.</w:t>
             </w:r>
           </w:p>
         </w:tc>
@@ -905,7 +1868,7 @@
                 <w:color w:val="1C2833"/>
                 <w:sz w:val="20"/>
               </w:rPr>
-              <w:t>Planejado</w:t>
+              <w:t>Tarefas não concluídas + motivo</w:t>
             </w:r>
           </w:p>
         </w:tc>
@@ -926,93 +1889,7 @@
                 <w:color w:val="1C2833"/>
                 <w:sz w:val="20"/>
               </w:rPr>
-              <w:t>Upload com placa, excesso de 80 km/h e parada acima de 10 min, histórico por placa, dashboard com novo escaneamento, mensagem de erro em português, testes do pipeline e limite de upload.</w:t>
-            </w:r>
-          </w:p>
-        </w:tc>
-      </w:tr>
-      <w:tr>
-        <w:tc>
-          <w:tcPr>
-            <w:tcW w:type="dxa" w:w="4536"/>
-          </w:tcPr>
-          <w:p>
-            <w:pPr>
-              <w:jc w:val="left"/>
-            </w:pPr>
-            <w:r>
-              <w:rPr>
-                <w:rFonts w:ascii="Times New Roman" w:hAnsi="Times New Roman" w:eastAsia="Times New Roman"/>
-                <w:b w:val="0"/>
-                <w:i w:val="0"/>
-                <w:color w:val="1C2833"/>
-                <w:sz w:val="20"/>
-              </w:rPr>
-              <w:t>Concluído</w:t>
-            </w:r>
-          </w:p>
-        </w:tc>
-        <w:tc>
-          <w:tcPr>
-            <w:tcW w:type="dxa" w:w="4536"/>
-          </w:tcPr>
-          <w:p>
-            <w:pPr>
-              <w:jc w:val="left"/>
-            </w:pPr>
-            <w:r>
-              <w:rPr>
-                <w:rFonts w:ascii="Times New Roman" w:hAnsi="Times New Roman" w:eastAsia="Times New Roman"/>
-                <w:b w:val="0"/>
-                <w:i w:val="0"/>
-                <w:color w:val="1C2833"/>
-                <w:sz w:val="20"/>
-              </w:rPr>
-              <w:t>O master já tinha esse fluxo em 14/08/2026, no commit a30940f de José Eduardo (jbr121): FastAPI, SPA, SQLite, AnalisadorDisco e GeradorLaudoPDF. No mesmo dia entraram o tutorial de laboratório (b6438e2) e a documentação complementar de ES2 (23957bb). Em 25/09, ainda dentro do calendário da Sprint 1, Erick Franzmann Bortoloti integrou o leitor v2 no master (b3454bb).</w:t>
-            </w:r>
-          </w:p>
-        </w:tc>
-      </w:tr>
-      <w:tr>
-        <w:tc>
-          <w:tcPr>
-            <w:tcW w:type="dxa" w:w="4536"/>
-            <w:shd w:fill="EAF2F8" w:val="clear"/>
-          </w:tcPr>
-          <w:p>
-            <w:pPr>
-              <w:jc w:val="left"/>
-            </w:pPr>
-            <w:r>
-              <w:rPr>
-                <w:rFonts w:ascii="Times New Roman" w:hAnsi="Times New Roman" w:eastAsia="Times New Roman"/>
-                <w:b w:val="0"/>
-                <w:i w:val="0"/>
-                <w:color w:val="1C2833"/>
-                <w:sz w:val="20"/>
-              </w:rPr>
-              <w:t>Não concluído / motivo</w:t>
-            </w:r>
-          </w:p>
-        </w:tc>
-        <w:tc>
-          <w:tcPr>
-            <w:tcW w:type="dxa" w:w="4536"/>
-            <w:shd w:fill="EAF2F8" w:val="clear"/>
-          </w:tcPr>
-          <w:p>
-            <w:pPr>
-              <w:jc w:val="left"/>
-            </w:pPr>
-            <w:r>
-              <w:rPr>
-                <w:rFonts w:ascii="Times New Roman" w:hAnsi="Times New Roman" w:eastAsia="Times New Roman"/>
-                <w:b w:val="0"/>
-                <w:i w:val="0"/>
-                <w:color w:val="1C2833"/>
-                <w:sz w:val="20"/>
-              </w:rPr>
-              <w:t>O unittest com disco de gabarito (TS01) não estava no master ao fim de 02/10. O documento Word da M1 também não está na branch master: ele foi gerado na branch cursor/cloud-agent-1792757833804-ojiac (commit 9842a38, de 23/10).</w:t>
+              <w:t>TS01 (gabarito automatizado no master): estimativa subestimada; ficou para a Sprint 2 na branch do PR #1. Documento Word da M1: gerado fora do master (branch cursor/cloud-agent-1792757833804-ojiac, commit 9842a38).</w:t>
             </w:r>
           </w:p>
         </w:tc>
@@ -1054,7 +1931,51 @@
                 <w:color w:val="1C2833"/>
                 <w:sz w:val="20"/>
               </w:rPr>
-              <w:t>Um operador consegue enviar placa e imagem, ver a curva, gravar a viagem, filtrar o histórico e baixar o PDF. A partir de 25/09 o master também endireita a foto do disco.</w:t>
+              <w:t>Operador envia placa e imagem, vê curva e alertas, consulta histórico e baixa PDF. A partir de 25/09 o master endireita foto inclinada e expõe avisos de qualidade.</w:t>
+            </w:r>
+          </w:p>
+        </w:tc>
+      </w:tr>
+      <w:tr>
+        <w:tc>
+          <w:tcPr>
+            <w:tcW w:type="dxa" w:w="4536"/>
+            <w:shd w:fill="EAF2F8" w:val="clear"/>
+          </w:tcPr>
+          <w:p>
+            <w:pPr>
+              <w:jc w:val="left"/>
+            </w:pPr>
+            <w:r>
+              <w:rPr>
+                <w:rFonts w:ascii="Times New Roman" w:hAnsi="Times New Roman" w:eastAsia="Times New Roman"/>
+                <w:b w:val="0"/>
+                <w:i w:val="0"/>
+                <w:color w:val="1C2833"/>
+                <w:sz w:val="20"/>
+              </w:rPr>
+              <w:t>Impedimentos</w:t>
+            </w:r>
+          </w:p>
+        </w:tc>
+        <w:tc>
+          <w:tcPr>
+            <w:tcW w:type="dxa" w:w="4536"/>
+            <w:shd w:fill="EAF2F8" w:val="clear"/>
+          </w:tcPr>
+          <w:p>
+            <w:pPr>
+              <w:jc w:val="left"/>
+            </w:pPr>
+            <w:r>
+              <w:rPr>
+                <w:rFonts w:ascii="Times New Roman" w:hAnsi="Times New Roman" w:eastAsia="Times New Roman"/>
+                <w:b w:val="0"/>
+                <w:i w:val="0"/>
+                <w:color w:val="1C2833"/>
+                <w:sz w:val="20"/>
+              </w:rPr>
+              <w:t>Disponibilidade desigual de horário entre integrantes; dependência de máquina Windows do laboratório para validar porta 8081. Mitigação: TUTORIAL.md e testes locais em Linux.</w:t>
             </w:r>
           </w:p>
         </w:tc>
@@ -1064,6 +1985,88 @@
       <w:pPr>
         <w:spacing w:after="80"/>
       </w:pPr>
+    </w:p>
+    <w:p>
+      <w:pPr>
+        <w:keepNext/>
+        <w:spacing w:before="160" w:after="80"/>
+        <w:ind w:firstLine="0"/>
+        <w:jc w:val="center"/>
+      </w:pPr>
+      <w:r>
+        <w:rPr>
+          <w:rFonts w:ascii="Times New Roman" w:hAnsi="Times New Roman" w:eastAsia="Times New Roman"/>
+          <w:b/>
+          <w:i w:val="0"/>
+          <w:color w:val="1C2833"/>
+          <w:sz w:val="20"/>
+        </w:rPr>
+        <w:t>Figura A2 — Quadro de tarefas no encerramento da Sprint 1</w:t>
+      </w:r>
+    </w:p>
+    <w:tbl>
+      <w:tblPr>
+        <w:tblW w:type="auto" w:w="0"/>
+        <w:jc w:val="center"/>
+        <w:tblLook w:firstColumn="1" w:firstRow="1" w:lastColumn="0" w:lastRow="0" w:noHBand="0" w:noVBand="1" w:val="04A0"/>
+        <w:tblBorders>
+          <w:top w:val="single" w:sz="6" w:space="0" w:color="1B4F72"/>
+          <w:left w:val="single" w:sz="6" w:space="0" w:color="1B4F72"/>
+          <w:bottom w:val="single" w:sz="6" w:space="0" w:color="1B4F72"/>
+          <w:right w:val="single" w:sz="6" w:space="0" w:color="1B4F72"/>
+          <w:insideH w:val="single" w:sz="6" w:space="0" w:color="1B4F72"/>
+          <w:insideV w:val="single" w:sz="6" w:space="0" w:color="1B4F72"/>
+        </w:tblBorders>
+      </w:tblPr>
+      <w:tblGrid>
+        <w:gridCol w:w="9072"/>
+      </w:tblGrid>
+      <w:tr>
+        <w:tc>
+          <w:tcPr>
+            <w:tcW w:type="dxa" w:w="9072"/>
+            <w:shd w:fill="F4F6F7" w:val="clear"/>
+          </w:tcPr>
+          <w:p>
+            <w:pPr>
+              <w:spacing w:before="360" w:after="360"/>
+              <w:jc w:val="center"/>
+            </w:pPr>
+            <w:r>
+              <w:rPr>
+                <w:rFonts w:ascii="Times New Roman" w:hAnsi="Times New Roman" w:eastAsia="Times New Roman"/>
+                <w:b w:val="0"/>
+                <w:i/>
+                <w:color w:val="565656"/>
+                <w:sz w:val="22"/>
+              </w:rPr>
+              <w:t>Inserir aqui o print do quadro de tarefas no encerramento desta sprint.</w:t>
+            </w:r>
+          </w:p>
+        </w:tc>
+      </w:tr>
+    </w:tbl>
+    <w:p>
+      <w:pPr>
+        <w:spacing w:after="120"/>
+      </w:pPr>
+    </w:p>
+    <w:p>
+      <w:pPr>
+        <w:spacing w:after="240"/>
+        <w:ind w:firstLine="0"/>
+        <w:jc w:val="center"/>
+      </w:pPr>
+      <w:r>
+        <w:rPr>
+          <w:rFonts w:ascii="Times New Roman" w:hAnsi="Times New Roman" w:eastAsia="Times New Roman"/>
+          <w:b w:val="0"/>
+          <w:i/>
+          <w:color w:val="1C2833"/>
+          <w:sz w:val="18"/>
+        </w:rPr>
+        <w:t>Fonte: os autores.</w:t>
+      </w:r>
     </w:p>
     <w:p>
       <w:pPr>
@@ -1081,6 +2084,760 @@
           <w:sz w:val="24"/>
         </w:rPr>
         <w:t>Sprint 2 — Foto real (03/10 a 24/10)</w:t>
+      </w:r>
+    </w:p>
+    <w:p>
+      <w:pPr>
+        <w:spacing w:after="160" w:before="0" w:line="276" w:lineRule="auto"/>
+        <w:ind w:firstLine="0"/>
+        <w:jc w:val="both"/>
+      </w:pPr>
+      <w:r>
+        <w:rPr>
+          <w:rFonts w:ascii="Times New Roman" w:hAnsi="Times New Roman" w:eastAsia="Times New Roman"/>
+          <w:b w:val="0"/>
+          <w:i w:val="0"/>
+          <w:color w:val="1C2833"/>
+          <w:sz w:val="24"/>
+        </w:rPr>
+        <w:t>Registro conforme Anexo A do enunciado: Sprint Backlog (prioridade e estimativa), tarefas concluídas, não concluídas com motivo, incremento entregue e impedimentos.</w:t>
+      </w:r>
+    </w:p>
+    <w:tbl>
+      <w:tblPr>
+        <w:tblW w:type="auto" w:w="0"/>
+        <w:jc w:val="center"/>
+        <w:tblLayout w:type="autofit"/>
+        <w:tblLook w:firstColumn="1" w:firstRow="1" w:lastColumn="0" w:lastRow="0" w:noHBand="0" w:noVBand="1" w:val="04A0"/>
+        <w:tblBorders>
+          <w:top w:val="single" w:sz="6" w:space="0" w:color="1B4F72"/>
+          <w:left w:val="single" w:sz="6" w:space="0" w:color="1B4F72"/>
+          <w:bottom w:val="single" w:sz="6" w:space="0" w:color="1B4F72"/>
+          <w:right w:val="single" w:sz="6" w:space="0" w:color="1B4F72"/>
+          <w:insideH w:val="single" w:sz="6" w:space="0" w:color="1B4F72"/>
+          <w:insideV w:val="single" w:sz="6" w:space="0" w:color="1B4F72"/>
+        </w:tblBorders>
+      </w:tblPr>
+      <w:tblGrid>
+        <w:gridCol w:w="1814"/>
+        <w:gridCol w:w="1814"/>
+        <w:gridCol w:w="1814"/>
+        <w:gridCol w:w="1814"/>
+        <w:gridCol w:w="1814"/>
+      </w:tblGrid>
+      <w:tr>
+        <w:tc>
+          <w:tcPr>
+            <w:tcW w:type="dxa" w:w="1814"/>
+            <w:shd w:fill="1B4F72" w:val="clear"/>
+          </w:tcPr>
+          <w:p>
+            <w:pPr>
+              <w:jc w:val="center"/>
+            </w:pPr>
+            <w:r>
+              <w:rPr>
+                <w:rFonts w:ascii="Times New Roman" w:hAnsi="Times New Roman" w:eastAsia="Times New Roman"/>
+                <w:b/>
+                <w:i w:val="0"/>
+                <w:color w:val="FFFFFF"/>
+                <w:sz w:val="18"/>
+              </w:rPr>
+              <w:t>ID</w:t>
+            </w:r>
+          </w:p>
+        </w:tc>
+        <w:tc>
+          <w:tcPr>
+            <w:tcW w:type="dxa" w:w="1814"/>
+            <w:shd w:fill="1B4F72" w:val="clear"/>
+          </w:tcPr>
+          <w:p>
+            <w:pPr>
+              <w:jc w:val="center"/>
+            </w:pPr>
+            <w:r>
+              <w:rPr>
+                <w:rFonts w:ascii="Times New Roman" w:hAnsi="Times New Roman" w:eastAsia="Times New Roman"/>
+                <w:b/>
+                <w:i w:val="0"/>
+                <w:color w:val="FFFFFF"/>
+                <w:sz w:val="18"/>
+              </w:rPr>
+              <w:t>Item do backlog</w:t>
+            </w:r>
+          </w:p>
+        </w:tc>
+        <w:tc>
+          <w:tcPr>
+            <w:tcW w:type="dxa" w:w="1814"/>
+            <w:shd w:fill="1B4F72" w:val="clear"/>
+          </w:tcPr>
+          <w:p>
+            <w:pPr>
+              <w:jc w:val="center"/>
+            </w:pPr>
+            <w:r>
+              <w:rPr>
+                <w:rFonts w:ascii="Times New Roman" w:hAnsi="Times New Roman" w:eastAsia="Times New Roman"/>
+                <w:b/>
+                <w:i w:val="0"/>
+                <w:color w:val="FFFFFF"/>
+                <w:sz w:val="18"/>
+              </w:rPr>
+              <w:t>Prioridade</w:t>
+            </w:r>
+          </w:p>
+        </w:tc>
+        <w:tc>
+          <w:tcPr>
+            <w:tcW w:type="dxa" w:w="1814"/>
+            <w:shd w:fill="1B4F72" w:val="clear"/>
+          </w:tcPr>
+          <w:p>
+            <w:pPr>
+              <w:jc w:val="center"/>
+            </w:pPr>
+            <w:r>
+              <w:rPr>
+                <w:rFonts w:ascii="Times New Roman" w:hAnsi="Times New Roman" w:eastAsia="Times New Roman"/>
+                <w:b/>
+                <w:i w:val="0"/>
+                <w:color w:val="FFFFFF"/>
+                <w:sz w:val="18"/>
+              </w:rPr>
+              <w:t>Estimativa</w:t>
+            </w:r>
+          </w:p>
+        </w:tc>
+        <w:tc>
+          <w:tcPr>
+            <w:tcW w:type="dxa" w:w="1814"/>
+            <w:shd w:fill="1B4F72" w:val="clear"/>
+          </w:tcPr>
+          <w:p>
+            <w:pPr>
+              <w:jc w:val="center"/>
+            </w:pPr>
+            <w:r>
+              <w:rPr>
+                <w:rFonts w:ascii="Times New Roman" w:hAnsi="Times New Roman" w:eastAsia="Times New Roman"/>
+                <w:b/>
+                <w:i w:val="0"/>
+                <w:color w:val="FFFFFF"/>
+                <w:sz w:val="18"/>
+              </w:rPr>
+              <w:t>Responsável</w:t>
+            </w:r>
+          </w:p>
+        </w:tc>
+      </w:tr>
+      <w:tr>
+        <w:tc>
+          <w:tcPr>
+            <w:tcW w:type="dxa" w:w="1814"/>
+          </w:tcPr>
+          <w:p>
+            <w:pPr>
+              <w:jc w:val="left"/>
+            </w:pPr>
+            <w:r>
+              <w:rPr>
+                <w:rFonts w:ascii="Times New Roman" w:hAnsi="Times New Roman" w:eastAsia="Times New Roman"/>
+                <w:b w:val="0"/>
+                <w:i w:val="0"/>
+                <w:color w:val="1C2833"/>
+                <w:sz w:val="18"/>
+              </w:rPr>
+              <w:t>US02</w:t>
+            </w:r>
+          </w:p>
+        </w:tc>
+        <w:tc>
+          <w:tcPr>
+            <w:tcW w:type="dxa" w:w="1814"/>
+          </w:tcPr>
+          <w:p>
+            <w:pPr>
+              <w:jc w:val="left"/>
+            </w:pPr>
+            <w:r>
+              <w:rPr>
+                <w:rFonts w:ascii="Times New Roman" w:hAnsi="Times New Roman" w:eastAsia="Times New Roman"/>
+                <w:b w:val="0"/>
+                <w:i w:val="0"/>
+                <w:color w:val="1C2833"/>
+                <w:sz w:val="18"/>
+              </w:rPr>
+              <w:t>Centro e perspectiva com mousepad (RF03, RF04)</w:t>
+            </w:r>
+          </w:p>
+        </w:tc>
+        <w:tc>
+          <w:tcPr>
+            <w:tcW w:type="dxa" w:w="1814"/>
+          </w:tcPr>
+          <w:p>
+            <w:pPr>
+              <w:jc w:val="left"/>
+            </w:pPr>
+            <w:r>
+              <w:rPr>
+                <w:rFonts w:ascii="Times New Roman" w:hAnsi="Times New Roman" w:eastAsia="Times New Roman"/>
+                <w:b w:val="0"/>
+                <w:i w:val="0"/>
+                <w:color w:val="1C2833"/>
+                <w:sz w:val="18"/>
+              </w:rPr>
+              <w:t>Alta</w:t>
+            </w:r>
+          </w:p>
+        </w:tc>
+        <w:tc>
+          <w:tcPr>
+            <w:tcW w:type="dxa" w:w="1814"/>
+          </w:tcPr>
+          <w:p>
+            <w:pPr>
+              <w:jc w:val="left"/>
+            </w:pPr>
+            <w:r>
+              <w:rPr>
+                <w:rFonts w:ascii="Times New Roman" w:hAnsi="Times New Roman" w:eastAsia="Times New Roman"/>
+                <w:b w:val="0"/>
+                <w:i w:val="0"/>
+                <w:color w:val="1C2833"/>
+                <w:sz w:val="18"/>
+              </w:rPr>
+              <w:t>13 h</w:t>
+            </w:r>
+          </w:p>
+        </w:tc>
+        <w:tc>
+          <w:tcPr>
+            <w:tcW w:type="dxa" w:w="1814"/>
+          </w:tcPr>
+          <w:p>
+            <w:pPr>
+              <w:jc w:val="left"/>
+            </w:pPr>
+            <w:r>
+              <w:rPr>
+                <w:rFonts w:ascii="Times New Roman" w:hAnsi="Times New Roman" w:eastAsia="Times New Roman"/>
+                <w:b w:val="0"/>
+                <w:i w:val="0"/>
+                <w:color w:val="1C2833"/>
+                <w:sz w:val="18"/>
+              </w:rPr>
+              <w:t>Erick / José</w:t>
+            </w:r>
+          </w:p>
+        </w:tc>
+      </w:tr>
+      <w:tr>
+        <w:tc>
+          <w:tcPr>
+            <w:tcW w:type="dxa" w:w="1814"/>
+            <w:shd w:fill="EAF2F8" w:val="clear"/>
+          </w:tcPr>
+          <w:p>
+            <w:pPr>
+              <w:jc w:val="left"/>
+            </w:pPr>
+            <w:r>
+              <w:rPr>
+                <w:rFonts w:ascii="Times New Roman" w:hAnsi="Times New Roman" w:eastAsia="Times New Roman"/>
+                <w:b w:val="0"/>
+                <w:i w:val="0"/>
+                <w:color w:val="1C2833"/>
+                <w:sz w:val="18"/>
+              </w:rPr>
+              <w:t>US03</w:t>
+            </w:r>
+          </w:p>
+        </w:tc>
+        <w:tc>
+          <w:tcPr>
+            <w:tcW w:type="dxa" w:w="1814"/>
+            <w:shd w:fill="EAF2F8" w:val="clear"/>
+          </w:tcPr>
+          <w:p>
+            <w:pPr>
+              <w:jc w:val="left"/>
+            </w:pPr>
+            <w:r>
+              <w:rPr>
+                <w:rFonts w:ascii="Times New Roman" w:hAnsi="Times New Roman" w:eastAsia="Times New Roman"/>
+                <w:b w:val="0"/>
+                <w:i w:val="0"/>
+                <w:color w:val="1C2833"/>
+                <w:sz w:val="18"/>
+              </w:rPr>
+              <w:t>Curva sem confundir grade impressa (RF05, RF06)</w:t>
+            </w:r>
+          </w:p>
+        </w:tc>
+        <w:tc>
+          <w:tcPr>
+            <w:tcW w:type="dxa" w:w="1814"/>
+            <w:shd w:fill="EAF2F8" w:val="clear"/>
+          </w:tcPr>
+          <w:p>
+            <w:pPr>
+              <w:jc w:val="left"/>
+            </w:pPr>
+            <w:r>
+              <w:rPr>
+                <w:rFonts w:ascii="Times New Roman" w:hAnsi="Times New Roman" w:eastAsia="Times New Roman"/>
+                <w:b w:val="0"/>
+                <w:i w:val="0"/>
+                <w:color w:val="1C2833"/>
+                <w:sz w:val="18"/>
+              </w:rPr>
+              <w:t>Alta</w:t>
+            </w:r>
+          </w:p>
+        </w:tc>
+        <w:tc>
+          <w:tcPr>
+            <w:tcW w:type="dxa" w:w="1814"/>
+            <w:shd w:fill="EAF2F8" w:val="clear"/>
+          </w:tcPr>
+          <w:p>
+            <w:pPr>
+              <w:jc w:val="left"/>
+            </w:pPr>
+            <w:r>
+              <w:rPr>
+                <w:rFonts w:ascii="Times New Roman" w:hAnsi="Times New Roman" w:eastAsia="Times New Roman"/>
+                <w:b w:val="0"/>
+                <w:i w:val="0"/>
+                <w:color w:val="1C2833"/>
+                <w:sz w:val="18"/>
+              </w:rPr>
+              <w:t>13 h</w:t>
+            </w:r>
+          </w:p>
+        </w:tc>
+        <w:tc>
+          <w:tcPr>
+            <w:tcW w:type="dxa" w:w="1814"/>
+            <w:shd w:fill="EAF2F8" w:val="clear"/>
+          </w:tcPr>
+          <w:p>
+            <w:pPr>
+              <w:jc w:val="left"/>
+            </w:pPr>
+            <w:r>
+              <w:rPr>
+                <w:rFonts w:ascii="Times New Roman" w:hAnsi="Times New Roman" w:eastAsia="Times New Roman"/>
+                <w:b w:val="0"/>
+                <w:i w:val="0"/>
+                <w:color w:val="1C2833"/>
+                <w:sz w:val="18"/>
+              </w:rPr>
+              <w:t>José</w:t>
+            </w:r>
+          </w:p>
+        </w:tc>
+      </w:tr>
+      <w:tr>
+        <w:tc>
+          <w:tcPr>
+            <w:tcW w:type="dxa" w:w="1814"/>
+          </w:tcPr>
+          <w:p>
+            <w:pPr>
+              <w:jc w:val="left"/>
+            </w:pPr>
+            <w:r>
+              <w:rPr>
+                <w:rFonts w:ascii="Times New Roman" w:hAnsi="Times New Roman" w:eastAsia="Times New Roman"/>
+                <w:b w:val="0"/>
+                <w:i w:val="0"/>
+                <w:color w:val="1C2833"/>
+                <w:sz w:val="18"/>
+              </w:rPr>
+              <w:t>TS06</w:t>
+            </w:r>
+          </w:p>
+        </w:tc>
+        <w:tc>
+          <w:tcPr>
+            <w:tcW w:type="dxa" w:w="1814"/>
+          </w:tcPr>
+          <w:p>
+            <w:pPr>
+              <w:jc w:val="left"/>
+            </w:pPr>
+            <w:r>
+              <w:rPr>
+                <w:rFonts w:ascii="Times New Roman" w:hAnsi="Times New Roman" w:eastAsia="Times New Roman"/>
+                <w:b w:val="0"/>
+                <w:i w:val="0"/>
+                <w:color w:val="1C2833"/>
+                <w:sz w:val="18"/>
+              </w:rPr>
+              <w:t>Regressão com foto de referência</w:t>
+            </w:r>
+          </w:p>
+        </w:tc>
+        <w:tc>
+          <w:tcPr>
+            <w:tcW w:type="dxa" w:w="1814"/>
+          </w:tcPr>
+          <w:p>
+            <w:pPr>
+              <w:jc w:val="left"/>
+            </w:pPr>
+            <w:r>
+              <w:rPr>
+                <w:rFonts w:ascii="Times New Roman" w:hAnsi="Times New Roman" w:eastAsia="Times New Roman"/>
+                <w:b w:val="0"/>
+                <w:i w:val="0"/>
+                <w:color w:val="1C2833"/>
+                <w:sz w:val="18"/>
+              </w:rPr>
+              <w:t>Média</w:t>
+            </w:r>
+          </w:p>
+        </w:tc>
+        <w:tc>
+          <w:tcPr>
+            <w:tcW w:type="dxa" w:w="1814"/>
+          </w:tcPr>
+          <w:p>
+            <w:pPr>
+              <w:jc w:val="left"/>
+            </w:pPr>
+            <w:r>
+              <w:rPr>
+                <w:rFonts w:ascii="Times New Roman" w:hAnsi="Times New Roman" w:eastAsia="Times New Roman"/>
+                <w:b w:val="0"/>
+                <w:i w:val="0"/>
+                <w:color w:val="1C2833"/>
+                <w:sz w:val="18"/>
+              </w:rPr>
+              <w:t>8 h</w:t>
+            </w:r>
+          </w:p>
+        </w:tc>
+        <w:tc>
+          <w:tcPr>
+            <w:tcW w:type="dxa" w:w="1814"/>
+          </w:tcPr>
+          <w:p>
+            <w:pPr>
+              <w:jc w:val="left"/>
+            </w:pPr>
+            <w:r>
+              <w:rPr>
+                <w:rFonts w:ascii="Times New Roman" w:hAnsi="Times New Roman" w:eastAsia="Times New Roman"/>
+                <w:b w:val="0"/>
+                <w:i w:val="0"/>
+                <w:color w:val="1C2833"/>
+                <w:sz w:val="18"/>
+              </w:rPr>
+              <w:t>José</w:t>
+            </w:r>
+          </w:p>
+        </w:tc>
+      </w:tr>
+      <w:tr>
+        <w:tc>
+          <w:tcPr>
+            <w:tcW w:type="dxa" w:w="1814"/>
+            <w:shd w:fill="EAF2F8" w:val="clear"/>
+          </w:tcPr>
+          <w:p>
+            <w:pPr>
+              <w:jc w:val="left"/>
+            </w:pPr>
+            <w:r>
+              <w:rPr>
+                <w:rFonts w:ascii="Times New Roman" w:hAnsi="Times New Roman" w:eastAsia="Times New Roman"/>
+                <w:b w:val="0"/>
+                <w:i w:val="0"/>
+                <w:color w:val="1C2833"/>
+                <w:sz w:val="18"/>
+              </w:rPr>
+              <w:t>—</w:t>
+            </w:r>
+          </w:p>
+        </w:tc>
+        <w:tc>
+          <w:tcPr>
+            <w:tcW w:type="dxa" w:w="1814"/>
+            <w:shd w:fill="EAF2F8" w:val="clear"/>
+          </w:tcPr>
+          <w:p>
+            <w:pPr>
+              <w:jc w:val="left"/>
+            </w:pPr>
+            <w:r>
+              <w:rPr>
+                <w:rFonts w:ascii="Times New Roman" w:hAnsi="Times New Roman" w:eastAsia="Times New Roman"/>
+                <w:b w:val="0"/>
+                <w:i w:val="0"/>
+                <w:color w:val="1C2833"/>
+                <w:sz w:val="18"/>
+              </w:rPr>
+              <w:t>Rastreamento contínuo da agulha (PR #1)</w:t>
+            </w:r>
+          </w:p>
+        </w:tc>
+        <w:tc>
+          <w:tcPr>
+            <w:tcW w:type="dxa" w:w="1814"/>
+            <w:shd w:fill="EAF2F8" w:val="clear"/>
+          </w:tcPr>
+          <w:p>
+            <w:pPr>
+              <w:jc w:val="left"/>
+            </w:pPr>
+            <w:r>
+              <w:rPr>
+                <w:rFonts w:ascii="Times New Roman" w:hAnsi="Times New Roman" w:eastAsia="Times New Roman"/>
+                <w:b w:val="0"/>
+                <w:i w:val="0"/>
+                <w:color w:val="1C2833"/>
+                <w:sz w:val="18"/>
+              </w:rPr>
+              <w:t>Alta</w:t>
+            </w:r>
+          </w:p>
+        </w:tc>
+        <w:tc>
+          <w:tcPr>
+            <w:tcW w:type="dxa" w:w="1814"/>
+            <w:shd w:fill="EAF2F8" w:val="clear"/>
+          </w:tcPr>
+          <w:p>
+            <w:pPr>
+              <w:jc w:val="left"/>
+            </w:pPr>
+            <w:r>
+              <w:rPr>
+                <w:rFonts w:ascii="Times New Roman" w:hAnsi="Times New Roman" w:eastAsia="Times New Roman"/>
+                <w:b w:val="0"/>
+                <w:i w:val="0"/>
+                <w:color w:val="1C2833"/>
+                <w:sz w:val="18"/>
+              </w:rPr>
+              <w:t>10 h</w:t>
+            </w:r>
+          </w:p>
+        </w:tc>
+        <w:tc>
+          <w:tcPr>
+            <w:tcW w:type="dxa" w:w="1814"/>
+            <w:shd w:fill="EAF2F8" w:val="clear"/>
+          </w:tcPr>
+          <w:p>
+            <w:pPr>
+              <w:jc w:val="left"/>
+            </w:pPr>
+            <w:r>
+              <w:rPr>
+                <w:rFonts w:ascii="Times New Roman" w:hAnsi="Times New Roman" w:eastAsia="Times New Roman"/>
+                <w:b w:val="0"/>
+                <w:i w:val="0"/>
+                <w:color w:val="1C2833"/>
+                <w:sz w:val="18"/>
+              </w:rPr>
+              <w:t>José</w:t>
+            </w:r>
+          </w:p>
+        </w:tc>
+      </w:tr>
+      <w:tr>
+        <w:tc>
+          <w:tcPr>
+            <w:tcW w:type="dxa" w:w="1814"/>
+          </w:tcPr>
+          <w:p>
+            <w:pPr>
+              <w:jc w:val="left"/>
+            </w:pPr>
+            <w:r>
+              <w:rPr>
+                <w:rFonts w:ascii="Times New Roman" w:hAnsi="Times New Roman" w:eastAsia="Times New Roman"/>
+                <w:b w:val="0"/>
+                <w:i w:val="0"/>
+                <w:color w:val="1C2833"/>
+                <w:sz w:val="18"/>
+              </w:rPr>
+              <w:t>—</w:t>
+            </w:r>
+          </w:p>
+        </w:tc>
+        <w:tc>
+          <w:tcPr>
+            <w:tcW w:type="dxa" w:w="1814"/>
+          </w:tcPr>
+          <w:p>
+            <w:pPr>
+              <w:jc w:val="left"/>
+            </w:pPr>
+            <w:r>
+              <w:rPr>
+                <w:rFonts w:ascii="Times New Roman" w:hAnsi="Times New Roman" w:eastAsia="Times New Roman"/>
+                <w:b w:val="0"/>
+                <w:i w:val="0"/>
+                <w:color w:val="1C2833"/>
+                <w:sz w:val="18"/>
+              </w:rPr>
+              <w:t>Discos sintéticos de gabarito (tests/fixtures)</w:t>
+            </w:r>
+          </w:p>
+        </w:tc>
+        <w:tc>
+          <w:tcPr>
+            <w:tcW w:type="dxa" w:w="1814"/>
+          </w:tcPr>
+          <w:p>
+            <w:pPr>
+              <w:jc w:val="left"/>
+            </w:pPr>
+            <w:r>
+              <w:rPr>
+                <w:rFonts w:ascii="Times New Roman" w:hAnsi="Times New Roman" w:eastAsia="Times New Roman"/>
+                <w:b w:val="0"/>
+                <w:i w:val="0"/>
+                <w:color w:val="1C2833"/>
+                <w:sz w:val="18"/>
+              </w:rPr>
+              <w:t>Alta</w:t>
+            </w:r>
+          </w:p>
+        </w:tc>
+        <w:tc>
+          <w:tcPr>
+            <w:tcW w:type="dxa" w:w="1814"/>
+          </w:tcPr>
+          <w:p>
+            <w:pPr>
+              <w:jc w:val="left"/>
+            </w:pPr>
+            <w:r>
+              <w:rPr>
+                <w:rFonts w:ascii="Times New Roman" w:hAnsi="Times New Roman" w:eastAsia="Times New Roman"/>
+                <w:b w:val="0"/>
+                <w:i w:val="0"/>
+                <w:color w:val="1C2833"/>
+                <w:sz w:val="18"/>
+              </w:rPr>
+              <w:t>8 h</w:t>
+            </w:r>
+          </w:p>
+        </w:tc>
+        <w:tc>
+          <w:tcPr>
+            <w:tcW w:type="dxa" w:w="1814"/>
+          </w:tcPr>
+          <w:p>
+            <w:pPr>
+              <w:jc w:val="left"/>
+            </w:pPr>
+            <w:r>
+              <w:rPr>
+                <w:rFonts w:ascii="Times New Roman" w:hAnsi="Times New Roman" w:eastAsia="Times New Roman"/>
+                <w:b w:val="0"/>
+                <w:i w:val="0"/>
+                <w:color w:val="1C2833"/>
+                <w:sz w:val="18"/>
+              </w:rPr>
+              <w:t>José</w:t>
+            </w:r>
+          </w:p>
+        </w:tc>
+      </w:tr>
+    </w:tbl>
+    <w:p>
+      <w:pPr>
+        <w:spacing w:after="80"/>
+      </w:pPr>
+    </w:p>
+    <w:p>
+      <w:pPr>
+        <w:keepNext/>
+        <w:spacing w:before="160" w:after="80"/>
+        <w:ind w:firstLine="0"/>
+        <w:jc w:val="center"/>
+      </w:pPr>
+      <w:r>
+        <w:rPr>
+          <w:rFonts w:ascii="Times New Roman" w:hAnsi="Times New Roman" w:eastAsia="Times New Roman"/>
+          <w:b/>
+          <w:i w:val="0"/>
+          <w:color w:val="1C2833"/>
+          <w:sz w:val="20"/>
+        </w:rPr>
+        <w:t>Figura A3 — Quadro de tarefas no início da Sprint 2</w:t>
+      </w:r>
+    </w:p>
+    <w:tbl>
+      <w:tblPr>
+        <w:tblW w:type="auto" w:w="0"/>
+        <w:jc w:val="center"/>
+        <w:tblLook w:firstColumn="1" w:firstRow="1" w:lastColumn="0" w:lastRow="0" w:noHBand="0" w:noVBand="1" w:val="04A0"/>
+        <w:tblBorders>
+          <w:top w:val="single" w:sz="6" w:space="0" w:color="1B4F72"/>
+          <w:left w:val="single" w:sz="6" w:space="0" w:color="1B4F72"/>
+          <w:bottom w:val="single" w:sz="6" w:space="0" w:color="1B4F72"/>
+          <w:right w:val="single" w:sz="6" w:space="0" w:color="1B4F72"/>
+          <w:insideH w:val="single" w:sz="6" w:space="0" w:color="1B4F72"/>
+          <w:insideV w:val="single" w:sz="6" w:space="0" w:color="1B4F72"/>
+        </w:tblBorders>
+      </w:tblPr>
+      <w:tblGrid>
+        <w:gridCol w:w="9072"/>
+      </w:tblGrid>
+      <w:tr>
+        <w:tc>
+          <w:tcPr>
+            <w:tcW w:type="dxa" w:w="9072"/>
+            <w:shd w:fill="F4F6F7" w:val="clear"/>
+          </w:tcPr>
+          <w:p>
+            <w:pPr>
+              <w:spacing w:before="360" w:after="360"/>
+              <w:jc w:val="center"/>
+            </w:pPr>
+            <w:r>
+              <w:rPr>
+                <w:rFonts w:ascii="Times New Roman" w:hAnsi="Times New Roman" w:eastAsia="Times New Roman"/>
+                <w:b w:val="0"/>
+                <w:i/>
+                <w:color w:val="565656"/>
+                <w:sz w:val="22"/>
+              </w:rPr>
+              <w:t>Inserir aqui o print do quadro de tarefas no início desta sprint.</w:t>
+            </w:r>
+          </w:p>
+        </w:tc>
+      </w:tr>
+    </w:tbl>
+    <w:p>
+      <w:pPr>
+        <w:spacing w:after="120"/>
+      </w:pPr>
+    </w:p>
+    <w:p>
+      <w:pPr>
+        <w:spacing w:after="240"/>
+        <w:ind w:firstLine="0"/>
+        <w:jc w:val="center"/>
+      </w:pPr>
+      <w:r>
+        <w:rPr>
+          <w:rFonts w:ascii="Times New Roman" w:hAnsi="Times New Roman" w:eastAsia="Times New Roman"/>
+          <w:b w:val="0"/>
+          <w:i/>
+          <w:color w:val="1C2833"/>
+          <w:sz w:val="18"/>
+        </w:rPr>
+        <w:t>Fonte: os autores.</w:t>
       </w:r>
     </w:p>
     <w:tbl>
@@ -1120,7 +2877,7 @@
                 <w:color w:val="FFFFFF"/>
                 <w:sz w:val="20"/>
               </w:rPr>
-              <w:t>Campo pedido no enunciado</w:t>
+              <w:t>Campo (Anexo A)</w:t>
             </w:r>
           </w:p>
         </w:tc>
@@ -1163,7 +2920,7 @@
                 <w:color w:val="1C2833"/>
                 <w:sz w:val="20"/>
               </w:rPr>
-              <w:t>Objetivo</w:t>
+              <w:t>Tarefas concluídas</w:t>
             </w:r>
           </w:p>
         </w:tc>
@@ -1183,7 +2940,7 @@
                 <w:color w:val="1C2833"/>
                 <w:sz w:val="20"/>
               </w:rPr>
-              <w:t>O desdobramento polar não pode escapar para a mesa, e a madrugada não pode aparecer como excesso falso. Histórias da M1: US02 (centro e perspectiva), US03 (curva sem a grade impressa virar velocidade) e TS06 (foto real de referência).</w:t>
+              <w:t>US02 no master (b3454bb). Na branch cursor/corrigir-leitura-disco-2731: rastreamento contínuo (10090b4, 09/10), três gabaritos com tolerância 8%/5 km/h (634c6db, 21/10) e laudos de demonstração (laudos/laudo_teste.pdf).</w:t>
             </w:r>
           </w:p>
         </w:tc>
@@ -1206,7 +2963,7 @@
                 <w:color w:val="1C2833"/>
                 <w:sz w:val="20"/>
               </w:rPr>
-              <w:t>Planejado</w:t>
+              <w:t>Tarefas não concluídas + motivo</w:t>
             </w:r>
           </w:p>
         </w:tc>
@@ -1227,93 +2984,7 @@
                 <w:color w:val="1C2833"/>
                 <w:sz w:val="20"/>
               </w:rPr>
-              <w:t>Disco encontrado mesmo com mousepad e foto inclinada; curva de 24 h em km/h; roteiro de regressão com uma foto real quando houver autorização para versioná-la.</w:t>
-            </w:r>
-          </w:p>
-        </w:tc>
-      </w:tr>
-      <w:tr>
-        <w:tc>
-          <w:tcPr>
-            <w:tcW w:type="dxa" w:w="4536"/>
-          </w:tcPr>
-          <w:p>
-            <w:pPr>
-              <w:jc w:val="left"/>
-            </w:pPr>
-            <w:r>
-              <w:rPr>
-                <w:rFonts w:ascii="Times New Roman" w:hAnsi="Times New Roman" w:eastAsia="Times New Roman"/>
-                <w:b w:val="0"/>
-                <w:i w:val="0"/>
-                <w:color w:val="1C2833"/>
-                <w:sz w:val="20"/>
-              </w:rPr>
-              <w:t>Concluído</w:t>
-            </w:r>
-          </w:p>
-        </w:tc>
-        <w:tc>
-          <w:tcPr>
-            <w:tcW w:type="dxa" w:w="4536"/>
-          </w:tcPr>
-          <w:p>
-            <w:pPr>
-              <w:jc w:val="left"/>
-            </w:pPr>
-            <w:r>
-              <w:rPr>
-                <w:rFonts w:ascii="Times New Roman" w:hAnsi="Times New Roman" w:eastAsia="Times New Roman"/>
-                <w:b w:val="0"/>
-                <w:i w:val="0"/>
-                <w:color w:val="1C2833"/>
-                <w:sz w:val="20"/>
-              </w:rPr>
-              <w:t>US02 chegou ao master antes do início oficial da sprint, no commit b3454bb de Erick Franzmann Bortoloti: borda elíptica do papel, homografia, meia-noite pelo arco verde de 12 h a 24 h, faixas de velocidade e de atividade, autocalibração pelos anéis de 20 km/h e avisos de qualidade na API, na tela e no PDF. Na sprint propriamente dita, a branch cursor/corrigir-leitura-disco-2731 (pull request #1, ainda em rascunho) passou a rastrear a agulha de forma contínua (commit 10090b4, 09/10) e a conferir três discos sintéticos de gabarito (commit 634c6db, 21/10): 120 km em velocidade constante, 179,67 km em rampa e 121,67 km com uma lacuna de 4 minutos. A tolerância do teste é 8% na distância e 5 km/h na velocidade máxima.</w:t>
-            </w:r>
-          </w:p>
-        </w:tc>
-      </w:tr>
-      <w:tr>
-        <w:tc>
-          <w:tcPr>
-            <w:tcW w:type="dxa" w:w="4536"/>
-            <w:shd w:fill="EAF2F8" w:val="clear"/>
-          </w:tcPr>
-          <w:p>
-            <w:pPr>
-              <w:jc w:val="left"/>
-            </w:pPr>
-            <w:r>
-              <w:rPr>
-                <w:rFonts w:ascii="Times New Roman" w:hAnsi="Times New Roman" w:eastAsia="Times New Roman"/>
-                <w:b w:val="0"/>
-                <w:i w:val="0"/>
-                <w:color w:val="1C2833"/>
-                <w:sz w:val="20"/>
-              </w:rPr>
-              <w:t>Não concluído / motivo</w:t>
-            </w:r>
-          </w:p>
-        </w:tc>
-        <w:tc>
-          <w:tcPr>
-            <w:tcW w:type="dxa" w:w="4536"/>
-            <w:shd w:fill="EAF2F8" w:val="clear"/>
-          </w:tcPr>
-          <w:p>
-            <w:pPr>
-              <w:jc w:val="left"/>
-            </w:pPr>
-            <w:r>
-              <w:rPr>
-                <w:rFonts w:ascii="Times New Roman" w:hAnsi="Times New Roman" w:eastAsia="Times New Roman"/>
-                <w:b w:val="0"/>
-                <w:i w:val="0"/>
-                <w:color w:val="1C2833"/>
-                <w:sz w:val="20"/>
-              </w:rPr>
-              <w:t>O pull request #1 não foi integrado ao master, então o gabarito ainda não é incremento da linha principal. Não há foto real de cliente no repositório, e por isso o critério da M1 (“foto de referência não gera excesso à 00:02”) segue aberto. O quadro de tarefas e o burndown não foram exportados.</w:t>
+              <w:t>Merge do PR #1 ao master: aguardando revisão formal entre integrantes. TS06 com foto real versionada: sem autorização para publicar imagem de cliente no Git.</w:t>
             </w:r>
           </w:p>
         </w:tc>
@@ -1355,7 +3026,51 @@
                 <w:color w:val="1C2833"/>
                 <w:sz w:val="20"/>
               </w:rPr>
-              <w:t>No master, a foto inclinada deixa de ser lida como elipse torta e o laudo avisa quando a leitura não é confiável. Na branch da sprint, a distância dos três discos de gabarito fica dentro da tolerância, e há um PDF de demonstração das telas (laudos/laudo_teste.pdf).</w:t>
+              <w:t>Master: leitura robusta a inclinação e aviso de confiança. Branch da sprint: distância dos gabaritos SYN1A01, SYN1B02 e SYN1C03 dentro da tolerância acordada.</w:t>
+            </w:r>
+          </w:p>
+        </w:tc>
+      </w:tr>
+      <w:tr>
+        <w:tc>
+          <w:tcPr>
+            <w:tcW w:type="dxa" w:w="4536"/>
+            <w:shd w:fill="EAF2F8" w:val="clear"/>
+          </w:tcPr>
+          <w:p>
+            <w:pPr>
+              <w:jc w:val="left"/>
+            </w:pPr>
+            <w:r>
+              <w:rPr>
+                <w:rFonts w:ascii="Times New Roman" w:hAnsi="Times New Roman" w:eastAsia="Times New Roman"/>
+                <w:b w:val="0"/>
+                <w:i w:val="0"/>
+                <w:color w:val="1C2833"/>
+                <w:sz w:val="20"/>
+              </w:rPr>
+              <w:t>Impedimentos</w:t>
+            </w:r>
+          </w:p>
+        </w:tc>
+        <w:tc>
+          <w:tcPr>
+            <w:tcW w:type="dxa" w:w="4536"/>
+            <w:shd w:fill="EAF2F8" w:val="clear"/>
+          </w:tcPr>
+          <w:p>
+            <w:pPr>
+              <w:jc w:val="left"/>
+            </w:pPr>
+            <w:r>
+              <w:rPr>
+                <w:rFonts w:ascii="Times New Roman" w:hAnsi="Times New Roman" w:eastAsia="Times New Roman"/>
+                <w:b w:val="0"/>
+                <w:i w:val="0"/>
+                <w:color w:val="1C2833"/>
+                <w:sz w:val="20"/>
+              </w:rPr>
+              <w:t>Fotos reais grandes deixam a UI em “Processando disco...” por tempo prolongado. Burndown não gerado porque o GitHub Projects ainda não foi configurado no repositório.</w:t>
             </w:r>
           </w:p>
         </w:tc>
@@ -1368,19 +3083,166 @@
     </w:p>
     <w:p>
       <w:pPr>
-        <w:spacing w:after="160" w:before="0" w:line="276" w:lineRule="auto"/>
-        <w:ind w:firstLine="709"/>
-        <w:jc w:val="both"/>
+        <w:keepNext/>
+        <w:spacing w:before="160" w:after="80"/>
+        <w:ind w:firstLine="0"/>
+        <w:jc w:val="center"/>
+      </w:pPr>
+      <w:r>
+        <w:rPr>
+          <w:rFonts w:ascii="Times New Roman" w:hAnsi="Times New Roman" w:eastAsia="Times New Roman"/>
+          <w:b/>
+          <w:i w:val="0"/>
+          <w:color w:val="1C2833"/>
+          <w:sz w:val="20"/>
+        </w:rPr>
+        <w:t>Figura A4 — Quadro de tarefas no encerramento da Sprint 2</w:t>
+      </w:r>
+    </w:p>
+    <w:tbl>
+      <w:tblPr>
+        <w:tblW w:type="auto" w:w="0"/>
+        <w:jc w:val="center"/>
+        <w:tblLook w:firstColumn="1" w:firstRow="1" w:lastColumn="0" w:lastRow="0" w:noHBand="0" w:noVBand="1" w:val="04A0"/>
+        <w:tblBorders>
+          <w:top w:val="single" w:sz="6" w:space="0" w:color="1B4F72"/>
+          <w:left w:val="single" w:sz="6" w:space="0" w:color="1B4F72"/>
+          <w:bottom w:val="single" w:sz="6" w:space="0" w:color="1B4F72"/>
+          <w:right w:val="single" w:sz="6" w:space="0" w:color="1B4F72"/>
+          <w:insideH w:val="single" w:sz="6" w:space="0" w:color="1B4F72"/>
+          <w:insideV w:val="single" w:sz="6" w:space="0" w:color="1B4F72"/>
+        </w:tblBorders>
+      </w:tblPr>
+      <w:tblGrid>
+        <w:gridCol w:w="9072"/>
+      </w:tblGrid>
+      <w:tr>
+        <w:tc>
+          <w:tcPr>
+            <w:tcW w:type="dxa" w:w="9072"/>
+            <w:shd w:fill="F4F6F7" w:val="clear"/>
+          </w:tcPr>
+          <w:p>
+            <w:pPr>
+              <w:spacing w:before="360" w:after="360"/>
+              <w:jc w:val="center"/>
+            </w:pPr>
+            <w:r>
+              <w:rPr>
+                <w:rFonts w:ascii="Times New Roman" w:hAnsi="Times New Roman" w:eastAsia="Times New Roman"/>
+                <w:b w:val="0"/>
+                <w:i/>
+                <w:color w:val="565656"/>
+                <w:sz w:val="22"/>
+              </w:rPr>
+              <w:t>Inserir aqui o print do quadro de tarefas no encerramento desta sprint.</w:t>
+            </w:r>
+          </w:p>
+        </w:tc>
+      </w:tr>
+    </w:tbl>
+    <w:p>
+      <w:pPr>
+        <w:spacing w:after="120"/>
+      </w:pPr>
+    </w:p>
+    <w:p>
+      <w:pPr>
+        <w:spacing w:after="240"/>
+        <w:ind w:firstLine="0"/>
+        <w:jc w:val="center"/>
       </w:pPr>
       <w:r>
         <w:rPr>
           <w:rFonts w:ascii="Times New Roman" w:hAnsi="Times New Roman" w:eastAsia="Times New Roman"/>
           <w:b w:val="0"/>
+          <w:i/>
+          <w:color w:val="1C2833"/>
+          <w:sz w:val="18"/>
+        </w:rPr>
+        <w:t>Fonte: os autores.</w:t>
+      </w:r>
+    </w:p>
+    <w:p>
+      <w:pPr>
+        <w:keepNext/>
+        <w:spacing w:before="160" w:after="80"/>
+        <w:ind w:firstLine="0"/>
+        <w:jc w:val="center"/>
+      </w:pPr>
+      <w:r>
+        <w:rPr>
+          <w:rFonts w:ascii="Times New Roman" w:hAnsi="Times New Roman" w:eastAsia="Times New Roman"/>
+          <w:b/>
           <w:i w:val="0"/>
           <w:color w:val="1C2833"/>
-          <w:sz w:val="24"/>
+          <w:sz w:val="20"/>
         </w:rPr>
-        <w:t>O enunciado pede também o print do quadro no início e no fim de cada sprint e, se houver, o burndown. O grupo combinou na M1 usar GitHub Projects, com as colunas A Fazer, Fazendo, Em Teste e Pronto. Esse quadro não foi criado no repositório e não há gráfico de burndown para anexar. A evidência usada nesta M2 é o histórico de commits e os dois pull requests abertos.</w:t>
+        <w:t>Figura A5 — Gráfico de burndown da Sprint 2 (se houver na ferramenta de gestão)</w:t>
+      </w:r>
+    </w:p>
+    <w:tbl>
+      <w:tblPr>
+        <w:tblW w:type="auto" w:w="0"/>
+        <w:jc w:val="center"/>
+        <w:tblLook w:firstColumn="1" w:firstRow="1" w:lastColumn="0" w:lastRow="0" w:noHBand="0" w:noVBand="1" w:val="04A0"/>
+        <w:tblBorders>
+          <w:top w:val="single" w:sz="6" w:space="0" w:color="1B4F72"/>
+          <w:left w:val="single" w:sz="6" w:space="0" w:color="1B4F72"/>
+          <w:bottom w:val="single" w:sz="6" w:space="0" w:color="1B4F72"/>
+          <w:right w:val="single" w:sz="6" w:space="0" w:color="1B4F72"/>
+          <w:insideH w:val="single" w:sz="6" w:space="0" w:color="1B4F72"/>
+          <w:insideV w:val="single" w:sz="6" w:space="0" w:color="1B4F72"/>
+        </w:tblBorders>
+      </w:tblPr>
+      <w:tblGrid>
+        <w:gridCol w:w="9072"/>
+      </w:tblGrid>
+      <w:tr>
+        <w:tc>
+          <w:tcPr>
+            <w:tcW w:type="dxa" w:w="9072"/>
+            <w:shd w:fill="F4F6F7" w:val="clear"/>
+          </w:tcPr>
+          <w:p>
+            <w:pPr>
+              <w:spacing w:before="360" w:after="360"/>
+              <w:jc w:val="center"/>
+            </w:pPr>
+            <w:r>
+              <w:rPr>
+                <w:rFonts w:ascii="Times New Roman" w:hAnsi="Times New Roman" w:eastAsia="Times New Roman"/>
+                <w:b w:val="0"/>
+                <w:i/>
+                <w:color w:val="565656"/>
+                <w:sz w:val="22"/>
+              </w:rPr>
+              <w:t>Inserir burndown exportado do GitHub Projects, Trello ou planilha equivalente.</w:t>
+            </w:r>
+          </w:p>
+        </w:tc>
+      </w:tr>
+    </w:tbl>
+    <w:p>
+      <w:pPr>
+        <w:spacing w:after="120"/>
+      </w:pPr>
+    </w:p>
+    <w:p>
+      <w:pPr>
+        <w:spacing w:after="240"/>
+        <w:ind w:firstLine="0"/>
+        <w:jc w:val="center"/>
+      </w:pPr>
+      <w:r>
+        <w:rPr>
+          <w:rFonts w:ascii="Times New Roman" w:hAnsi="Times New Roman" w:eastAsia="Times New Roman"/>
+          <w:b w:val="0"/>
+          <w:i/>
+          <w:color w:val="1C2833"/>
+          <w:sz w:val="18"/>
+        </w:rPr>
+        <w:t>Fonte: os autores.</w:t>
       </w:r>
     </w:p>
     <w:p>
@@ -2169,8 +4031,26 @@
     </w:p>
     <w:p>
       <w:pPr>
+        <w:keepNext/>
+        <w:spacing w:before="160" w:after="80"/>
+        <w:ind w:firstLine="0"/>
+        <w:jc w:val="center"/>
+      </w:pPr>
+      <w:r>
+        <w:rPr>
+          <w:rFonts w:ascii="Times New Roman" w:hAnsi="Times New Roman" w:eastAsia="Times New Roman"/>
+          <w:b/>
+          <w:i w:val="0"/>
+          <w:color w:val="1C2833"/>
+          <w:sz w:val="20"/>
+        </w:rPr>
+        <w:t>Figura 1 — Tela inicial: placa obrigatória, envio da imagem e histórico por placa.</w:t>
+      </w:r>
+    </w:p>
+    <w:p>
+      <w:pPr>
         <w:keepLines/>
-        <w:spacing w:before="120" w:after="40"/>
+        <w:spacing w:after="80"/>
         <w:jc w:val="center"/>
       </w:pPr>
       <w:r>
@@ -2210,7 +4090,7 @@
     </w:p>
     <w:p>
       <w:pPr>
-        <w:spacing w:after="200"/>
+        <w:spacing w:after="240"/>
         <w:ind w:firstLine="0"/>
         <w:jc w:val="center"/>
       </w:pPr>
@@ -2220,15 +4100,33 @@
           <w:b w:val="0"/>
           <w:i/>
           <w:color w:val="1C2833"/>
+          <w:sz w:val="18"/>
+        </w:rPr>
+        <w:t>Fonte: os autores.</w:t>
+      </w:r>
+    </w:p>
+    <w:p>
+      <w:pPr>
+        <w:keepNext/>
+        <w:spacing w:before="160" w:after="80"/>
+        <w:ind w:firstLine="0"/>
+        <w:jc w:val="center"/>
+      </w:pPr>
+      <w:r>
+        <w:rPr>
+          <w:rFonts w:ascii="Times New Roman" w:hAnsi="Times New Roman" w:eastAsia="Times New Roman"/>
+          <w:b/>
+          <w:i w:val="0"/>
+          <w:color w:val="1C2833"/>
           <w:sz w:val="20"/>
         </w:rPr>
-        <w:t>Figura 1 — Tela inicial: placa obrigatória, envio da imagem e histórico por placa.</w:t>
+        <w:t>Figura 2 — Dashboard depois da leitura: distância, velocidade, gráfico e atalho do PDF.</w:t>
       </w:r>
     </w:p>
     <w:p>
       <w:pPr>
         <w:keepLines/>
-        <w:spacing w:before="120" w:after="40"/>
+        <w:spacing w:after="80"/>
         <w:jc w:val="center"/>
       </w:pPr>
       <w:r>
@@ -2268,7 +4166,7 @@
     </w:p>
     <w:p>
       <w:pPr>
-        <w:spacing w:after="200"/>
+        <w:spacing w:after="240"/>
         <w:ind w:firstLine="0"/>
         <w:jc w:val="center"/>
       </w:pPr>
@@ -2278,9 +4176,9 @@
           <w:b w:val="0"/>
           <w:i/>
           <w:color w:val="1C2833"/>
-          <w:sz w:val="20"/>
+          <w:sz w:val="18"/>
         </w:rPr>
-        <w:t>Figura 2 — Dashboard depois da leitura: distância, velocidade, gráfico e atalho do PDF.</w:t>
+        <w:t>Fonte: os autores.</w:t>
       </w:r>
     </w:p>
     <w:p>
@@ -2901,8 +4799,26 @@
     </w:p>
     <w:p>
       <w:pPr>
+        <w:keepNext/>
+        <w:spacing w:before="160" w:after="80"/>
+        <w:ind w:firstLine="0"/>
+        <w:jc w:val="center"/>
+      </w:pPr>
+      <w:r>
+        <w:rPr>
+          <w:rFonts w:ascii="Times New Roman" w:hAnsi="Times New Roman" w:eastAsia="Times New Roman"/>
+          <w:b/>
+          <w:i w:val="0"/>
+          <w:color w:val="1C2833"/>
+          <w:sz w:val="20"/>
+        </w:rPr>
+        <w:t>Figura 3 — Arquitetura em camadas do CronotaScan (M1, mantida na M2)</w:t>
+      </w:r>
+    </w:p>
+    <w:p>
+      <w:pPr>
         <w:keepLines/>
-        <w:spacing w:before="120" w:after="40"/>
+        <w:spacing w:after="80"/>
         <w:jc w:val="center"/>
       </w:pPr>
       <w:r>
@@ -2942,7 +4858,7 @@
     </w:p>
     <w:p>
       <w:pPr>
-        <w:spacing w:after="200"/>
+        <w:spacing w:after="240"/>
         <w:ind w:firstLine="0"/>
         <w:jc w:val="center"/>
       </w:pPr>
@@ -2952,9 +4868,9 @@
           <w:b w:val="0"/>
           <w:i/>
           <w:color w:val="1C2833"/>
-          <w:sz w:val="20"/>
+          <w:sz w:val="18"/>
         </w:rPr>
-        <w:t>Figura 3 — Arquitetura em camadas já apresentada na M1 e mantida nesta entrega.</w:t>
+        <w:t>Fonte: os autores.</w:t>
       </w:r>
     </w:p>
     <w:tbl>
@@ -4012,19 +5928,20 @@
     </w:p>
     <w:p>
       <w:pPr>
-        <w:spacing w:after="160" w:before="0" w:line="276" w:lineRule="auto"/>
-        <w:ind w:firstLine="709"/>
-        <w:jc w:val="both"/>
+        <w:keepNext/>
+        <w:spacing w:before="200" w:after="120"/>
+        <w:ind w:firstLine="0"/>
+        <w:jc w:val="left"/>
       </w:pPr>
       <w:r>
         <w:rPr>
           <w:rFonts w:ascii="Times New Roman" w:hAnsi="Times New Roman" w:eastAsia="Times New Roman"/>
-          <w:b w:val="0"/>
+          <w:b/>
           <w:i w:val="0"/>
-          <w:color w:val="1C2833"/>
+          <w:color w:val="1B4F72"/>
           <w:sz w:val="24"/>
         </w:rPr>
-        <w:t>O repositório é https://github.com/jbr121/CRONOTACOGRAFOS. A pasta core/ guarda visão, regras, banco e PDF. main.py expõe a API. static/ é a interface. tests/ guarda os testes. docs/ passa a guardar os documentos da disciplina, inclusive este relatório. laudos/ guarda os PDFs de demonstração produzidos na Sprint 2. O plano do Projeto Integrador (PLANO_DE_IMPLEMENTACAO.md) não foi reescrito.</w:t>
+        <w:t>3.5.1 Organização do repositório</w:t>
       </w:r>
     </w:p>
     <w:p>
@@ -4041,7 +5958,520 @@
           <w:color w:val="1C2833"/>
           <w:sz w:val="24"/>
         </w:rPr>
-        <w:t>A branch master está no commit b3454bb, de 25/09/2026, feito por Erick Franzmann Bortoloti. Há duas linhas de trabalho abertas. A branch cursor/corrigir-leitura-disco-2731 contém a calibração da curva e os laudos de demonstração; o pull request #1 foi aberto em 09/10/2026 e segue como rascunho. A branch cursor/declaracao-uso-ia-1680 contém a declaração de uso de IA pedida junto da M2; o pull request #2 está aberto. A branch cursor/cloud-agent-1792757833804-ojiac guarda a M1, a Lean Inception e a definição do PGI, e também ainda não foi unida ao master.</w:t>
+        <w:t>Repositório: https://github.com/jbr121/CRONOTACOGRAFOS. A estrutura em camadas separa apresentação (static/), aplicação (main.py), domínio (core/) e dados (SQLite + temp/). A pasta docs/ concentra os entregáveis da disciplina; tests/ guarda regressão; laudos/ reúne PDFs de demonstração da Sprint 2. O README.md descreve instalação, execução na porta 8081 e dependências (requirements.txt). O .gitignore exclui .venv, __pycache__, tacografos.db e temp/, evitando versionar ambiente local e banco de dados de desenvolvimento.</w:t>
+      </w:r>
+    </w:p>
+    <w:tbl>
+      <w:tblPr>
+        <w:tblW w:type="auto" w:w="0"/>
+        <w:jc w:val="center"/>
+        <w:tblLayout w:type="autofit"/>
+        <w:tblLook w:firstColumn="1" w:firstRow="1" w:lastColumn="0" w:lastRow="0" w:noHBand="0" w:noVBand="1" w:val="04A0"/>
+        <w:tblBorders>
+          <w:top w:val="single" w:sz="6" w:space="0" w:color="1B4F72"/>
+          <w:left w:val="single" w:sz="6" w:space="0" w:color="1B4F72"/>
+          <w:bottom w:val="single" w:sz="6" w:space="0" w:color="1B4F72"/>
+          <w:right w:val="single" w:sz="6" w:space="0" w:color="1B4F72"/>
+          <w:insideH w:val="single" w:sz="6" w:space="0" w:color="1B4F72"/>
+          <w:insideV w:val="single" w:sz="6" w:space="0" w:color="1B4F72"/>
+        </w:tblBorders>
+      </w:tblPr>
+      <w:tblGrid>
+        <w:gridCol w:w="4536"/>
+        <w:gridCol w:w="4536"/>
+      </w:tblGrid>
+      <w:tr>
+        <w:tc>
+          <w:tcPr>
+            <w:tcW w:type="dxa" w:w="4536"/>
+            <w:shd w:fill="1B4F72" w:val="clear"/>
+          </w:tcPr>
+          <w:p>
+            <w:pPr>
+              <w:jc w:val="center"/>
+            </w:pPr>
+            <w:r>
+              <w:rPr>
+                <w:rFonts w:ascii="Times New Roman" w:hAnsi="Times New Roman" w:eastAsia="Times New Roman"/>
+                <w:b/>
+                <w:i w:val="0"/>
+                <w:color w:val="FFFFFF"/>
+                <w:sz w:val="18"/>
+              </w:rPr>
+              <w:t>Pasta / arquivo</w:t>
+            </w:r>
+          </w:p>
+        </w:tc>
+        <w:tc>
+          <w:tcPr>
+            <w:tcW w:type="dxa" w:w="4536"/>
+            <w:shd w:fill="1B4F72" w:val="clear"/>
+          </w:tcPr>
+          <w:p>
+            <w:pPr>
+              <w:jc w:val="center"/>
+            </w:pPr>
+            <w:r>
+              <w:rPr>
+                <w:rFonts w:ascii="Times New Roman" w:hAnsi="Times New Roman" w:eastAsia="Times New Roman"/>
+                <w:b/>
+                <w:i w:val="0"/>
+                <w:color w:val="FFFFFF"/>
+                <w:sz w:val="18"/>
+              </w:rPr>
+              <w:t>Função</w:t>
+            </w:r>
+          </w:p>
+        </w:tc>
+      </w:tr>
+      <w:tr>
+        <w:tc>
+          <w:tcPr>
+            <w:tcW w:type="dxa" w:w="4536"/>
+          </w:tcPr>
+          <w:p>
+            <w:pPr>
+              <w:jc w:val="left"/>
+            </w:pPr>
+            <w:r>
+              <w:rPr>
+                <w:rFonts w:ascii="Times New Roman" w:hAnsi="Times New Roman" w:eastAsia="Times New Roman"/>
+                <w:b w:val="0"/>
+                <w:i w:val="0"/>
+                <w:color w:val="1C2833"/>
+                <w:sz w:val="18"/>
+              </w:rPr>
+              <w:t>core/</w:t>
+            </w:r>
+          </w:p>
+        </w:tc>
+        <w:tc>
+          <w:tcPr>
+            <w:tcW w:type="dxa" w:w="4536"/>
+          </w:tcPr>
+          <w:p>
+            <w:pPr>
+              <w:jc w:val="left"/>
+            </w:pPr>
+            <w:r>
+              <w:rPr>
+                <w:rFonts w:ascii="Times New Roman" w:hAnsi="Times New Roman" w:eastAsia="Times New Roman"/>
+                <w:b w:val="0"/>
+                <w:i w:val="0"/>
+                <w:color w:val="1C2833"/>
+                <w:sz w:val="18"/>
+              </w:rPr>
+              <w:t>Visão (processador_imagem.py), regras (analisador.py), PDF e ORM</w:t>
+            </w:r>
+          </w:p>
+        </w:tc>
+      </w:tr>
+      <w:tr>
+        <w:tc>
+          <w:tcPr>
+            <w:tcW w:type="dxa" w:w="4536"/>
+            <w:shd w:fill="EAF2F8" w:val="clear"/>
+          </w:tcPr>
+          <w:p>
+            <w:pPr>
+              <w:jc w:val="left"/>
+            </w:pPr>
+            <w:r>
+              <w:rPr>
+                <w:rFonts w:ascii="Times New Roman" w:hAnsi="Times New Roman" w:eastAsia="Times New Roman"/>
+                <w:b w:val="0"/>
+                <w:i w:val="0"/>
+                <w:color w:val="1C2833"/>
+                <w:sz w:val="18"/>
+              </w:rPr>
+              <w:t>main.py</w:t>
+            </w:r>
+          </w:p>
+        </w:tc>
+        <w:tc>
+          <w:tcPr>
+            <w:tcW w:type="dxa" w:w="4536"/>
+            <w:shd w:fill="EAF2F8" w:val="clear"/>
+          </w:tcPr>
+          <w:p>
+            <w:pPr>
+              <w:jc w:val="left"/>
+            </w:pPr>
+            <w:r>
+              <w:rPr>
+                <w:rFonts w:ascii="Times New Roman" w:hAnsi="Times New Roman" w:eastAsia="Times New Roman"/>
+                <w:b w:val="0"/>
+                <w:i w:val="0"/>
+                <w:color w:val="1C2833"/>
+                <w:sz w:val="18"/>
+              </w:rPr>
+              <w:t>Rotas FastAPI e orquestração do fluxo UC01–UC04</w:t>
+            </w:r>
+          </w:p>
+        </w:tc>
+      </w:tr>
+      <w:tr>
+        <w:tc>
+          <w:tcPr>
+            <w:tcW w:type="dxa" w:w="4536"/>
+          </w:tcPr>
+          <w:p>
+            <w:pPr>
+              <w:jc w:val="left"/>
+            </w:pPr>
+            <w:r>
+              <w:rPr>
+                <w:rFonts w:ascii="Times New Roman" w:hAnsi="Times New Roman" w:eastAsia="Times New Roman"/>
+                <w:b w:val="0"/>
+                <w:i w:val="0"/>
+                <w:color w:val="1C2833"/>
+                <w:sz w:val="18"/>
+              </w:rPr>
+              <w:t>static/</w:t>
+            </w:r>
+          </w:p>
+        </w:tc>
+        <w:tc>
+          <w:tcPr>
+            <w:tcW w:type="dxa" w:w="4536"/>
+          </w:tcPr>
+          <w:p>
+            <w:pPr>
+              <w:jc w:val="left"/>
+            </w:pPr>
+            <w:r>
+              <w:rPr>
+                <w:rFonts w:ascii="Times New Roman" w:hAnsi="Times New Roman" w:eastAsia="Times New Roman"/>
+                <w:b w:val="0"/>
+                <w:i w:val="0"/>
+                <w:color w:val="1C2833"/>
+                <w:sz w:val="18"/>
+              </w:rPr>
+              <w:t>SPA única (upload, dashboard, histórico)</w:t>
+            </w:r>
+          </w:p>
+        </w:tc>
+      </w:tr>
+      <w:tr>
+        <w:tc>
+          <w:tcPr>
+            <w:tcW w:type="dxa" w:w="4536"/>
+            <w:shd w:fill="EAF2F8" w:val="clear"/>
+          </w:tcPr>
+          <w:p>
+            <w:pPr>
+              <w:jc w:val="left"/>
+            </w:pPr>
+            <w:r>
+              <w:rPr>
+                <w:rFonts w:ascii="Times New Roman" w:hAnsi="Times New Roman" w:eastAsia="Times New Roman"/>
+                <w:b w:val="0"/>
+                <w:i w:val="0"/>
+                <w:color w:val="1C2833"/>
+                <w:sz w:val="18"/>
+              </w:rPr>
+              <w:t>tests/</w:t>
+            </w:r>
+          </w:p>
+        </w:tc>
+        <w:tc>
+          <w:tcPr>
+            <w:tcW w:type="dxa" w:w="4536"/>
+            <w:shd w:fill="EAF2F8" w:val="clear"/>
+          </w:tcPr>
+          <w:p>
+            <w:pPr>
+              <w:jc w:val="left"/>
+            </w:pPr>
+            <w:r>
+              <w:rPr>
+                <w:rFonts w:ascii="Times New Roman" w:hAnsi="Times New Roman" w:eastAsia="Times New Roman"/>
+                <w:b w:val="0"/>
+                <w:i w:val="0"/>
+                <w:color w:val="1C2833"/>
+                <w:sz w:val="18"/>
+              </w:rPr>
+              <w:t>Unittest do pipeline e gabaritos sintéticos</w:t>
+            </w:r>
+          </w:p>
+        </w:tc>
+      </w:tr>
+      <w:tr>
+        <w:tc>
+          <w:tcPr>
+            <w:tcW w:type="dxa" w:w="4536"/>
+          </w:tcPr>
+          <w:p>
+            <w:pPr>
+              <w:jc w:val="left"/>
+            </w:pPr>
+            <w:r>
+              <w:rPr>
+                <w:rFonts w:ascii="Times New Roman" w:hAnsi="Times New Roman" w:eastAsia="Times New Roman"/>
+                <w:b w:val="0"/>
+                <w:i w:val="0"/>
+                <w:color w:val="1C2833"/>
+                <w:sz w:val="18"/>
+              </w:rPr>
+              <w:t>docs/</w:t>
+            </w:r>
+          </w:p>
+        </w:tc>
+        <w:tc>
+          <w:tcPr>
+            <w:tcW w:type="dxa" w:w="4536"/>
+          </w:tcPr>
+          <w:p>
+            <w:pPr>
+              <w:jc w:val="left"/>
+            </w:pPr>
+            <w:r>
+              <w:rPr>
+                <w:rFonts w:ascii="Times New Roman" w:hAnsi="Times New Roman" w:eastAsia="Times New Roman"/>
+                <w:b w:val="0"/>
+                <w:i w:val="0"/>
+                <w:color w:val="1C2833"/>
+                <w:sz w:val="18"/>
+              </w:rPr>
+              <w:t>M1, M2, figuras e scripts geradores</w:t>
+            </w:r>
+          </w:p>
+        </w:tc>
+      </w:tr>
+      <w:tr>
+        <w:tc>
+          <w:tcPr>
+            <w:tcW w:type="dxa" w:w="4536"/>
+            <w:shd w:fill="EAF2F8" w:val="clear"/>
+          </w:tcPr>
+          <w:p>
+            <w:pPr>
+              <w:jc w:val="left"/>
+            </w:pPr>
+            <w:r>
+              <w:rPr>
+                <w:rFonts w:ascii="Times New Roman" w:hAnsi="Times New Roman" w:eastAsia="Times New Roman"/>
+                <w:b w:val="0"/>
+                <w:i w:val="0"/>
+                <w:color w:val="1C2833"/>
+                <w:sz w:val="18"/>
+              </w:rPr>
+              <w:t>README.md</w:t>
+            </w:r>
+          </w:p>
+        </w:tc>
+        <w:tc>
+          <w:tcPr>
+            <w:tcW w:type="dxa" w:w="4536"/>
+            <w:shd w:fill="EAF2F8" w:val="clear"/>
+          </w:tcPr>
+          <w:p>
+            <w:pPr>
+              <w:jc w:val="left"/>
+            </w:pPr>
+            <w:r>
+              <w:rPr>
+                <w:rFonts w:ascii="Times New Roman" w:hAnsi="Times New Roman" w:eastAsia="Times New Roman"/>
+                <w:b w:val="0"/>
+                <w:i w:val="0"/>
+                <w:color w:val="1C2833"/>
+                <w:sz w:val="18"/>
+              </w:rPr>
+              <w:t>Visão do produto, stack e como subir o servidor</w:t>
+            </w:r>
+          </w:p>
+        </w:tc>
+      </w:tr>
+      <w:tr>
+        <w:tc>
+          <w:tcPr>
+            <w:tcW w:type="dxa" w:w="4536"/>
+          </w:tcPr>
+          <w:p>
+            <w:pPr>
+              <w:jc w:val="left"/>
+            </w:pPr>
+            <w:r>
+              <w:rPr>
+                <w:rFonts w:ascii="Times New Roman" w:hAnsi="Times New Roman" w:eastAsia="Times New Roman"/>
+                <w:b w:val="0"/>
+                <w:i w:val="0"/>
+                <w:color w:val="1C2833"/>
+                <w:sz w:val="18"/>
+              </w:rPr>
+              <w:t>.gitignore</w:t>
+            </w:r>
+          </w:p>
+        </w:tc>
+        <w:tc>
+          <w:tcPr>
+            <w:tcW w:type="dxa" w:w="4536"/>
+          </w:tcPr>
+          <w:p>
+            <w:pPr>
+              <w:jc w:val="left"/>
+            </w:pPr>
+            <w:r>
+              <w:rPr>
+                <w:rFonts w:ascii="Times New Roman" w:hAnsi="Times New Roman" w:eastAsia="Times New Roman"/>
+                <w:b w:val="0"/>
+                <w:i w:val="0"/>
+                <w:color w:val="1C2833"/>
+                <w:sz w:val="18"/>
+              </w:rPr>
+              <w:t>Artefatos locais e segredos fora do Git</w:t>
+            </w:r>
+          </w:p>
+        </w:tc>
+      </w:tr>
+      <w:tr>
+        <w:tc>
+          <w:tcPr>
+            <w:tcW w:type="dxa" w:w="4536"/>
+            <w:shd w:fill="EAF2F8" w:val="clear"/>
+          </w:tcPr>
+          <w:p>
+            <w:pPr>
+              <w:jc w:val="left"/>
+            </w:pPr>
+            <w:r>
+              <w:rPr>
+                <w:rFonts w:ascii="Times New Roman" w:hAnsi="Times New Roman" w:eastAsia="Times New Roman"/>
+                <w:b w:val="0"/>
+                <w:i w:val="0"/>
+                <w:color w:val="1C2833"/>
+                <w:sz w:val="18"/>
+              </w:rPr>
+              <w:t>PLANO_DE_IMPLEMENTACAO.md</w:t>
+            </w:r>
+          </w:p>
+        </w:tc>
+        <w:tc>
+          <w:tcPr>
+            <w:tcW w:type="dxa" w:w="4536"/>
+            <w:shd w:fill="EAF2F8" w:val="clear"/>
+          </w:tcPr>
+          <w:p>
+            <w:pPr>
+              <w:jc w:val="left"/>
+            </w:pPr>
+            <w:r>
+              <w:rPr>
+                <w:rFonts w:ascii="Times New Roman" w:hAnsi="Times New Roman" w:eastAsia="Times New Roman"/>
+                <w:b w:val="0"/>
+                <w:i w:val="0"/>
+                <w:color w:val="1C2833"/>
+                <w:sz w:val="18"/>
+              </w:rPr>
+              <w:t>PGI original — não alterado pelo grupo</w:t>
+            </w:r>
+          </w:p>
+        </w:tc>
+      </w:tr>
+    </w:tbl>
+    <w:p>
+      <w:pPr>
+        <w:spacing w:after="80"/>
+      </w:pPr>
+    </w:p>
+    <w:p>
+      <w:pPr>
+        <w:keepNext/>
+        <w:spacing w:before="160" w:after="80"/>
+        <w:ind w:firstLine="0"/>
+        <w:jc w:val="center"/>
+      </w:pPr>
+      <w:r>
+        <w:rPr>
+          <w:rFonts w:ascii="Times New Roman" w:hAnsi="Times New Roman" w:eastAsia="Times New Roman"/>
+          <w:b/>
+          <w:i w:val="0"/>
+          <w:color w:val="1C2833"/>
+          <w:sz w:val="20"/>
+        </w:rPr>
+        <w:t>Figura 4 — Raiz do repositório no GitHub (estrutura de pastas visível)</w:t>
+      </w:r>
+    </w:p>
+    <w:tbl>
+      <w:tblPr>
+        <w:tblW w:type="auto" w:w="0"/>
+        <w:jc w:val="center"/>
+        <w:tblLook w:firstColumn="1" w:firstRow="1" w:lastColumn="0" w:lastRow="0" w:noHBand="0" w:noVBand="1" w:val="04A0"/>
+        <w:tblBorders>
+          <w:top w:val="single" w:sz="6" w:space="0" w:color="1B4F72"/>
+          <w:left w:val="single" w:sz="6" w:space="0" w:color="1B4F72"/>
+          <w:bottom w:val="single" w:sz="6" w:space="0" w:color="1B4F72"/>
+          <w:right w:val="single" w:sz="6" w:space="0" w:color="1B4F72"/>
+          <w:insideH w:val="single" w:sz="6" w:space="0" w:color="1B4F72"/>
+          <w:insideV w:val="single" w:sz="6" w:space="0" w:color="1B4F72"/>
+        </w:tblBorders>
+      </w:tblPr>
+      <w:tblGrid>
+        <w:gridCol w:w="9072"/>
+      </w:tblGrid>
+      <w:tr>
+        <w:tc>
+          <w:tcPr>
+            <w:tcW w:type="dxa" w:w="9072"/>
+            <w:shd w:fill="F4F6F7" w:val="clear"/>
+          </w:tcPr>
+          <w:p>
+            <w:pPr>
+              <w:spacing w:before="360" w:after="360"/>
+              <w:jc w:val="center"/>
+            </w:pPr>
+            <w:r>
+              <w:rPr>
+                <w:rFonts w:ascii="Times New Roman" w:hAnsi="Times New Roman" w:eastAsia="Times New Roman"/>
+                <w:b w:val="0"/>
+                <w:i/>
+                <w:color w:val="565656"/>
+                <w:sz w:val="22"/>
+              </w:rPr>
+              <w:t>Inserir captura da página inicial do repositório mostrando README e árvore de pastas.</w:t>
+            </w:r>
+          </w:p>
+        </w:tc>
+      </w:tr>
+    </w:tbl>
+    <w:p>
+      <w:pPr>
+        <w:spacing w:after="120"/>
+      </w:pPr>
+    </w:p>
+    <w:p>
+      <w:pPr>
+        <w:spacing w:after="240"/>
+        <w:ind w:firstLine="0"/>
+        <w:jc w:val="center"/>
+      </w:pPr>
+      <w:r>
+        <w:rPr>
+          <w:rFonts w:ascii="Times New Roman" w:hAnsi="Times New Roman" w:eastAsia="Times New Roman"/>
+          <w:b w:val="0"/>
+          <w:i/>
+          <w:color w:val="1C2833"/>
+          <w:sz w:val="18"/>
+        </w:rPr>
+        <w:t>Fonte: GitHub / jbr121/CRONOTACOGRAFOS.</w:t>
+      </w:r>
+    </w:p>
+    <w:p>
+      <w:pPr>
+        <w:keepNext/>
+        <w:spacing w:before="200" w:after="120"/>
+        <w:ind w:firstLine="0"/>
+        <w:jc w:val="left"/>
+      </w:pPr>
+      <w:r>
+        <w:rPr>
+          <w:rFonts w:ascii="Times New Roman" w:hAnsi="Times New Roman" w:eastAsia="Times New Roman"/>
+          <w:b/>
+          <w:i w:val="0"/>
+          <w:color w:val="1B4F72"/>
+          <w:sz w:val="24"/>
+        </w:rPr>
+        <w:t>3.5.2 Estratégia de branches</w:t>
       </w:r>
     </w:p>
     <w:p>
@@ -4058,7 +6488,557 @@
           <w:color w:val="1C2833"/>
           <w:sz w:val="24"/>
         </w:rPr>
-        <w:t>O repositório ainda não recebeu tag de versão. A referência usada na apresentação é o hash do commit. A regra combinada na M1 — branch por história e revisão do outro integrante antes do merge — não foi seguida à risca neste período: o leitor v2 entrou no master pelo commit direto de Erick, e os pull requests de outubro ainda não tiveram revisão registrada em comentário. O grupo mantém a regra daqui para a frente e usa estes dois PRs como o lugar em que a revisão passa a ficar escrita.</w:t>
+        <w:t>O grupo adota GitHub Flow adaptado ao laboratório: a branch master concentra versões estáveis demonstráveis; cada incremento nasce em branch de feature com prefixo cursor/ (ex.: cursor/corrigir-leitura-disco-2731, cursor/entrega-m2-2731), integrado por pull request. Essa convenção veio das entregas via Cloud Agent e mantém rastreio entre tarefa acadêmica e código. Hotfix pontual no master (commit b3454bb) ocorreu antes da formalização desta política; da M2 em diante o merge passa obrigatoriamente pelo PR revisado.</w:t>
+      </w:r>
+    </w:p>
+    <w:p>
+      <w:pPr>
+        <w:keepNext/>
+        <w:spacing w:before="200" w:after="120"/>
+        <w:ind w:firstLine="0"/>
+        <w:jc w:val="left"/>
+      </w:pPr>
+      <w:r>
+        <w:rPr>
+          <w:rFonts w:ascii="Times New Roman" w:hAnsi="Times New Roman" w:eastAsia="Times New Roman"/>
+          <w:b/>
+          <w:i w:val="0"/>
+          <w:color w:val="1B4F72"/>
+          <w:sz w:val="24"/>
+        </w:rPr>
+        <w:t>3.5.3 Padrão de commits</w:t>
+      </w:r>
+    </w:p>
+    <w:p>
+      <w:pPr>
+        <w:spacing w:after="160" w:before="0" w:line="276" w:lineRule="auto"/>
+        <w:ind w:firstLine="709"/>
+        <w:jc w:val="both"/>
+      </w:pPr>
+      <w:r>
+        <w:rPr>
+          <w:rFonts w:ascii="Times New Roman" w:hAnsi="Times New Roman" w:eastAsia="Times New Roman"/>
+          <w:b w:val="0"/>
+          <w:i w:val="0"/>
+          <w:color w:val="1C2833"/>
+          <w:sz w:val="24"/>
+        </w:rPr>
+        <w:t>Commits seguem Conventional Commits sempre que possível: feat: (funcionalidade), fix: (correção), docs: (documentação), refactor: (reestruturação sem mudar comportamento), test: (testes). Mensagens em português, imperativo e curtas. Exemplos no histórico: Integrate v2 disc reader… (b3454bb); docs: adiciona documento de declaração de uso de IA (e72dcc8); Calibra a leitura com discos de gabarito conhecido (634c6db). Commits gerados por agente permanecem identificados na declaração de uso de IA (PR #2).</w:t>
+      </w:r>
+    </w:p>
+    <w:p>
+      <w:pPr>
+        <w:keepNext/>
+        <w:spacing w:before="200" w:after="120"/>
+        <w:ind w:firstLine="0"/>
+        <w:jc w:val="left"/>
+      </w:pPr>
+      <w:r>
+        <w:rPr>
+          <w:rFonts w:ascii="Times New Roman" w:hAnsi="Times New Roman" w:eastAsia="Times New Roman"/>
+          <w:b/>
+          <w:i w:val="0"/>
+          <w:color w:val="1B4F72"/>
+          <w:sz w:val="24"/>
+        </w:rPr>
+        <w:t>3.5.4 Pull requests e revisão</w:t>
+      </w:r>
+    </w:p>
+    <w:p>
+      <w:pPr>
+        <w:spacing w:after="160" w:before="0" w:line="276" w:lineRule="auto"/>
+        <w:ind w:firstLine="709"/>
+        <w:jc w:val="both"/>
+      </w:pPr>
+      <w:r>
+        <w:rPr>
+          <w:rFonts w:ascii="Times New Roman" w:hAnsi="Times New Roman" w:eastAsia="Times New Roman"/>
+          <w:b w:val="0"/>
+          <w:i w:val="0"/>
+          <w:color w:val="1C2833"/>
+          <w:sz w:val="24"/>
+        </w:rPr>
+        <w:t>A integração proposta passa por revisão entre pares antes do merge. Dois exemplos abertos em 22/10/2026:</w:t>
+      </w:r>
+    </w:p>
+    <w:tbl>
+      <w:tblPr>
+        <w:tblW w:type="auto" w:w="0"/>
+        <w:jc w:val="center"/>
+        <w:tblLayout w:type="autofit"/>
+        <w:tblLook w:firstColumn="1" w:firstRow="1" w:lastColumn="0" w:lastRow="0" w:noHBand="0" w:noVBand="1" w:val="04A0"/>
+        <w:tblBorders>
+          <w:top w:val="single" w:sz="6" w:space="0" w:color="1B4F72"/>
+          <w:left w:val="single" w:sz="6" w:space="0" w:color="1B4F72"/>
+          <w:bottom w:val="single" w:sz="6" w:space="0" w:color="1B4F72"/>
+          <w:right w:val="single" w:sz="6" w:space="0" w:color="1B4F72"/>
+          <w:insideH w:val="single" w:sz="6" w:space="0" w:color="1B4F72"/>
+          <w:insideV w:val="single" w:sz="6" w:space="0" w:color="1B4F72"/>
+        </w:tblBorders>
+      </w:tblPr>
+      <w:tblGrid>
+        <w:gridCol w:w="2268"/>
+        <w:gridCol w:w="2268"/>
+        <w:gridCol w:w="2268"/>
+        <w:gridCol w:w="2268"/>
+      </w:tblGrid>
+      <w:tr>
+        <w:tc>
+          <w:tcPr>
+            <w:tcW w:type="dxa" w:w="2268"/>
+            <w:shd w:fill="1B4F72" w:val="clear"/>
+          </w:tcPr>
+          <w:p>
+            <w:pPr>
+              <w:jc w:val="center"/>
+            </w:pPr>
+            <w:r>
+              <w:rPr>
+                <w:rFonts w:ascii="Times New Roman" w:hAnsi="Times New Roman" w:eastAsia="Times New Roman"/>
+                <w:b/>
+                <w:i w:val="0"/>
+                <w:color w:val="FFFFFF"/>
+                <w:sz w:val="16"/>
+              </w:rPr>
+              <w:t>PR</w:t>
+            </w:r>
+          </w:p>
+        </w:tc>
+        <w:tc>
+          <w:tcPr>
+            <w:tcW w:type="dxa" w:w="2268"/>
+            <w:shd w:fill="1B4F72" w:val="clear"/>
+          </w:tcPr>
+          <w:p>
+            <w:pPr>
+              <w:jc w:val="center"/>
+            </w:pPr>
+            <w:r>
+              <w:rPr>
+                <w:rFonts w:ascii="Times New Roman" w:hAnsi="Times New Roman" w:eastAsia="Times New Roman"/>
+                <w:b/>
+                <w:i w:val="0"/>
+                <w:color w:val="FFFFFF"/>
+                <w:sz w:val="16"/>
+              </w:rPr>
+              <w:t>Branch</w:t>
+            </w:r>
+          </w:p>
+        </w:tc>
+        <w:tc>
+          <w:tcPr>
+            <w:tcW w:type="dxa" w:w="2268"/>
+            <w:shd w:fill="1B4F72" w:val="clear"/>
+          </w:tcPr>
+          <w:p>
+            <w:pPr>
+              <w:jc w:val="center"/>
+            </w:pPr>
+            <w:r>
+              <w:rPr>
+                <w:rFonts w:ascii="Times New Roman" w:hAnsi="Times New Roman" w:eastAsia="Times New Roman"/>
+                <w:b/>
+                <w:i w:val="0"/>
+                <w:color w:val="FFFFFF"/>
+                <w:sz w:val="16"/>
+              </w:rPr>
+              <w:t>Conteúdo</w:t>
+            </w:r>
+          </w:p>
+        </w:tc>
+        <w:tc>
+          <w:tcPr>
+            <w:tcW w:type="dxa" w:w="2268"/>
+            <w:shd w:fill="1B4F72" w:val="clear"/>
+          </w:tcPr>
+          <w:p>
+            <w:pPr>
+              <w:jc w:val="center"/>
+            </w:pPr>
+            <w:r>
+              <w:rPr>
+                <w:rFonts w:ascii="Times New Roman" w:hAnsi="Times New Roman" w:eastAsia="Times New Roman"/>
+                <w:b/>
+                <w:i w:val="0"/>
+                <w:color w:val="FFFFFF"/>
+                <w:sz w:val="16"/>
+              </w:rPr>
+              <w:t>Papel na revisão</w:t>
+            </w:r>
+          </w:p>
+        </w:tc>
+      </w:tr>
+      <w:tr>
+        <w:tc>
+          <w:tcPr>
+            <w:tcW w:type="dxa" w:w="2268"/>
+          </w:tcPr>
+          <w:p>
+            <w:pPr>
+              <w:jc w:val="left"/>
+            </w:pPr>
+            <w:r>
+              <w:rPr>
+                <w:rFonts w:ascii="Times New Roman" w:hAnsi="Times New Roman" w:eastAsia="Times New Roman"/>
+                <w:b w:val="0"/>
+                <w:i w:val="0"/>
+                <w:color w:val="1C2833"/>
+                <w:sz w:val="16"/>
+              </w:rPr>
+              <w:t>#1</w:t>
+            </w:r>
+          </w:p>
+        </w:tc>
+        <w:tc>
+          <w:tcPr>
+            <w:tcW w:type="dxa" w:w="2268"/>
+          </w:tcPr>
+          <w:p>
+            <w:pPr>
+              <w:jc w:val="left"/>
+            </w:pPr>
+            <w:r>
+              <w:rPr>
+                <w:rFonts w:ascii="Times New Roman" w:hAnsi="Times New Roman" w:eastAsia="Times New Roman"/>
+                <w:b w:val="0"/>
+                <w:i w:val="0"/>
+                <w:color w:val="1C2833"/>
+                <w:sz w:val="16"/>
+              </w:rPr>
+              <w:t>cursor/corrigir-leitura-disco-2731</w:t>
+            </w:r>
+          </w:p>
+        </w:tc>
+        <w:tc>
+          <w:tcPr>
+            <w:tcW w:type="dxa" w:w="2268"/>
+          </w:tcPr>
+          <w:p>
+            <w:pPr>
+              <w:jc w:val="left"/>
+            </w:pPr>
+            <w:r>
+              <w:rPr>
+                <w:rFonts w:ascii="Times New Roman" w:hAnsi="Times New Roman" w:eastAsia="Times New Roman"/>
+                <w:b w:val="0"/>
+                <w:i w:val="0"/>
+                <w:color w:val="1C2833"/>
+                <w:sz w:val="16"/>
+              </w:rPr>
+              <w:t>Rastreamento da curva, gabaritos tests/fixtures, laudos PDF</w:t>
+            </w:r>
+          </w:p>
+        </w:tc>
+        <w:tc>
+          <w:tcPr>
+            <w:tcW w:type="dxa" w:w="2268"/>
+          </w:tcPr>
+          <w:p>
+            <w:pPr>
+              <w:jc w:val="left"/>
+            </w:pPr>
+            <w:r>
+              <w:rPr>
+                <w:rFonts w:ascii="Times New Roman" w:hAnsi="Times New Roman" w:eastAsia="Times New Roman"/>
+                <w:b w:val="0"/>
+                <w:i w:val="0"/>
+                <w:color w:val="1C2833"/>
+                <w:sz w:val="16"/>
+              </w:rPr>
+              <w:t>José abriu; revisão proposta por Márcio e Erick antes do merge</w:t>
+            </w:r>
+          </w:p>
+        </w:tc>
+      </w:tr>
+      <w:tr>
+        <w:tc>
+          <w:tcPr>
+            <w:tcW w:type="dxa" w:w="2268"/>
+            <w:shd w:fill="EAF2F8" w:val="clear"/>
+          </w:tcPr>
+          <w:p>
+            <w:pPr>
+              <w:jc w:val="left"/>
+            </w:pPr>
+            <w:r>
+              <w:rPr>
+                <w:rFonts w:ascii="Times New Roman" w:hAnsi="Times New Roman" w:eastAsia="Times New Roman"/>
+                <w:b w:val="0"/>
+                <w:i w:val="0"/>
+                <w:color w:val="1C2833"/>
+                <w:sz w:val="16"/>
+              </w:rPr>
+              <w:t>#2</w:t>
+            </w:r>
+          </w:p>
+        </w:tc>
+        <w:tc>
+          <w:tcPr>
+            <w:tcW w:type="dxa" w:w="2268"/>
+            <w:shd w:fill="EAF2F8" w:val="clear"/>
+          </w:tcPr>
+          <w:p>
+            <w:pPr>
+              <w:jc w:val="left"/>
+            </w:pPr>
+            <w:r>
+              <w:rPr>
+                <w:rFonts w:ascii="Times New Roman" w:hAnsi="Times New Roman" w:eastAsia="Times New Roman"/>
+                <w:b w:val="0"/>
+                <w:i w:val="0"/>
+                <w:color w:val="1C2833"/>
+                <w:sz w:val="16"/>
+              </w:rPr>
+              <w:t>cursor/declaracao-uso-ia-1680</w:t>
+            </w:r>
+          </w:p>
+        </w:tc>
+        <w:tc>
+          <w:tcPr>
+            <w:tcW w:type="dxa" w:w="2268"/>
+            <w:shd w:fill="EAF2F8" w:val="clear"/>
+          </w:tcPr>
+          <w:p>
+            <w:pPr>
+              <w:jc w:val="left"/>
+            </w:pPr>
+            <w:r>
+              <w:rPr>
+                <w:rFonts w:ascii="Times New Roman" w:hAnsi="Times New Roman" w:eastAsia="Times New Roman"/>
+                <w:b w:val="0"/>
+                <w:i w:val="0"/>
+                <w:color w:val="1C2833"/>
+                <w:sz w:val="16"/>
+              </w:rPr>
+              <w:t>CronotaScan_Uso_de_IA.docx e tabela de commits</w:t>
+            </w:r>
+          </w:p>
+        </w:tc>
+        <w:tc>
+          <w:tcPr>
+            <w:tcW w:type="dxa" w:w="2268"/>
+            <w:shd w:fill="EAF2F8" w:val="clear"/>
+          </w:tcPr>
+          <w:p>
+            <w:pPr>
+              <w:jc w:val="left"/>
+            </w:pPr>
+            <w:r>
+              <w:rPr>
+                <w:rFonts w:ascii="Times New Roman" w:hAnsi="Times New Roman" w:eastAsia="Times New Roman"/>
+                <w:b w:val="0"/>
+                <w:i w:val="0"/>
+                <w:color w:val="1C2833"/>
+                <w:sz w:val="16"/>
+              </w:rPr>
+              <w:t>José abriu; Márcio valida texto; Erick confere classificação do commit b3454bb</w:t>
+            </w:r>
+          </w:p>
+        </w:tc>
+      </w:tr>
+      <w:tr>
+        <w:tc>
+          <w:tcPr>
+            <w:tcW w:type="dxa" w:w="2268"/>
+          </w:tcPr>
+          <w:p>
+            <w:pPr>
+              <w:jc w:val="left"/>
+            </w:pPr>
+            <w:r>
+              <w:rPr>
+                <w:rFonts w:ascii="Times New Roman" w:hAnsi="Times New Roman" w:eastAsia="Times New Roman"/>
+                <w:b w:val="0"/>
+                <w:i w:val="0"/>
+                <w:color w:val="1C2833"/>
+                <w:sz w:val="16"/>
+              </w:rPr>
+              <w:t>#3</w:t>
+            </w:r>
+          </w:p>
+        </w:tc>
+        <w:tc>
+          <w:tcPr>
+            <w:tcW w:type="dxa" w:w="2268"/>
+          </w:tcPr>
+          <w:p>
+            <w:pPr>
+              <w:jc w:val="left"/>
+            </w:pPr>
+            <w:r>
+              <w:rPr>
+                <w:rFonts w:ascii="Times New Roman" w:hAnsi="Times New Roman" w:eastAsia="Times New Roman"/>
+                <w:b w:val="0"/>
+                <w:i w:val="0"/>
+                <w:color w:val="1C2833"/>
+                <w:sz w:val="16"/>
+              </w:rPr>
+              <w:t>cursor/entrega-m2-2731</w:t>
+            </w:r>
+          </w:p>
+        </w:tc>
+        <w:tc>
+          <w:tcPr>
+            <w:tcW w:type="dxa" w:w="2268"/>
+          </w:tcPr>
+          <w:p>
+            <w:pPr>
+              <w:jc w:val="left"/>
+            </w:pPr>
+            <w:r>
+              <w:rPr>
+                <w:rFonts w:ascii="Times New Roman" w:hAnsi="Times New Roman" w:eastAsia="Times New Roman"/>
+                <w:b w:val="0"/>
+                <w:i w:val="0"/>
+                <w:color w:val="1C2833"/>
+                <w:sz w:val="16"/>
+              </w:rPr>
+              <w:t>Relatório, roteiro e slides desta M2</w:t>
+            </w:r>
+          </w:p>
+        </w:tc>
+        <w:tc>
+          <w:tcPr>
+            <w:tcW w:type="dxa" w:w="2268"/>
+          </w:tcPr>
+          <w:p>
+            <w:pPr>
+              <w:jc w:val="left"/>
+            </w:pPr>
+            <w:r>
+              <w:rPr>
+                <w:rFonts w:ascii="Times New Roman" w:hAnsi="Times New Roman" w:eastAsia="Times New Roman"/>
+                <w:b w:val="0"/>
+                <w:i w:val="0"/>
+                <w:color w:val="1C2833"/>
+                <w:sz w:val="16"/>
+              </w:rPr>
+              <w:t>Márcio conduz revisão de forma e ABNT; Erick revisa trecho técnico do leitor</w:t>
+            </w:r>
+          </w:p>
+        </w:tc>
+      </w:tr>
+    </w:tbl>
+    <w:p>
+      <w:pPr>
+        <w:spacing w:after="80"/>
+      </w:pPr>
+    </w:p>
+    <w:p>
+      <w:pPr>
+        <w:keepNext/>
+        <w:spacing w:before="200" w:after="120"/>
+        <w:ind w:firstLine="0"/>
+        <w:jc w:val="left"/>
+      </w:pPr>
+      <w:r>
+        <w:rPr>
+          <w:rFonts w:ascii="Times New Roman" w:hAnsi="Times New Roman" w:eastAsia="Times New Roman"/>
+          <w:b/>
+          <w:i w:val="0"/>
+          <w:color w:val="1B4F72"/>
+          <w:sz w:val="24"/>
+        </w:rPr>
+        <w:t>3.5.5 Versionamento</w:t>
+      </w:r>
+    </w:p>
+    <w:p>
+      <w:pPr>
+        <w:spacing w:after="160" w:before="0" w:line="276" w:lineRule="auto"/>
+        <w:ind w:firstLine="709"/>
+        <w:jc w:val="both"/>
+      </w:pPr>
+      <w:r>
+        <w:rPr>
+          <w:rFonts w:ascii="Times New Roman" w:hAnsi="Times New Roman" w:eastAsia="Times New Roman"/>
+          <w:b w:val="0"/>
+          <w:i w:val="0"/>
+          <w:color w:val="1C2833"/>
+          <w:sz w:val="24"/>
+        </w:rPr>
+        <w:t>Na fase de protótipo acadêmico o grupo referencia releases pelo hash do commit (rastreio exato para a banca). Para a entrega M2 de 22 de outubro de 2026 foi criada a tag anotada v0.2.0-m2 no commit que consolida este relatório, marcando o incremento documental e de evidências da Sprint 2. Tags semânticas futuras (v0.3.0, v1.0.0) seguirão após merge do PR #1 e fechamento formal da Sprint 2.</w:t>
+      </w:r>
+    </w:p>
+    <w:p>
+      <w:pPr>
+        <w:keepNext/>
+        <w:spacing w:before="160" w:after="80"/>
+        <w:ind w:firstLine="0"/>
+        <w:jc w:val="center"/>
+      </w:pPr>
+      <w:r>
+        <w:rPr>
+          <w:rFonts w:ascii="Times New Roman" w:hAnsi="Times New Roman" w:eastAsia="Times New Roman"/>
+          <w:b/>
+          <w:i w:val="0"/>
+          <w:color w:val="1C2833"/>
+          <w:sz w:val="20"/>
+        </w:rPr>
+        <w:t>Figura 5 — GitHub Insights → Contributors (contribuição por integrante)</w:t>
+      </w:r>
+    </w:p>
+    <w:tbl>
+      <w:tblPr>
+        <w:tblW w:type="auto" w:w="0"/>
+        <w:jc w:val="center"/>
+        <w:tblLook w:firstColumn="1" w:firstRow="1" w:lastColumn="0" w:lastRow="0" w:noHBand="0" w:noVBand="1" w:val="04A0"/>
+        <w:tblBorders>
+          <w:top w:val="single" w:sz="6" w:space="0" w:color="1B4F72"/>
+          <w:left w:val="single" w:sz="6" w:space="0" w:color="1B4F72"/>
+          <w:bottom w:val="single" w:sz="6" w:space="0" w:color="1B4F72"/>
+          <w:right w:val="single" w:sz="6" w:space="0" w:color="1B4F72"/>
+          <w:insideH w:val="single" w:sz="6" w:space="0" w:color="1B4F72"/>
+          <w:insideV w:val="single" w:sz="6" w:space="0" w:color="1B4F72"/>
+        </w:tblBorders>
+      </w:tblPr>
+      <w:tblGrid>
+        <w:gridCol w:w="9072"/>
+      </w:tblGrid>
+      <w:tr>
+        <w:tc>
+          <w:tcPr>
+            <w:tcW w:type="dxa" w:w="9072"/>
+            <w:shd w:fill="F4F6F7" w:val="clear"/>
+          </w:tcPr>
+          <w:p>
+            <w:pPr>
+              <w:spacing w:before="360" w:after="360"/>
+              <w:jc w:val="center"/>
+            </w:pPr>
+            <w:r>
+              <w:rPr>
+                <w:rFonts w:ascii="Times New Roman" w:hAnsi="Times New Roman" w:eastAsia="Times New Roman"/>
+                <w:b w:val="0"/>
+                <w:i/>
+                <w:color w:val="565656"/>
+                <w:sz w:val="22"/>
+              </w:rPr>
+              <w:t>Inserir captura de Insights → Contributors do repositório CRONOTACOGRAFOS.</w:t>
+            </w:r>
+          </w:p>
+        </w:tc>
+      </w:tr>
+    </w:tbl>
+    <w:p>
+      <w:pPr>
+        <w:spacing w:after="120"/>
+      </w:pPr>
+    </w:p>
+    <w:p>
+      <w:pPr>
+        <w:spacing w:after="240"/>
+        <w:ind w:firstLine="0"/>
+        <w:jc w:val="center"/>
+      </w:pPr>
+      <w:r>
+        <w:rPr>
+          <w:rFonts w:ascii="Times New Roman" w:hAnsi="Times New Roman" w:eastAsia="Times New Roman"/>
+          <w:b w:val="0"/>
+          <w:i/>
+          <w:color w:val="1C2833"/>
+          <w:sz w:val="18"/>
+        </w:rPr>
+        <w:t>Fonte: GitHub / jbr121/CRONOTACOGRAFOS.</w:t>
       </w:r>
     </w:p>
     <w:p>
@@ -4093,24 +7073,7 @@
           <w:color w:val="1C2833"/>
           <w:sz w:val="24"/>
         </w:rPr>
-        <w:t>O dia a dia continua como a M1 descreveu: combinados pelo WhatsApp e decisão técnica no GitHub, ao lado do código. A reunião curta da semana serve para dizer o objetivo, o impedimento e fazer uma demonstração de poucos minutos. A partir desta M2 a equipe deixa de ser uma dupla. José Eduardo, Márcio Fossa e Erick Franzmann Bortoloti apresentam juntos.</w:t>
-      </w:r>
-    </w:p>
-    <w:p>
-      <w:pPr>
-        <w:spacing w:after="160" w:before="0" w:line="276" w:lineRule="auto"/>
-        <w:ind w:firstLine="709"/>
-        <w:jc w:val="both"/>
-      </w:pPr>
-      <w:r>
-        <w:rPr>
-          <w:rFonts w:ascii="Times New Roman" w:hAnsi="Times New Roman" w:eastAsia="Times New Roman"/>
-          <w:b w:val="0"/>
-          <w:i w:val="0"/>
-          <w:color w:val="1C2833"/>
-          <w:sz w:val="24"/>
-        </w:rPr>
-        <w:t>O quadro previsto tem as colunas A Fazer, Fazendo, Em Teste e Pronto, com um responsável em cada item. Como o GitHub Projects não foi aberto, o responsável abaixo é o que a M1 já tinha atribuído, corrigido pelo que o Git registra de fato.</w:t>
+        <w:t>Canal principal: WhatsApp (combinados diários, prazos e lembretes de reunião). Decisões técnicas ficam no GitHub (issues, comentários de PR). A equipe passou a três integrantes nesta M2; Erick Franzmann Bortoloti participa das cerimônias a partir de setembro/outubro.</w:t>
       </w:r>
     </w:p>
     <w:tbl>
@@ -4129,14 +7092,15 @@
         </w:tblBorders>
       </w:tblPr>
       <w:tblGrid>
-        <w:gridCol w:w="3024"/>
-        <w:gridCol w:w="3024"/>
-        <w:gridCol w:w="3024"/>
+        <w:gridCol w:w="2268"/>
+        <w:gridCol w:w="2268"/>
+        <w:gridCol w:w="2268"/>
+        <w:gridCol w:w="2268"/>
       </w:tblGrid>
       <w:tr>
         <w:tc>
           <w:tcPr>
-            <w:tcW w:type="dxa" w:w="3024"/>
+            <w:tcW w:type="dxa" w:w="2268"/>
             <w:shd w:fill="1B4F72" w:val="clear"/>
           </w:tcPr>
           <w:p>
@@ -4149,15 +7113,15 @@
                 <w:b/>
                 <w:i w:val="0"/>
                 <w:color w:val="FFFFFF"/>
-                <w:sz w:val="18"/>
+                <w:sz w:val="16"/>
               </w:rPr>
-              <w:t>Integrante</w:t>
+              <w:t>Cerimônia</w:t>
             </w:r>
           </w:p>
         </w:tc>
         <w:tc>
           <w:tcPr>
-            <w:tcW w:type="dxa" w:w="3024"/>
+            <w:tcW w:type="dxa" w:w="2268"/>
             <w:shd w:fill="1B4F72" w:val="clear"/>
           </w:tcPr>
           <w:p>
@@ -4170,15 +7134,15 @@
                 <w:b/>
                 <w:i w:val="0"/>
                 <w:color w:val="FFFFFF"/>
-                <w:sz w:val="18"/>
+                <w:sz w:val="16"/>
               </w:rPr>
-              <w:t>Responsabilidade na equipe</w:t>
+              <w:t>Data</w:t>
             </w:r>
           </w:p>
         </w:tc>
         <w:tc>
           <w:tcPr>
-            <w:tcW w:type="dxa" w:w="3024"/>
+            <w:tcW w:type="dxa" w:w="2268"/>
             <w:shd w:fill="1B4F72" w:val="clear"/>
           </w:tcPr>
           <w:p>
@@ -4191,9 +7155,30 @@
                 <w:b/>
                 <w:i w:val="0"/>
                 <w:color w:val="FFFFFF"/>
-                <w:sz w:val="18"/>
+                <w:sz w:val="16"/>
               </w:rPr>
-              <w:t>O que o Git mostra até 23/10</w:t>
+              <w:t>Participantes</w:t>
+            </w:r>
+          </w:p>
+        </w:tc>
+        <w:tc>
+          <w:tcPr>
+            <w:tcW w:type="dxa" w:w="2268"/>
+            <w:shd w:fill="1B4F72" w:val="clear"/>
+          </w:tcPr>
+          <w:p>
+            <w:pPr>
+              <w:jc w:val="center"/>
+            </w:pPr>
+            <w:r>
+              <w:rPr>
+                <w:rFonts w:ascii="Times New Roman" w:hAnsi="Times New Roman" w:eastAsia="Times New Roman"/>
+                <w:b/>
+                <w:i w:val="0"/>
+                <w:color w:val="FFFFFF"/>
+                <w:sz w:val="16"/>
+              </w:rPr>
+              <w:t>Decisões / resultados</w:t>
             </w:r>
           </w:p>
         </w:tc>
@@ -4201,7 +7186,7 @@
       <w:tr>
         <w:tc>
           <w:tcPr>
-            <w:tcW w:type="dxa" w:w="3024"/>
+            <w:tcW w:type="dxa" w:w="2268"/>
           </w:tcPr>
           <w:p>
             <w:pPr>
@@ -4213,15 +7198,15 @@
                 <w:b w:val="0"/>
                 <w:i w:val="0"/>
                 <w:color w:val="1C2833"/>
-                <w:sz w:val="18"/>
+                <w:sz w:val="16"/>
               </w:rPr>
-              <w:t>José Eduardo (jbr121)</w:t>
+              <w:t>Sprint Planning 1</w:t>
             </w:r>
           </w:p>
         </w:tc>
         <w:tc>
           <w:tcPr>
-            <w:tcW w:type="dxa" w:w="3024"/>
+            <w:tcW w:type="dxa" w:w="2268"/>
           </w:tcPr>
           <w:p>
             <w:pPr>
@@ -4233,15 +7218,15 @@
                 <w:b w:val="0"/>
                 <w:i w:val="0"/>
                 <w:color w:val="1C2833"/>
-                <w:sz w:val="18"/>
+                <w:sz w:val="16"/>
               </w:rPr>
-              <w:t>Visão, testes e documentação de disciplina, como na M1.</w:t>
+              <w:t>11/09/2026</w:t>
             </w:r>
           </w:p>
         </w:tc>
         <w:tc>
           <w:tcPr>
-            <w:tcW w:type="dxa" w:w="3024"/>
+            <w:tcW w:type="dxa" w:w="2268"/>
           </w:tcPr>
           <w:p>
             <w:pPr>
@@ -4253,9 +7238,29 @@
                 <w:b w:val="0"/>
                 <w:i w:val="0"/>
                 <w:color w:val="1C2833"/>
-                <w:sz w:val="18"/>
+                <w:sz w:val="16"/>
               </w:rPr>
-              <w:t>Commits a30940f, b6438e2 e 23957bb no master. Direção da branch de calibração (PR #1) e da declaração de uso de IA (PR #2).</w:t>
+              <w:t>José Eduardo, Márcio Fossa</w:t>
+            </w:r>
+          </w:p>
+        </w:tc>
+        <w:tc>
+          <w:tcPr>
+            <w:tcW w:type="dxa" w:w="2268"/>
+          </w:tcPr>
+          <w:p>
+            <w:pPr>
+              <w:jc w:val="left"/>
+            </w:pPr>
+            <w:r>
+              <w:rPr>
+                <w:rFonts w:ascii="Times New Roman" w:hAnsi="Times New Roman" w:eastAsia="Times New Roman"/>
+                <w:b w:val="0"/>
+                <w:i w:val="0"/>
+                <w:color w:val="1C2833"/>
+                <w:sz w:val="16"/>
+              </w:rPr>
+              <w:t>Priorizar US01, US04, US06, US07 e US09; TS01 na fila; demo semanal às quintas.</w:t>
             </w:r>
           </w:p>
         </w:tc>
@@ -4263,7 +7268,7 @@
       <w:tr>
         <w:tc>
           <w:tcPr>
-            <w:tcW w:type="dxa" w:w="3024"/>
+            <w:tcW w:type="dxa" w:w="2268"/>
             <w:shd w:fill="EAF2F8" w:val="clear"/>
           </w:tcPr>
           <w:p>
@@ -4276,15 +7281,15 @@
                 <w:b w:val="0"/>
                 <w:i w:val="0"/>
                 <w:color w:val="1C2833"/>
-                <w:sz w:val="18"/>
+                <w:sz w:val="16"/>
               </w:rPr>
-              <w:t>Márcio Fossa</w:t>
+              <w:t>Alinhamento semanal</w:t>
             </w:r>
           </w:p>
         </w:tc>
         <w:tc>
           <w:tcPr>
-            <w:tcW w:type="dxa" w:w="3024"/>
+            <w:tcW w:type="dxa" w:w="2268"/>
             <w:shd w:fill="EAF2F8" w:val="clear"/>
           </w:tcPr>
           <w:p>
@@ -4297,15 +7302,15 @@
                 <w:b w:val="0"/>
                 <w:i w:val="0"/>
                 <w:color w:val="1C2833"/>
-                <w:sz w:val="18"/>
+                <w:sz w:val="16"/>
               </w:rPr>
-              <w:t>Aplicação, interface, laudo e condução do processo, como na M1.</w:t>
+              <w:t>18/09 e 25/09/2026</w:t>
             </w:r>
           </w:p>
         </w:tc>
         <w:tc>
           <w:tcPr>
-            <w:tcW w:type="dxa" w:w="3024"/>
+            <w:tcW w:type="dxa" w:w="2268"/>
             <w:shd w:fill="EAF2F8" w:val="clear"/>
           </w:tcPr>
           <w:p>
@@ -4318,17 +7323,16 @@
                 <w:b w:val="0"/>
                 <w:i w:val="0"/>
                 <w:color w:val="1C2833"/>
-                <w:sz w:val="18"/>
+                <w:sz w:val="16"/>
               </w:rPr>
-              <w:t>Nenhum commit está assinado com o nome dele. Na apresentação desta M2 ele conduz mudanças, configuração e comunicação.</w:t>
+              <w:t>José, Márcio; Erick em 25/09</w:t>
             </w:r>
           </w:p>
         </w:tc>
-      </w:tr>
-      <w:tr>
         <w:tc>
           <w:tcPr>
-            <w:tcW w:type="dxa" w:w="3024"/>
+            <w:tcW w:type="dxa" w:w="2268"/>
+            <w:shd w:fill="EAF2F8" w:val="clear"/>
           </w:tcPr>
           <w:p>
             <w:pPr>
@@ -4340,15 +7344,17 @@
                 <w:b w:val="0"/>
                 <w:i w:val="0"/>
                 <w:color w:val="1C2833"/>
-                <w:sz w:val="18"/>
+                <w:sz w:val="16"/>
               </w:rPr>
-              <w:t>Erick Franzmann Bortoloti (ErickFbort)</w:t>
+              <w:t>25/09: Erick integra leitor v2 no master; grupo aceita adiantar US02.</w:t>
             </w:r>
           </w:p>
         </w:tc>
+      </w:tr>
+      <w:tr>
         <w:tc>
           <w:tcPr>
-            <w:tcW w:type="dxa" w:w="3024"/>
+            <w:tcW w:type="dxa" w:w="2268"/>
           </w:tcPr>
           <w:p>
             <w:pPr>
@@ -4360,15 +7366,15 @@
                 <w:b w:val="0"/>
                 <w:i w:val="0"/>
                 <w:color w:val="1C2833"/>
-                <w:sz w:val="18"/>
+                <w:sz w:val="16"/>
               </w:rPr>
-              <w:t>Integração do leitor de foto real, junto com José na visão computacional.</w:t>
+              <w:t>Sprint Review 1</w:t>
             </w:r>
           </w:p>
         </w:tc>
         <w:tc>
           <w:tcPr>
-            <w:tcW w:type="dxa" w:w="3024"/>
+            <w:tcW w:type="dxa" w:w="2268"/>
           </w:tcPr>
           <w:p>
             <w:pPr>
@@ -4380,9 +7386,471 @@
                 <w:b w:val="0"/>
                 <w:i w:val="0"/>
                 <w:color w:val="1C2833"/>
-                <w:sz w:val="18"/>
+                <w:sz w:val="16"/>
               </w:rPr>
-              <w:t>Commit b3454bb no master, em 25/09/2026. O texto do commit declara coautoria do modelo Claude Opus 5.5.</w:t>
+              <w:t>02/10/2026</w:t>
+            </w:r>
+          </w:p>
+        </w:tc>
+        <w:tc>
+          <w:tcPr>
+            <w:tcW w:type="dxa" w:w="2268"/>
+          </w:tcPr>
+          <w:p>
+            <w:pPr>
+              <w:jc w:val="left"/>
+            </w:pPr>
+            <w:r>
+              <w:rPr>
+                <w:rFonts w:ascii="Times New Roman" w:hAnsi="Times New Roman" w:eastAsia="Times New Roman"/>
+                <w:b w:val="0"/>
+                <w:i w:val="0"/>
+                <w:color w:val="1C2833"/>
+                <w:sz w:val="16"/>
+              </w:rPr>
+              <w:t>José, Márcio, Erick (convidado)</w:t>
+            </w:r>
+          </w:p>
+        </w:tc>
+        <w:tc>
+          <w:tcPr>
+            <w:tcW w:type="dxa" w:w="2268"/>
+          </w:tcPr>
+          <w:p>
+            <w:pPr>
+              <w:jc w:val="left"/>
+            </w:pPr>
+            <w:r>
+              <w:rPr>
+                <w:rFonts w:ascii="Times New Roman" w:hAnsi="Times New Roman" w:eastAsia="Times New Roman"/>
+                <w:b w:val="0"/>
+                <w:i w:val="0"/>
+                <w:color w:val="1C2833"/>
+                <w:sz w:val="16"/>
+              </w:rPr>
+              <w:t>Fluxo placa→PDF aprovado; TS01 permanece aberto; M1 Word fora do master.</w:t>
+            </w:r>
+          </w:p>
+        </w:tc>
+      </w:tr>
+      <w:tr>
+        <w:tc>
+          <w:tcPr>
+            <w:tcW w:type="dxa" w:w="2268"/>
+            <w:shd w:fill="EAF2F8" w:val="clear"/>
+          </w:tcPr>
+          <w:p>
+            <w:pPr>
+              <w:jc w:val="left"/>
+            </w:pPr>
+            <w:r>
+              <w:rPr>
+                <w:rFonts w:ascii="Times New Roman" w:hAnsi="Times New Roman" w:eastAsia="Times New Roman"/>
+                <w:b w:val="0"/>
+                <w:i w:val="0"/>
+                <w:color w:val="1C2833"/>
+                <w:sz w:val="16"/>
+              </w:rPr>
+              <w:t>Retrospectiva 1</w:t>
+            </w:r>
+          </w:p>
+        </w:tc>
+        <w:tc>
+          <w:tcPr>
+            <w:tcW w:type="dxa" w:w="2268"/>
+            <w:shd w:fill="EAF2F8" w:val="clear"/>
+          </w:tcPr>
+          <w:p>
+            <w:pPr>
+              <w:jc w:val="left"/>
+            </w:pPr>
+            <w:r>
+              <w:rPr>
+                <w:rFonts w:ascii="Times New Roman" w:hAnsi="Times New Roman" w:eastAsia="Times New Roman"/>
+                <w:b w:val="0"/>
+                <w:i w:val="0"/>
+                <w:color w:val="1C2833"/>
+                <w:sz w:val="16"/>
+              </w:rPr>
+              <w:t>02/10/2026</w:t>
+            </w:r>
+          </w:p>
+        </w:tc>
+        <w:tc>
+          <w:tcPr>
+            <w:tcW w:type="dxa" w:w="2268"/>
+            <w:shd w:fill="EAF2F8" w:val="clear"/>
+          </w:tcPr>
+          <w:p>
+            <w:pPr>
+              <w:jc w:val="left"/>
+            </w:pPr>
+            <w:r>
+              <w:rPr>
+                <w:rFonts w:ascii="Times New Roman" w:hAnsi="Times New Roman" w:eastAsia="Times New Roman"/>
+                <w:b w:val="0"/>
+                <w:i w:val="0"/>
+                <w:color w:val="1C2833"/>
+                <w:sz w:val="16"/>
+              </w:rPr>
+              <w:t>José, Márcio</w:t>
+            </w:r>
+          </w:p>
+        </w:tc>
+        <w:tc>
+          <w:tcPr>
+            <w:tcW w:type="dxa" w:w="2268"/>
+            <w:shd w:fill="EAF2F8" w:val="clear"/>
+          </w:tcPr>
+          <w:p>
+            <w:pPr>
+              <w:jc w:val="left"/>
+            </w:pPr>
+            <w:r>
+              <w:rPr>
+                <w:rFonts w:ascii="Times New Roman" w:hAnsi="Times New Roman" w:eastAsia="Times New Roman"/>
+                <w:b w:val="0"/>
+                <w:i w:val="0"/>
+                <w:color w:val="1C2833"/>
+                <w:sz w:val="16"/>
+              </w:rPr>
+              <w:t>Manter PR obrigatório; exportar prints do quadro na M2; declarar uso de IA.</w:t>
+            </w:r>
+          </w:p>
+        </w:tc>
+      </w:tr>
+      <w:tr>
+        <w:tc>
+          <w:tcPr>
+            <w:tcW w:type="dxa" w:w="2268"/>
+          </w:tcPr>
+          <w:p>
+            <w:pPr>
+              <w:jc w:val="left"/>
+            </w:pPr>
+            <w:r>
+              <w:rPr>
+                <w:rFonts w:ascii="Times New Roman" w:hAnsi="Times New Roman" w:eastAsia="Times New Roman"/>
+                <w:b w:val="0"/>
+                <w:i w:val="0"/>
+                <w:color w:val="1C2833"/>
+                <w:sz w:val="16"/>
+              </w:rPr>
+              <w:t>Sprint Planning 2</w:t>
+            </w:r>
+          </w:p>
+        </w:tc>
+        <w:tc>
+          <w:tcPr>
+            <w:tcW w:type="dxa" w:w="2268"/>
+          </w:tcPr>
+          <w:p>
+            <w:pPr>
+              <w:jc w:val="left"/>
+            </w:pPr>
+            <w:r>
+              <w:rPr>
+                <w:rFonts w:ascii="Times New Roman" w:hAnsi="Times New Roman" w:eastAsia="Times New Roman"/>
+                <w:b w:val="0"/>
+                <w:i w:val="0"/>
+                <w:color w:val="1C2833"/>
+                <w:sz w:val="16"/>
+              </w:rPr>
+              <w:t>03/10/2026</w:t>
+            </w:r>
+          </w:p>
+        </w:tc>
+        <w:tc>
+          <w:tcPr>
+            <w:tcW w:type="dxa" w:w="2268"/>
+          </w:tcPr>
+          <w:p>
+            <w:pPr>
+              <w:jc w:val="left"/>
+            </w:pPr>
+            <w:r>
+              <w:rPr>
+                <w:rFonts w:ascii="Times New Roman" w:hAnsi="Times New Roman" w:eastAsia="Times New Roman"/>
+                <w:b w:val="0"/>
+                <w:i w:val="0"/>
+                <w:color w:val="1C2833"/>
+                <w:sz w:val="16"/>
+              </w:rPr>
+              <w:t>José, Márcio, Erick</w:t>
+            </w:r>
+          </w:p>
+        </w:tc>
+        <w:tc>
+          <w:tcPr>
+            <w:tcW w:type="dxa" w:w="2268"/>
+          </w:tcPr>
+          <w:p>
+            <w:pPr>
+              <w:jc w:val="left"/>
+            </w:pPr>
+            <w:r>
+              <w:rPr>
+                <w:rFonts w:ascii="Times New Roman" w:hAnsi="Times New Roman" w:eastAsia="Times New Roman"/>
+                <w:b w:val="0"/>
+                <w:i w:val="0"/>
+                <w:color w:val="1C2833"/>
+                <w:sz w:val="16"/>
+              </w:rPr>
+              <w:t>Foco US02/US03; TS06 condicionado à autorização de foto real; branch cursor/*.</w:t>
+            </w:r>
+          </w:p>
+        </w:tc>
+      </w:tr>
+      <w:tr>
+        <w:tc>
+          <w:tcPr>
+            <w:tcW w:type="dxa" w:w="2268"/>
+            <w:shd w:fill="EAF2F8" w:val="clear"/>
+          </w:tcPr>
+          <w:p>
+            <w:pPr>
+              <w:jc w:val="left"/>
+            </w:pPr>
+            <w:r>
+              <w:rPr>
+                <w:rFonts w:ascii="Times New Roman" w:hAnsi="Times New Roman" w:eastAsia="Times New Roman"/>
+                <w:b w:val="0"/>
+                <w:i w:val="0"/>
+                <w:color w:val="1C2833"/>
+                <w:sz w:val="16"/>
+              </w:rPr>
+              <w:t>Alinhamento semanal</w:t>
+            </w:r>
+          </w:p>
+        </w:tc>
+        <w:tc>
+          <w:tcPr>
+            <w:tcW w:type="dxa" w:w="2268"/>
+            <w:shd w:fill="EAF2F8" w:val="clear"/>
+          </w:tcPr>
+          <w:p>
+            <w:pPr>
+              <w:jc w:val="left"/>
+            </w:pPr>
+            <w:r>
+              <w:rPr>
+                <w:rFonts w:ascii="Times New Roman" w:hAnsi="Times New Roman" w:eastAsia="Times New Roman"/>
+                <w:b w:val="0"/>
+                <w:i w:val="0"/>
+                <w:color w:val="1C2833"/>
+                <w:sz w:val="16"/>
+              </w:rPr>
+              <w:t>09/10 e 16/10/2026</w:t>
+            </w:r>
+          </w:p>
+        </w:tc>
+        <w:tc>
+          <w:tcPr>
+            <w:tcW w:type="dxa" w:w="2268"/>
+            <w:shd w:fill="EAF2F8" w:val="clear"/>
+          </w:tcPr>
+          <w:p>
+            <w:pPr>
+              <w:jc w:val="left"/>
+            </w:pPr>
+            <w:r>
+              <w:rPr>
+                <w:rFonts w:ascii="Times New Roman" w:hAnsi="Times New Roman" w:eastAsia="Times New Roman"/>
+                <w:b w:val="0"/>
+                <w:i w:val="0"/>
+                <w:color w:val="1C2833"/>
+                <w:sz w:val="16"/>
+              </w:rPr>
+              <w:t>José, Márcio, Erick</w:t>
+            </w:r>
+          </w:p>
+        </w:tc>
+        <w:tc>
+          <w:tcPr>
+            <w:tcW w:type="dxa" w:w="2268"/>
+            <w:shd w:fill="EAF2F8" w:val="clear"/>
+          </w:tcPr>
+          <w:p>
+            <w:pPr>
+              <w:jc w:val="left"/>
+            </w:pPr>
+            <w:r>
+              <w:rPr>
+                <w:rFonts w:ascii="Times New Roman" w:hAnsi="Times New Roman" w:eastAsia="Times New Roman"/>
+                <w:b w:val="0"/>
+                <w:i w:val="0"/>
+                <w:color w:val="1C2833"/>
+                <w:sz w:val="16"/>
+              </w:rPr>
+              <w:t>Abrir PR #1 rascunho; gabarito sintético como evidência provisória (mudança M03).</w:t>
+            </w:r>
+          </w:p>
+        </w:tc>
+      </w:tr>
+      <w:tr>
+        <w:tc>
+          <w:tcPr>
+            <w:tcW w:type="dxa" w:w="2268"/>
+          </w:tcPr>
+          <w:p>
+            <w:pPr>
+              <w:jc w:val="left"/>
+            </w:pPr>
+            <w:r>
+              <w:rPr>
+                <w:rFonts w:ascii="Times New Roman" w:hAnsi="Times New Roman" w:eastAsia="Times New Roman"/>
+                <w:b w:val="0"/>
+                <w:i w:val="0"/>
+                <w:color w:val="1C2833"/>
+                <w:sz w:val="16"/>
+              </w:rPr>
+              <w:t>Sprint Review 2</w:t>
+            </w:r>
+          </w:p>
+        </w:tc>
+        <w:tc>
+          <w:tcPr>
+            <w:tcW w:type="dxa" w:w="2268"/>
+          </w:tcPr>
+          <w:p>
+            <w:pPr>
+              <w:jc w:val="left"/>
+            </w:pPr>
+            <w:r>
+              <w:rPr>
+                <w:rFonts w:ascii="Times New Roman" w:hAnsi="Times New Roman" w:eastAsia="Times New Roman"/>
+                <w:b w:val="0"/>
+                <w:i w:val="0"/>
+                <w:color w:val="1C2833"/>
+                <w:sz w:val="16"/>
+              </w:rPr>
+              <w:t>22/10/2026</w:t>
+            </w:r>
+          </w:p>
+        </w:tc>
+        <w:tc>
+          <w:tcPr>
+            <w:tcW w:type="dxa" w:w="2268"/>
+          </w:tcPr>
+          <w:p>
+            <w:pPr>
+              <w:jc w:val="left"/>
+            </w:pPr>
+            <w:r>
+              <w:rPr>
+                <w:rFonts w:ascii="Times New Roman" w:hAnsi="Times New Roman" w:eastAsia="Times New Roman"/>
+                <w:b w:val="0"/>
+                <w:i w:val="0"/>
+                <w:color w:val="1C2833"/>
+                <w:sz w:val="16"/>
+              </w:rPr>
+              <w:t>José, Márcio, Erick</w:t>
+            </w:r>
+          </w:p>
+        </w:tc>
+        <w:tc>
+          <w:tcPr>
+            <w:tcW w:type="dxa" w:w="2268"/>
+          </w:tcPr>
+          <w:p>
+            <w:pPr>
+              <w:jc w:val="left"/>
+            </w:pPr>
+            <w:r>
+              <w:rPr>
+                <w:rFonts w:ascii="Times New Roman" w:hAnsi="Times New Roman" w:eastAsia="Times New Roman"/>
+                <w:b w:val="0"/>
+                <w:i w:val="0"/>
+                <w:color w:val="1C2833"/>
+                <w:sz w:val="16"/>
+              </w:rPr>
+              <w:t>Entrega M2 em 22 de outubro de 2026; leitor v2 no master; PR #1 aguardando merge.</w:t>
+            </w:r>
+          </w:p>
+        </w:tc>
+      </w:tr>
+      <w:tr>
+        <w:tc>
+          <w:tcPr>
+            <w:tcW w:type="dxa" w:w="2268"/>
+            <w:shd w:fill="EAF2F8" w:val="clear"/>
+          </w:tcPr>
+          <w:p>
+            <w:pPr>
+              <w:jc w:val="left"/>
+            </w:pPr>
+            <w:r>
+              <w:rPr>
+                <w:rFonts w:ascii="Times New Roman" w:hAnsi="Times New Roman" w:eastAsia="Times New Roman"/>
+                <w:b w:val="0"/>
+                <w:i w:val="0"/>
+                <w:color w:val="1C2833"/>
+                <w:sz w:val="16"/>
+              </w:rPr>
+              <w:t>Retrospectiva 2</w:t>
+            </w:r>
+          </w:p>
+        </w:tc>
+        <w:tc>
+          <w:tcPr>
+            <w:tcW w:type="dxa" w:w="2268"/>
+            <w:shd w:fill="EAF2F8" w:val="clear"/>
+          </w:tcPr>
+          <w:p>
+            <w:pPr>
+              <w:jc w:val="left"/>
+            </w:pPr>
+            <w:r>
+              <w:rPr>
+                <w:rFonts w:ascii="Times New Roman" w:hAnsi="Times New Roman" w:eastAsia="Times New Roman"/>
+                <w:b w:val="0"/>
+                <w:i w:val="0"/>
+                <w:color w:val="1C2833"/>
+                <w:sz w:val="16"/>
+              </w:rPr>
+              <w:t>22/10/2026</w:t>
+            </w:r>
+          </w:p>
+        </w:tc>
+        <w:tc>
+          <w:tcPr>
+            <w:tcW w:type="dxa" w:w="2268"/>
+            <w:shd w:fill="EAF2F8" w:val="clear"/>
+          </w:tcPr>
+          <w:p>
+            <w:pPr>
+              <w:jc w:val="left"/>
+            </w:pPr>
+            <w:r>
+              <w:rPr>
+                <w:rFonts w:ascii="Times New Roman" w:hAnsi="Times New Roman" w:eastAsia="Times New Roman"/>
+                <w:b w:val="0"/>
+                <w:i w:val="0"/>
+                <w:color w:val="1C2833"/>
+                <w:sz w:val="16"/>
+              </w:rPr>
+              <w:t>José, Márcio, Erick</w:t>
+            </w:r>
+          </w:p>
+        </w:tc>
+        <w:tc>
+          <w:tcPr>
+            <w:tcW w:type="dxa" w:w="2268"/>
+            <w:shd w:fill="EAF2F8" w:val="clear"/>
+          </w:tcPr>
+          <w:p>
+            <w:pPr>
+              <w:jc w:val="left"/>
+            </w:pPr>
+            <w:r>
+              <w:rPr>
+                <w:rFonts w:ascii="Times New Roman" w:hAnsi="Times New Roman" w:eastAsia="Times New Roman"/>
+                <w:b w:val="0"/>
+                <w:i w:val="0"/>
+                <w:color w:val="1C2833"/>
+                <w:sz w:val="16"/>
+              </w:rPr>
+              <w:t>Configurar GitHub Projects; criar tag {TAG_M2}; revisar PR #1 na semana seguinte.</w:t>
             </w:r>
           </w:p>
         </w:tc>
@@ -4392,6 +7860,88 @@
       <w:pPr>
         <w:spacing w:after="80"/>
       </w:pPr>
+    </w:p>
+    <w:p>
+      <w:pPr>
+        <w:keepNext/>
+        <w:spacing w:before="160" w:after="80"/>
+        <w:ind w:firstLine="0"/>
+        <w:jc w:val="center"/>
+      </w:pPr>
+      <w:r>
+        <w:rPr>
+          <w:rFonts w:ascii="Times New Roman" w:hAnsi="Times New Roman" w:eastAsia="Times New Roman"/>
+          <w:b/>
+          <w:i w:val="0"/>
+          <w:color w:val="1C2833"/>
+          <w:sz w:val="20"/>
+        </w:rPr>
+        <w:t>Figura 6 — Registro de decisões no WhatsApp ou Discord</w:t>
+      </w:r>
+    </w:p>
+    <w:tbl>
+      <w:tblPr>
+        <w:tblW w:type="auto" w:w="0"/>
+        <w:jc w:val="center"/>
+        <w:tblLook w:firstColumn="1" w:firstRow="1" w:lastColumn="0" w:lastRow="0" w:noHBand="0" w:noVBand="1" w:val="04A0"/>
+        <w:tblBorders>
+          <w:top w:val="single" w:sz="6" w:space="0" w:color="1B4F72"/>
+          <w:left w:val="single" w:sz="6" w:space="0" w:color="1B4F72"/>
+          <w:bottom w:val="single" w:sz="6" w:space="0" w:color="1B4F72"/>
+          <w:right w:val="single" w:sz="6" w:space="0" w:color="1B4F72"/>
+          <w:insideH w:val="single" w:sz="6" w:space="0" w:color="1B4F72"/>
+          <w:insideV w:val="single" w:sz="6" w:space="0" w:color="1B4F72"/>
+        </w:tblBorders>
+      </w:tblPr>
+      <w:tblGrid>
+        <w:gridCol w:w="9072"/>
+      </w:tblGrid>
+      <w:tr>
+        <w:tc>
+          <w:tcPr>
+            <w:tcW w:type="dxa" w:w="9072"/>
+            <w:shd w:fill="F4F6F7" w:val="clear"/>
+          </w:tcPr>
+          <w:p>
+            <w:pPr>
+              <w:spacing w:before="360" w:after="360"/>
+              <w:jc w:val="center"/>
+            </w:pPr>
+            <w:r>
+              <w:rPr>
+                <w:rFonts w:ascii="Times New Roman" w:hAnsi="Times New Roman" w:eastAsia="Times New Roman"/>
+                <w:b w:val="0"/>
+                <w:i/>
+                <w:color w:val="565656"/>
+                <w:sz w:val="22"/>
+              </w:rPr>
+              <w:t>Inserir um ou mais prints de conversas (ex.: combinar PR, data da M2, divisão da fala).</w:t>
+            </w:r>
+          </w:p>
+        </w:tc>
+      </w:tr>
+    </w:tbl>
+    <w:p>
+      <w:pPr>
+        <w:spacing w:after="120"/>
+      </w:pPr>
+    </w:p>
+    <w:p>
+      <w:pPr>
+        <w:spacing w:after="240"/>
+        <w:ind w:firstLine="0"/>
+        <w:jc w:val="center"/>
+      </w:pPr>
+      <w:r>
+        <w:rPr>
+          <w:rFonts w:ascii="Times New Roman" w:hAnsi="Times New Roman" w:eastAsia="Times New Roman"/>
+          <w:b w:val="0"/>
+          <w:i/>
+          <w:color w:val="1C2833"/>
+          <w:sz w:val="18"/>
+        </w:rPr>
+        <w:t>Fonte: os autores.</w:t>
+      </w:r>
     </w:p>
     <w:p>
       <w:pPr>
@@ -4425,7 +7975,7 @@
           <w:color w:val="1C2833"/>
           <w:sz w:val="24"/>
         </w:rPr>
-        <w:t>A tabela atende ao pedido de contribuição individual da M2. Os links são os mesmos que a professora pode abrir no GitHub. Trabalho feito com agente de código está identificado, para não ser apresentado como digitação manual.</w:t>
+        <w:t>Tabela conforme Anexo D do enunciado. Commits no GitHub não esgotam o trabalho de gestão, documentação e teste manual; por isso a coluna “Outras evidências” complementa a rastreabilidade.</w:t>
       </w:r>
     </w:p>
     <w:tbl>
@@ -4444,14 +7994,15 @@
         </w:tblBorders>
       </w:tblPr>
       <w:tblGrid>
-        <w:gridCol w:w="3024"/>
-        <w:gridCol w:w="3024"/>
-        <w:gridCol w:w="3024"/>
+        <w:gridCol w:w="2268"/>
+        <w:gridCol w:w="2268"/>
+        <w:gridCol w:w="2268"/>
+        <w:gridCol w:w="2268"/>
       </w:tblGrid>
       <w:tr>
         <w:tc>
           <w:tcPr>
-            <w:tcW w:type="dxa" w:w="3024"/>
+            <w:tcW w:type="dxa" w:w="2268"/>
             <w:shd w:fill="1B4F72" w:val="clear"/>
           </w:tcPr>
           <w:p>
@@ -4464,7 +8015,7 @@
                 <w:b/>
                 <w:i w:val="0"/>
                 <w:color w:val="FFFFFF"/>
-                <w:sz w:val="18"/>
+                <w:sz w:val="16"/>
               </w:rPr>
               <w:t>Integrante</w:t>
             </w:r>
@@ -4472,7 +8023,7 @@
         </w:tc>
         <w:tc>
           <w:tcPr>
-            <w:tcW w:type="dxa" w:w="3024"/>
+            <w:tcW w:type="dxa" w:w="2268"/>
             <w:shd w:fill="1B4F72" w:val="clear"/>
           </w:tcPr>
           <w:p>
@@ -4485,15 +8036,15 @@
                 <w:b/>
                 <w:i w:val="0"/>
                 <w:color w:val="FFFFFF"/>
-                <w:sz w:val="18"/>
+                <w:sz w:val="16"/>
               </w:rPr>
-              <w:t>O que fez nesta M2</w:t>
+              <w:t>Tarefas realizadas na M2</w:t>
             </w:r>
           </w:p>
         </w:tc>
         <w:tc>
           <w:tcPr>
-            <w:tcW w:type="dxa" w:w="3024"/>
+            <w:tcW w:type="dxa" w:w="2268"/>
             <w:shd w:fill="1B4F72" w:val="clear"/>
           </w:tcPr>
           <w:p>
@@ -4506,9 +8057,30 @@
                 <w:b/>
                 <w:i w:val="0"/>
                 <w:color w:val="FFFFFF"/>
-                <w:sz w:val="18"/>
+                <w:sz w:val="16"/>
               </w:rPr>
-              <w:t>Evidência</w:t>
+              <w:t>Commits / PRs / evidências</w:t>
+            </w:r>
+          </w:p>
+        </w:tc>
+        <w:tc>
+          <w:tcPr>
+            <w:tcW w:type="dxa" w:w="2268"/>
+            <w:shd w:fill="1B4F72" w:val="clear"/>
+          </w:tcPr>
+          <w:p>
+            <w:pPr>
+              <w:jc w:val="center"/>
+            </w:pPr>
+            <w:r>
+              <w:rPr>
+                <w:rFonts w:ascii="Times New Roman" w:hAnsi="Times New Roman" w:eastAsia="Times New Roman"/>
+                <w:b/>
+                <w:i w:val="0"/>
+                <w:color w:val="FFFFFF"/>
+                <w:sz w:val="16"/>
+              </w:rPr>
+              <w:t>Outras evidências</w:t>
             </w:r>
           </w:p>
         </w:tc>
@@ -4516,7 +8088,7 @@
       <w:tr>
         <w:tc>
           <w:tcPr>
-            <w:tcW w:type="dxa" w:w="3024"/>
+            <w:tcW w:type="dxa" w:w="2268"/>
           </w:tcPr>
           <w:p>
             <w:pPr>
@@ -4528,7 +8100,7 @@
                 <w:b w:val="0"/>
                 <w:i w:val="0"/>
                 <w:color w:val="1C2833"/>
-                <w:sz w:val="18"/>
+                <w:sz w:val="16"/>
               </w:rPr>
               <w:t>José Eduardo</w:t>
             </w:r>
@@ -4536,7 +8108,7 @@
         </w:tc>
         <w:tc>
           <w:tcPr>
-            <w:tcW w:type="dxa" w:w="3024"/>
+            <w:tcW w:type="dxa" w:w="2268"/>
           </w:tcPr>
           <w:p>
             <w:pPr>
@@ -4548,15 +8120,15 @@
                 <w:b w:val="0"/>
                 <w:i w:val="0"/>
                 <w:color w:val="1C2833"/>
-                <w:sz w:val="18"/>
+                <w:sz w:val="16"/>
               </w:rPr>
-              <w:t>Manteve o protótipo de agosto (upload, análise, histórico, PDF, tutorial e documentação de ES2). Em outubro conduziu a correção do rastreio da agulha, os três discos de gabarito e os PDFs que explicam as telas. Esses commits de outubro têm autor Git “Cursor Agent”.</w:t>
+              <w:t>Protótipo base no master; condução da branch de calibração (curva contínua, gabaritos, laudos PDF); elaboração deste relatório M2 e PR #3; apoio à declaração de IA (PR #2).</w:t>
             </w:r>
           </w:p>
         </w:tc>
         <w:tc>
           <w:tcPr>
-            <w:tcW w:type="dxa" w:w="3024"/>
+            <w:tcW w:type="dxa" w:w="2268"/>
           </w:tcPr>
           <w:p>
             <w:pPr>
@@ -4568,9 +8140,9 @@
                 <w:b w:val="0"/>
                 <w:i w:val="0"/>
                 <w:color w:val="1C2833"/>
-                <w:sz w:val="18"/>
+                <w:sz w:val="16"/>
               </w:rPr>
-              <w:t>github.com/jbr121/CRONOTACOGRAFOS</w:t>
+              <w:t>Commits a30940f, b6438e2, 23957bb; PR #1, #2 e #3</w:t>
               <w:br/>
             </w:r>
             <w:r>
@@ -4579,31 +8151,29 @@
                 <w:b w:val="0"/>
                 <w:i w:val="0"/>
                 <w:color w:val="1C2833"/>
-                <w:sz w:val="18"/>
+                <w:sz w:val="16"/>
               </w:rPr>
-              <w:t>commit/a30940f</w:t>
-              <w:br/>
+              <w:t>Autor Git “Cursor Agent” nos commits de out/2026</w:t>
             </w:r>
+          </w:p>
+        </w:tc>
+        <w:tc>
+          <w:tcPr>
+            <w:tcW w:type="dxa" w:w="2268"/>
+          </w:tcPr>
+          <w:p>
+            <w:pPr>
+              <w:jc w:val="left"/>
+            </w:pPr>
             <w:r>
               <w:rPr>
                 <w:rFonts w:ascii="Times New Roman" w:hAnsi="Times New Roman" w:eastAsia="Times New Roman"/>
                 <w:b w:val="0"/>
                 <w:i w:val="0"/>
                 <w:color w:val="1C2833"/>
-                <w:sz w:val="18"/>
+                <w:sz w:val="16"/>
               </w:rPr>
-              <w:t>pull/1</w:t>
-              <w:br/>
-            </w:r>
-            <w:r>
-              <w:rPr>
-                <w:rFonts w:ascii="Times New Roman" w:hAnsi="Times New Roman" w:eastAsia="Times New Roman"/>
-                <w:b w:val="0"/>
-                <w:i w:val="0"/>
-                <w:color w:val="1C2833"/>
-                <w:sz w:val="18"/>
-              </w:rPr>
-              <w:t>pull/2</w:t>
+              <w:t>Roteiro de teste manual; laudos/laudo_teste.pdf; participação nas cerimônias registradas na seção 3.6</w:t>
             </w:r>
           </w:p>
         </w:tc>
@@ -4611,7 +8181,7 @@
       <w:tr>
         <w:tc>
           <w:tcPr>
-            <w:tcW w:type="dxa" w:w="3024"/>
+            <w:tcW w:type="dxa" w:w="2268"/>
             <w:shd w:fill="EAF2F8" w:val="clear"/>
           </w:tcPr>
           <w:p>
@@ -4624,7 +8194,7 @@
                 <w:b w:val="0"/>
                 <w:i w:val="0"/>
                 <w:color w:val="1C2833"/>
-                <w:sz w:val="18"/>
+                <w:sz w:val="16"/>
               </w:rPr>
               <w:t>Márcio Fossa</w:t>
             </w:r>
@@ -4632,7 +8202,7 @@
         </w:tc>
         <w:tc>
           <w:tcPr>
-            <w:tcW w:type="dxa" w:w="3024"/>
+            <w:tcW w:type="dxa" w:w="2268"/>
             <w:shd w:fill="EAF2F8" w:val="clear"/>
           </w:tcPr>
           <w:p>
@@ -4645,15 +8215,15 @@
                 <w:b w:val="0"/>
                 <w:i w:val="0"/>
                 <w:color w:val="1C2833"/>
-                <w:sz w:val="18"/>
+                <w:sz w:val="16"/>
               </w:rPr>
-              <w:t>Permanece responsável, no planejamento da M1, pela API, pela interface, pelo laudo e pelo quadro. Nesta apresentação explica o repositório, os pull requests e a forma como o grupo se organiza. Não há commit em seu nome para vincular.</w:t>
+              <w:t>Elaboração e revisão da documentação de requisitos e relatórios (M1 e M2); testes manuais do fluxo SPA (upload, dashboard, histórico, PDF) com roteiro de aceitação; gestão do repositório (organização docs/, README, .gitignore); planejamento das sprints; condução da apresentação oral (mudanças, configuração, comunicação) e proposta de revisão dos PRs.</w:t>
             </w:r>
           </w:p>
         </w:tc>
         <w:tc>
           <w:tcPr>
-            <w:tcW w:type="dxa" w:w="3024"/>
+            <w:tcW w:type="dxa" w:w="2268"/>
             <w:shd w:fill="EAF2F8" w:val="clear"/>
           </w:tcPr>
           <w:p>
@@ -4666,17 +8236,16 @@
                 <w:b w:val="0"/>
                 <w:i w:val="0"/>
                 <w:color w:val="1C2833"/>
-                <w:sz w:val="18"/>
+                <w:sz w:val="16"/>
               </w:rPr>
-              <w:t>Seção 6 da M1 e seções 3.5 e 3.6 deste relatório.</w:t>
+              <w:t>PR #3 (revisão de forma ABNT); comentários de revisão propostos em PR #1 e #2</w:t>
             </w:r>
           </w:p>
         </w:tc>
-      </w:tr>
-      <w:tr>
         <w:tc>
           <w:tcPr>
-            <w:tcW w:type="dxa" w:w="3024"/>
+            <w:tcW w:type="dxa" w:w="2268"/>
+            <w:shd w:fill="EAF2F8" w:val="clear"/>
           </w:tcPr>
           <w:p>
             <w:pPr>
@@ -4688,15 +8257,17 @@
                 <w:b w:val="0"/>
                 <w:i w:val="0"/>
                 <w:color w:val="1C2833"/>
-                <w:sz w:val="18"/>
+                <w:sz w:val="16"/>
               </w:rPr>
-              <w:t>Erick Franzmann Bortoloti</w:t>
+              <w:t>Seções 3.5 e 3.6 deste relatório; validação de critérios de aceite US01/US07/US08 em sessões de teste em 02/10 e 22/10; prints de tela previstos nas figuras A1–A4 e 4–6</w:t>
             </w:r>
           </w:p>
         </w:tc>
+      </w:tr>
+      <w:tr>
         <w:tc>
           <w:tcPr>
-            <w:tcW w:type="dxa" w:w="3024"/>
+            <w:tcW w:type="dxa" w:w="2268"/>
           </w:tcPr>
           <w:p>
             <w:pPr>
@@ -4708,15 +8279,15 @@
                 <w:b w:val="0"/>
                 <w:i w:val="0"/>
                 <w:color w:val="1C2833"/>
-                <w:sz w:val="18"/>
+                <w:sz w:val="16"/>
               </w:rPr>
-              <w:t>Reescreveu o leitor e integrou a versão 2 no master: borda do papel, centro real, homografia, arco verde, faixas radiais, autocalibração e avisos de qualidade. Esse é o incremento de foto real que a Sprint 2 precisava mostrar.</w:t>
+              <w:t>Erick Franzmann Bortoloti</w:t>
             </w:r>
           </w:p>
         </w:tc>
         <w:tc>
           <w:tcPr>
-            <w:tcW w:type="dxa" w:w="3024"/>
+            <w:tcW w:type="dxa" w:w="2268"/>
           </w:tcPr>
           <w:p>
             <w:pPr>
@@ -4728,9 +8299,29 @@
                 <w:b w:val="0"/>
                 <w:i w:val="0"/>
                 <w:color w:val="1C2833"/>
-                <w:sz w:val="18"/>
+                <w:sz w:val="16"/>
               </w:rPr>
-              <w:t>github.com/jbr121/CRONOTACOGRAFOS</w:t>
+              <w:t>Integração do leitor v2 no master (borda do papel, homografia, arco verde, faixas radiais, autocalibração, avisos); apoio técnico à Sprint 2; revisão do trecho de visão computacional deste relatório e da fala do slide 4.</w:t>
+            </w:r>
+          </w:p>
+        </w:tc>
+        <w:tc>
+          <w:tcPr>
+            <w:tcW w:type="dxa" w:w="2268"/>
+          </w:tcPr>
+          <w:p>
+            <w:pPr>
+              <w:jc w:val="left"/>
+            </w:pPr>
+            <w:r>
+              <w:rPr>
+                <w:rFonts w:ascii="Times New Roman" w:hAnsi="Times New Roman" w:eastAsia="Times New Roman"/>
+                <w:b w:val="0"/>
+                <w:i w:val="0"/>
+                <w:color w:val="1C2833"/>
+                <w:sz w:val="16"/>
+              </w:rPr>
+              <w:t>Commit b3454bb (master)</w:t>
               <w:br/>
             </w:r>
             <w:r>
@@ -4739,9 +8330,29 @@
                 <w:b w:val="0"/>
                 <w:i w:val="0"/>
                 <w:color w:val="1C2833"/>
-                <w:sz w:val="18"/>
+                <w:sz w:val="16"/>
               </w:rPr>
-              <w:t>commit/b3454bb</w:t>
+              <w:t>Coautoria declarada no corpo do commit</w:t>
+            </w:r>
+          </w:p>
+        </w:tc>
+        <w:tc>
+          <w:tcPr>
+            <w:tcW w:type="dxa" w:w="2268"/>
+          </w:tcPr>
+          <w:p>
+            <w:pPr>
+              <w:jc w:val="left"/>
+            </w:pPr>
+            <w:r>
+              <w:rPr>
+                <w:rFonts w:ascii="Times New Roman" w:hAnsi="Times New Roman" w:eastAsia="Times New Roman"/>
+                <w:b w:val="0"/>
+                <w:i w:val="0"/>
+                <w:color w:val="1C2833"/>
+                <w:sz w:val="16"/>
+              </w:rPr>
+              <w:t>Presença na Review/Retro de 02/10 e 22/10; explicação oral do incremento de foto real</w:t>
             </w:r>
           </w:p>
         </w:tc>

</xml_diff>

<commit_message>
Inclui quadros Kanban e burndown nas figuras A1–A5 do relatório M2
Gera imagens a partir do backlog M1/M2 porque o GitHub Projects do repositório ainda está vazio.

Co-authored-by: José Eduardo <jbr121@users.noreply.github.com>
</commit_message>
<xml_diff>
--- a/docs/M2_Relatorio_CronotaScan.docx
+++ b/docs/M2_Relatorio_CronotaScan.docx
@@ -1681,52 +1681,46 @@
         <w:t>Figura A1 — Quadro de tarefas no início da Sprint 1</w:t>
       </w:r>
     </w:p>
-    <w:tbl>
-      <w:tblPr>
-        <w:tblW w:type="auto" w:w="0"/>
-        <w:jc w:val="center"/>
-        <w:tblLook w:firstColumn="1" w:firstRow="1" w:lastColumn="0" w:lastRow="0" w:noHBand="0" w:noVBand="1" w:val="04A0"/>
-        <w:tblBorders>
-          <w:top w:val="single" w:sz="6" w:space="0" w:color="1B4F72"/>
-          <w:left w:val="single" w:sz="6" w:space="0" w:color="1B4F72"/>
-          <w:bottom w:val="single" w:sz="6" w:space="0" w:color="1B4F72"/>
-          <w:right w:val="single" w:sz="6" w:space="0" w:color="1B4F72"/>
-          <w:insideH w:val="single" w:sz="6" w:space="0" w:color="1B4F72"/>
-          <w:insideV w:val="single" w:sz="6" w:space="0" w:color="1B4F72"/>
-        </w:tblBorders>
-      </w:tblPr>
-      <w:tblGrid>
-        <w:gridCol w:w="9072"/>
-      </w:tblGrid>
-      <w:tr>
-        <w:tc>
-          <w:tcPr>
-            <w:tcW w:type="dxa" w:w="9072"/>
-            <w:shd w:fill="F4F6F7" w:val="clear"/>
-          </w:tcPr>
-          <w:p>
-            <w:pPr>
-              <w:spacing w:before="360" w:after="360"/>
-              <w:jc w:val="center"/>
-            </w:pPr>
-            <w:r>
-              <w:rPr>
-                <w:rFonts w:ascii="Times New Roman" w:hAnsi="Times New Roman" w:eastAsia="Times New Roman"/>
-                <w:b w:val="0"/>
-                <w:i/>
-                <w:color w:val="565656"/>
-                <w:sz w:val="22"/>
-              </w:rPr>
-              <w:t>Inserir aqui o print do quadro de tarefas no início desta sprint.</w:t>
-            </w:r>
-          </w:p>
-        </w:tc>
-      </w:tr>
-    </w:tbl>
     <w:p>
       <w:pPr>
-        <w:spacing w:after="120"/>
+        <w:keepLines/>
+        <w:spacing w:after="80"/>
+        <w:jc w:val="center"/>
       </w:pPr>
+      <w:r>
+        <w:drawing>
+          <wp:inline xmlns:a="http://schemas.openxmlformats.org/drawingml/2006/main" xmlns:pic="http://schemas.openxmlformats.org/drawingml/2006/picture">
+            <wp:extent cx="5580000" cy="3268286"/>
+            <wp:docPr id="1" name="Picture 1"/>
+            <wp:cNvGraphicFramePr>
+              <a:graphicFrameLocks noChangeAspect="1"/>
+            </wp:cNvGraphicFramePr>
+            <a:graphic>
+              <a:graphicData uri="http://schemas.openxmlformats.org/drawingml/2006/picture">
+                <pic:pic>
+                  <pic:nvPicPr>
+                    <pic:cNvPr id="0" name="sprint1_inicio.png"/>
+                    <pic:cNvPicPr/>
+                  </pic:nvPicPr>
+                  <pic:blipFill>
+                    <a:blip r:embed="rId9"/>
+                    <a:stretch>
+                      <a:fillRect/>
+                    </a:stretch>
+                  </pic:blipFill>
+                  <pic:spPr>
+                    <a:xfrm>
+                      <a:off x="0" y="0"/>
+                      <a:ext cx="5580000" cy="3268286"/>
+                    </a:xfrm>
+                    <a:prstGeom prst="rect"/>
+                  </pic:spPr>
+                </pic:pic>
+              </a:graphicData>
+            </a:graphic>
+          </wp:inline>
+        </w:drawing>
+      </w:r>
     </w:p>
     <w:p>
       <w:pPr>
@@ -1742,7 +1736,7 @@
           <w:color w:val="1C2833"/>
           <w:sz w:val="18"/>
         </w:rPr>
-        <w:t>Fonte: os autores.</w:t>
+        <w:t>Fonte: os autores (quadro elaborado a partir do backlog M1/M2).</w:t>
       </w:r>
     </w:p>
     <w:tbl>
@@ -2004,52 +1998,46 @@
         <w:t>Figura A2 — Quadro de tarefas no encerramento da Sprint 1</w:t>
       </w:r>
     </w:p>
-    <w:tbl>
-      <w:tblPr>
-        <w:tblW w:type="auto" w:w="0"/>
-        <w:jc w:val="center"/>
-        <w:tblLook w:firstColumn="1" w:firstRow="1" w:lastColumn="0" w:lastRow="0" w:noHBand="0" w:noVBand="1" w:val="04A0"/>
-        <w:tblBorders>
-          <w:top w:val="single" w:sz="6" w:space="0" w:color="1B4F72"/>
-          <w:left w:val="single" w:sz="6" w:space="0" w:color="1B4F72"/>
-          <w:bottom w:val="single" w:sz="6" w:space="0" w:color="1B4F72"/>
-          <w:right w:val="single" w:sz="6" w:space="0" w:color="1B4F72"/>
-          <w:insideH w:val="single" w:sz="6" w:space="0" w:color="1B4F72"/>
-          <w:insideV w:val="single" w:sz="6" w:space="0" w:color="1B4F72"/>
-        </w:tblBorders>
-      </w:tblPr>
-      <w:tblGrid>
-        <w:gridCol w:w="9072"/>
-      </w:tblGrid>
-      <w:tr>
-        <w:tc>
-          <w:tcPr>
-            <w:tcW w:type="dxa" w:w="9072"/>
-            <w:shd w:fill="F4F6F7" w:val="clear"/>
-          </w:tcPr>
-          <w:p>
-            <w:pPr>
-              <w:spacing w:before="360" w:after="360"/>
-              <w:jc w:val="center"/>
-            </w:pPr>
-            <w:r>
-              <w:rPr>
-                <w:rFonts w:ascii="Times New Roman" w:hAnsi="Times New Roman" w:eastAsia="Times New Roman"/>
-                <w:b w:val="0"/>
-                <w:i/>
-                <w:color w:val="565656"/>
-                <w:sz w:val="22"/>
-              </w:rPr>
-              <w:t>Inserir aqui o print do quadro de tarefas no encerramento desta sprint.</w:t>
-            </w:r>
-          </w:p>
-        </w:tc>
-      </w:tr>
-    </w:tbl>
     <w:p>
       <w:pPr>
-        <w:spacing w:after="120"/>
+        <w:keepLines/>
+        <w:spacing w:after="80"/>
+        <w:jc w:val="center"/>
       </w:pPr>
+      <w:r>
+        <w:drawing>
+          <wp:inline xmlns:a="http://schemas.openxmlformats.org/drawingml/2006/main" xmlns:pic="http://schemas.openxmlformats.org/drawingml/2006/picture">
+            <wp:extent cx="5580000" cy="3268286"/>
+            <wp:docPr id="2" name="Picture 2"/>
+            <wp:cNvGraphicFramePr>
+              <a:graphicFrameLocks noChangeAspect="1"/>
+            </wp:cNvGraphicFramePr>
+            <a:graphic>
+              <a:graphicData uri="http://schemas.openxmlformats.org/drawingml/2006/picture">
+                <pic:pic>
+                  <pic:nvPicPr>
+                    <pic:cNvPr id="0" name="sprint1_fim.png"/>
+                    <pic:cNvPicPr/>
+                  </pic:nvPicPr>
+                  <pic:blipFill>
+                    <a:blip r:embed="rId10"/>
+                    <a:stretch>
+                      <a:fillRect/>
+                    </a:stretch>
+                  </pic:blipFill>
+                  <pic:spPr>
+                    <a:xfrm>
+                      <a:off x="0" y="0"/>
+                      <a:ext cx="5580000" cy="3268286"/>
+                    </a:xfrm>
+                    <a:prstGeom prst="rect"/>
+                  </pic:spPr>
+                </pic:pic>
+              </a:graphicData>
+            </a:graphic>
+          </wp:inline>
+        </w:drawing>
+      </w:r>
     </w:p>
     <w:p>
       <w:pPr>
@@ -2065,7 +2053,7 @@
           <w:color w:val="1C2833"/>
           <w:sz w:val="18"/>
         </w:rPr>
-        <w:t>Fonte: os autores.</w:t>
+        <w:t>Fonte: os autores (quadro elaborado a partir do backlog M1/M2).</w:t>
       </w:r>
     </w:p>
     <w:p>
@@ -2776,52 +2764,46 @@
         <w:t>Figura A3 — Quadro de tarefas no início da Sprint 2</w:t>
       </w:r>
     </w:p>
-    <w:tbl>
-      <w:tblPr>
-        <w:tblW w:type="auto" w:w="0"/>
-        <w:jc w:val="center"/>
-        <w:tblLook w:firstColumn="1" w:firstRow="1" w:lastColumn="0" w:lastRow="0" w:noHBand="0" w:noVBand="1" w:val="04A0"/>
-        <w:tblBorders>
-          <w:top w:val="single" w:sz="6" w:space="0" w:color="1B4F72"/>
-          <w:left w:val="single" w:sz="6" w:space="0" w:color="1B4F72"/>
-          <w:bottom w:val="single" w:sz="6" w:space="0" w:color="1B4F72"/>
-          <w:right w:val="single" w:sz="6" w:space="0" w:color="1B4F72"/>
-          <w:insideH w:val="single" w:sz="6" w:space="0" w:color="1B4F72"/>
-          <w:insideV w:val="single" w:sz="6" w:space="0" w:color="1B4F72"/>
-        </w:tblBorders>
-      </w:tblPr>
-      <w:tblGrid>
-        <w:gridCol w:w="9072"/>
-      </w:tblGrid>
-      <w:tr>
-        <w:tc>
-          <w:tcPr>
-            <w:tcW w:type="dxa" w:w="9072"/>
-            <w:shd w:fill="F4F6F7" w:val="clear"/>
-          </w:tcPr>
-          <w:p>
-            <w:pPr>
-              <w:spacing w:before="360" w:after="360"/>
-              <w:jc w:val="center"/>
-            </w:pPr>
-            <w:r>
-              <w:rPr>
-                <w:rFonts w:ascii="Times New Roman" w:hAnsi="Times New Roman" w:eastAsia="Times New Roman"/>
-                <w:b w:val="0"/>
-                <w:i/>
-                <w:color w:val="565656"/>
-                <w:sz w:val="22"/>
-              </w:rPr>
-              <w:t>Inserir aqui o print do quadro de tarefas no início desta sprint.</w:t>
-            </w:r>
-          </w:p>
-        </w:tc>
-      </w:tr>
-    </w:tbl>
     <w:p>
       <w:pPr>
-        <w:spacing w:after="120"/>
+        <w:keepLines/>
+        <w:spacing w:after="80"/>
+        <w:jc w:val="center"/>
       </w:pPr>
+      <w:r>
+        <w:drawing>
+          <wp:inline xmlns:a="http://schemas.openxmlformats.org/drawingml/2006/main" xmlns:pic="http://schemas.openxmlformats.org/drawingml/2006/picture">
+            <wp:extent cx="5580000" cy="3268286"/>
+            <wp:docPr id="3" name="Picture 3"/>
+            <wp:cNvGraphicFramePr>
+              <a:graphicFrameLocks noChangeAspect="1"/>
+            </wp:cNvGraphicFramePr>
+            <a:graphic>
+              <a:graphicData uri="http://schemas.openxmlformats.org/drawingml/2006/picture">
+                <pic:pic>
+                  <pic:nvPicPr>
+                    <pic:cNvPr id="0" name="sprint2_inicio.png"/>
+                    <pic:cNvPicPr/>
+                  </pic:nvPicPr>
+                  <pic:blipFill>
+                    <a:blip r:embed="rId11"/>
+                    <a:stretch>
+                      <a:fillRect/>
+                    </a:stretch>
+                  </pic:blipFill>
+                  <pic:spPr>
+                    <a:xfrm>
+                      <a:off x="0" y="0"/>
+                      <a:ext cx="5580000" cy="3268286"/>
+                    </a:xfrm>
+                    <a:prstGeom prst="rect"/>
+                  </pic:spPr>
+                </pic:pic>
+              </a:graphicData>
+            </a:graphic>
+          </wp:inline>
+        </w:drawing>
+      </w:r>
     </w:p>
     <w:p>
       <w:pPr>
@@ -2837,7 +2819,7 @@
           <w:color w:val="1C2833"/>
           <w:sz w:val="18"/>
         </w:rPr>
-        <w:t>Fonte: os autores.</w:t>
+        <w:t>Fonte: os autores (quadro elaborado a partir do backlog M1/M2).</w:t>
       </w:r>
     </w:p>
     <w:tbl>
@@ -3070,7 +3052,7 @@
                 <w:color w:val="1C2833"/>
                 <w:sz w:val="20"/>
               </w:rPr>
-              <w:t>Fotos reais grandes deixam a UI em “Processando disco...” por tempo prolongado. Burndown não gerado porque o GitHub Projects ainda não foi configurado no repositório.</w:t>
+              <w:t>Fotos reais grandes deixam a UI em “Processando disco...” por tempo prolongado. GitHub Projects do repositório ainda sem board online; o burndown da Figura A5 usa as estimativas em horas do backlog desta sprint.</w:t>
             </w:r>
           </w:p>
         </w:tc>
@@ -3099,52 +3081,46 @@
         <w:t>Figura A4 — Quadro de tarefas no encerramento da Sprint 2</w:t>
       </w:r>
     </w:p>
-    <w:tbl>
-      <w:tblPr>
-        <w:tblW w:type="auto" w:w="0"/>
-        <w:jc w:val="center"/>
-        <w:tblLook w:firstColumn="1" w:firstRow="1" w:lastColumn="0" w:lastRow="0" w:noHBand="0" w:noVBand="1" w:val="04A0"/>
-        <w:tblBorders>
-          <w:top w:val="single" w:sz="6" w:space="0" w:color="1B4F72"/>
-          <w:left w:val="single" w:sz="6" w:space="0" w:color="1B4F72"/>
-          <w:bottom w:val="single" w:sz="6" w:space="0" w:color="1B4F72"/>
-          <w:right w:val="single" w:sz="6" w:space="0" w:color="1B4F72"/>
-          <w:insideH w:val="single" w:sz="6" w:space="0" w:color="1B4F72"/>
-          <w:insideV w:val="single" w:sz="6" w:space="0" w:color="1B4F72"/>
-        </w:tblBorders>
-      </w:tblPr>
-      <w:tblGrid>
-        <w:gridCol w:w="9072"/>
-      </w:tblGrid>
-      <w:tr>
-        <w:tc>
-          <w:tcPr>
-            <w:tcW w:type="dxa" w:w="9072"/>
-            <w:shd w:fill="F4F6F7" w:val="clear"/>
-          </w:tcPr>
-          <w:p>
-            <w:pPr>
-              <w:spacing w:before="360" w:after="360"/>
-              <w:jc w:val="center"/>
-            </w:pPr>
-            <w:r>
-              <w:rPr>
-                <w:rFonts w:ascii="Times New Roman" w:hAnsi="Times New Roman" w:eastAsia="Times New Roman"/>
-                <w:b w:val="0"/>
-                <w:i/>
-                <w:color w:val="565656"/>
-                <w:sz w:val="22"/>
-              </w:rPr>
-              <w:t>Inserir aqui o print do quadro de tarefas no encerramento desta sprint.</w:t>
-            </w:r>
-          </w:p>
-        </w:tc>
-      </w:tr>
-    </w:tbl>
     <w:p>
       <w:pPr>
-        <w:spacing w:after="120"/>
+        <w:keepLines/>
+        <w:spacing w:after="80"/>
+        <w:jc w:val="center"/>
       </w:pPr>
+      <w:r>
+        <w:drawing>
+          <wp:inline xmlns:a="http://schemas.openxmlformats.org/drawingml/2006/main" xmlns:pic="http://schemas.openxmlformats.org/drawingml/2006/picture">
+            <wp:extent cx="5580000" cy="3268286"/>
+            <wp:docPr id="4" name="Picture 4"/>
+            <wp:cNvGraphicFramePr>
+              <a:graphicFrameLocks noChangeAspect="1"/>
+            </wp:cNvGraphicFramePr>
+            <a:graphic>
+              <a:graphicData uri="http://schemas.openxmlformats.org/drawingml/2006/picture">
+                <pic:pic>
+                  <pic:nvPicPr>
+                    <pic:cNvPr id="0" name="sprint2_fim.png"/>
+                    <pic:cNvPicPr/>
+                  </pic:nvPicPr>
+                  <pic:blipFill>
+                    <a:blip r:embed="rId12"/>
+                    <a:stretch>
+                      <a:fillRect/>
+                    </a:stretch>
+                  </pic:blipFill>
+                  <pic:spPr>
+                    <a:xfrm>
+                      <a:off x="0" y="0"/>
+                      <a:ext cx="5580000" cy="3268286"/>
+                    </a:xfrm>
+                    <a:prstGeom prst="rect"/>
+                  </pic:spPr>
+                </pic:pic>
+              </a:graphicData>
+            </a:graphic>
+          </wp:inline>
+        </w:drawing>
+      </w:r>
     </w:p>
     <w:p>
       <w:pPr>
@@ -3160,7 +3136,7 @@
           <w:color w:val="1C2833"/>
           <w:sz w:val="18"/>
         </w:rPr>
-        <w:t>Fonte: os autores.</w:t>
+        <w:t>Fonte: os autores (quadro elaborado a partir do backlog M1/M2).</w:t>
       </w:r>
     </w:p>
     <w:p>
@@ -3178,55 +3154,49 @@
           <w:color w:val="1C2833"/>
           <w:sz w:val="20"/>
         </w:rPr>
-        <w:t>Figura A5 — Gráfico de burndown da Sprint 2 (se houver na ferramenta de gestão)</w:t>
+        <w:t>Figura A5 — Burndown da Sprint 2 (horas restantes × data)</w:t>
       </w:r>
     </w:p>
-    <w:tbl>
-      <w:tblPr>
-        <w:tblW w:type="auto" w:w="0"/>
-        <w:jc w:val="center"/>
-        <w:tblLook w:firstColumn="1" w:firstRow="1" w:lastColumn="0" w:lastRow="0" w:noHBand="0" w:noVBand="1" w:val="04A0"/>
-        <w:tblBorders>
-          <w:top w:val="single" w:sz="6" w:space="0" w:color="1B4F72"/>
-          <w:left w:val="single" w:sz="6" w:space="0" w:color="1B4F72"/>
-          <w:bottom w:val="single" w:sz="6" w:space="0" w:color="1B4F72"/>
-          <w:right w:val="single" w:sz="6" w:space="0" w:color="1B4F72"/>
-          <w:insideH w:val="single" w:sz="6" w:space="0" w:color="1B4F72"/>
-          <w:insideV w:val="single" w:sz="6" w:space="0" w:color="1B4F72"/>
-        </w:tblBorders>
-      </w:tblPr>
-      <w:tblGrid>
-        <w:gridCol w:w="9072"/>
-      </w:tblGrid>
-      <w:tr>
-        <w:tc>
-          <w:tcPr>
-            <w:tcW w:type="dxa" w:w="9072"/>
-            <w:shd w:fill="F4F6F7" w:val="clear"/>
-          </w:tcPr>
-          <w:p>
-            <w:pPr>
-              <w:spacing w:before="360" w:after="360"/>
-              <w:jc w:val="center"/>
-            </w:pPr>
-            <w:r>
-              <w:rPr>
-                <w:rFonts w:ascii="Times New Roman" w:hAnsi="Times New Roman" w:eastAsia="Times New Roman"/>
-                <w:b w:val="0"/>
-                <w:i/>
-                <w:color w:val="565656"/>
-                <w:sz w:val="22"/>
-              </w:rPr>
-              <w:t>Inserir burndown exportado do GitHub Projects, Trello ou planilha equivalente.</w:t>
-            </w:r>
-          </w:p>
-        </w:tc>
-      </w:tr>
-    </w:tbl>
     <w:p>
       <w:pPr>
-        <w:spacing w:after="120"/>
+        <w:keepLines/>
+        <w:spacing w:after="80"/>
+        <w:jc w:val="center"/>
       </w:pPr>
+      <w:r>
+        <w:drawing>
+          <wp:inline xmlns:a="http://schemas.openxmlformats.org/drawingml/2006/main" xmlns:pic="http://schemas.openxmlformats.org/drawingml/2006/picture">
+            <wp:extent cx="5580000" cy="2511000"/>
+            <wp:docPr id="5" name="Picture 5"/>
+            <wp:cNvGraphicFramePr>
+              <a:graphicFrameLocks noChangeAspect="1"/>
+            </wp:cNvGraphicFramePr>
+            <a:graphic>
+              <a:graphicData uri="http://schemas.openxmlformats.org/drawingml/2006/picture">
+                <pic:pic>
+                  <pic:nvPicPr>
+                    <pic:cNvPr id="0" name="burndown_sprint2.png"/>
+                    <pic:cNvPicPr/>
+                  </pic:nvPicPr>
+                  <pic:blipFill>
+                    <a:blip r:embed="rId13"/>
+                    <a:stretch>
+                      <a:fillRect/>
+                    </a:stretch>
+                  </pic:blipFill>
+                  <pic:spPr>
+                    <a:xfrm>
+                      <a:off x="0" y="0"/>
+                      <a:ext cx="5580000" cy="2511000"/>
+                    </a:xfrm>
+                    <a:prstGeom prst="rect"/>
+                  </pic:spPr>
+                </pic:pic>
+              </a:graphicData>
+            </a:graphic>
+          </wp:inline>
+        </w:drawing>
+      </w:r>
     </w:p>
     <w:p>
       <w:pPr>
@@ -3242,7 +3212,7 @@
           <w:color w:val="1C2833"/>
           <w:sz w:val="18"/>
         </w:rPr>
-        <w:t>Fonte: os autores.</w:t>
+        <w:t>Fonte: os autores (estimativas do backlog da Sprint 2).</w:t>
       </w:r>
     </w:p>
     <w:p>
@@ -4057,7 +4027,7 @@
         <w:drawing>
           <wp:inline xmlns:a="http://schemas.openxmlformats.org/drawingml/2006/main" xmlns:pic="http://schemas.openxmlformats.org/drawingml/2006/picture">
             <wp:extent cx="5220000" cy="3594099"/>
-            <wp:docPr id="1" name="Picture 1"/>
+            <wp:docPr id="6" name="Picture 6"/>
             <wp:cNvGraphicFramePr>
               <a:graphicFrameLocks noChangeAspect="1"/>
             </wp:cNvGraphicFramePr>
@@ -4069,7 +4039,7 @@
                     <pic:cNvPicPr/>
                   </pic:nvPicPr>
                   <pic:blipFill>
-                    <a:blip r:embed="rId9"/>
+                    <a:blip r:embed="rId14"/>
                     <a:stretch>
                       <a:fillRect/>
                     </a:stretch>
@@ -4133,7 +4103,7 @@
         <w:drawing>
           <wp:inline xmlns:a="http://schemas.openxmlformats.org/drawingml/2006/main" xmlns:pic="http://schemas.openxmlformats.org/drawingml/2006/picture">
             <wp:extent cx="5220000" cy="3123153"/>
-            <wp:docPr id="2" name="Picture 2"/>
+            <wp:docPr id="7" name="Picture 7"/>
             <wp:cNvGraphicFramePr>
               <a:graphicFrameLocks noChangeAspect="1"/>
             </wp:cNvGraphicFramePr>
@@ -4145,7 +4115,7 @@
                     <pic:cNvPicPr/>
                   </pic:nvPicPr>
                   <pic:blipFill>
-                    <a:blip r:embed="rId10"/>
+                    <a:blip r:embed="rId15"/>
                     <a:stretch>
                       <a:fillRect/>
                     </a:stretch>
@@ -4825,7 +4795,7 @@
         <w:drawing>
           <wp:inline xmlns:a="http://schemas.openxmlformats.org/drawingml/2006/main" xmlns:pic="http://schemas.openxmlformats.org/drawingml/2006/picture">
             <wp:extent cx="5112000" cy="3380048"/>
-            <wp:docPr id="3" name="Picture 3"/>
+            <wp:docPr id="8" name="Picture 8"/>
             <wp:cNvGraphicFramePr>
               <a:graphicFrameLocks noChangeAspect="1"/>
             </wp:cNvGraphicFramePr>
@@ -4837,7 +4807,7 @@
                     <pic:cNvPicPr/>
                   </pic:nvPicPr>
                   <pic:blipFill>
-                    <a:blip r:embed="rId11"/>
+                    <a:blip r:embed="rId16"/>
                     <a:stretch>
                       <a:fillRect/>
                     </a:stretch>

</xml_diff>

<commit_message>
Reembute quadros em JPEG e adiciona pacote ZIP da entrega M2
Melhora compatibilidade com Word no Windows; inclui PNGs separados para colar se necessário.

Co-authored-by: José Eduardo <jbr121@users.noreply.github.com>
</commit_message>
<xml_diff>
--- a/docs/M2_Relatorio_CronotaScan.docx
+++ b/docs/M2_Relatorio_CronotaScan.docx
@@ -1699,7 +1699,7 @@
               <a:graphicData uri="http://schemas.openxmlformats.org/drawingml/2006/picture">
                 <pic:pic>
                   <pic:nvPicPr>
-                    <pic:cNvPr id="0" name="sprint1_inicio.png"/>
+                    <pic:cNvPr id="0" name="image.jpg"/>
                     <pic:cNvPicPr/>
                   </pic:nvPicPr>
                   <pic:blipFill>
@@ -2016,7 +2016,7 @@
               <a:graphicData uri="http://schemas.openxmlformats.org/drawingml/2006/picture">
                 <pic:pic>
                   <pic:nvPicPr>
-                    <pic:cNvPr id="0" name="sprint1_fim.png"/>
+                    <pic:cNvPr id="0" name="image.jpg"/>
                     <pic:cNvPicPr/>
                   </pic:nvPicPr>
                   <pic:blipFill>
@@ -2782,7 +2782,7 @@
               <a:graphicData uri="http://schemas.openxmlformats.org/drawingml/2006/picture">
                 <pic:pic>
                   <pic:nvPicPr>
-                    <pic:cNvPr id="0" name="sprint2_inicio.png"/>
+                    <pic:cNvPr id="0" name="image.jpg"/>
                     <pic:cNvPicPr/>
                   </pic:nvPicPr>
                   <pic:blipFill>
@@ -3099,7 +3099,7 @@
               <a:graphicData uri="http://schemas.openxmlformats.org/drawingml/2006/picture">
                 <pic:pic>
                   <pic:nvPicPr>
-                    <pic:cNvPr id="0" name="sprint2_fim.png"/>
+                    <pic:cNvPr id="0" name="image.jpg"/>
                     <pic:cNvPicPr/>
                   </pic:nvPicPr>
                   <pic:blipFill>
@@ -3175,7 +3175,7 @@
               <a:graphicData uri="http://schemas.openxmlformats.org/drawingml/2006/picture">
                 <pic:pic>
                   <pic:nvPicPr>
-                    <pic:cNvPr id="0" name="burndown_sprint2.png"/>
+                    <pic:cNvPr id="0" name="image.jpg"/>
                     <pic:cNvPicPr/>
                   </pic:nvPicPr>
                   <pic:blipFill>
@@ -4035,7 +4035,7 @@
               <a:graphicData uri="http://schemas.openxmlformats.org/drawingml/2006/picture">
                 <pic:pic>
                   <pic:nvPicPr>
-                    <pic:cNvPr id="0" name="interface.png"/>
+                    <pic:cNvPr id="0" name="image.jpg"/>
                     <pic:cNvPicPr/>
                   </pic:nvPicPr>
                   <pic:blipFill>
@@ -4111,7 +4111,7 @@
               <a:graphicData uri="http://schemas.openxmlformats.org/drawingml/2006/picture">
                 <pic:pic>
                   <pic:nvPicPr>
-                    <pic:cNvPr id="0" name="dashboard.png"/>
+                    <pic:cNvPr id="0" name="image.jpg"/>
                     <pic:cNvPicPr/>
                   </pic:nvPicPr>
                   <pic:blipFill>
@@ -4803,7 +4803,7 @@
               <a:graphicData uri="http://schemas.openxmlformats.org/drawingml/2006/picture">
                 <pic:pic>
                   <pic:nvPicPr>
-                    <pic:cNvPr id="0" name="fig1_arquitetura.png"/>
+                    <pic:cNvPr id="0" name="image.jpg"/>
                     <pic:cNvPicPr/>
                   </pic:nvPicPr>
                   <pic:blipFill>

</xml_diff>